<commit_message>
v7: GUI calibration is Stage C only; A/B are CLI-only
Lock in that the GUI exposes only the camera-to-world ArUco-ring
recalibration (Stage C, the operation that matters between demo
runs). Stages A/B (custom chessboard intrinsics + stereo
extrinsics) are CLI-only — they override factory tuning and an
operator misclick could replace a working factory cal with a
half-baked custom one.

The stewart_vision calibration node therefore implements only the
three Stage C service handlers (capture_frame / solve / reset). No
stage selector service exists, so Stages A/B literally cannot be
triggered from the browser even with the right service name.

Also corrected the §11.0 description: web/index.html is already
three-column (lg:grid-cols-3); the vision work adds panels into
the existing structure rather than restructuring.

Co-Authored-By: Claude Opus 4.7 (1M context) <noreply@anthropic.com>
</commit_message>
<xml_diff>
--- a/stewart_bringup/docs/closed_loop_ball_demos.docx
+++ b/stewart_bringup/docs/closed_loop_ball_demos.docx
@@ -2,7 +2,7 @@
 <file path=word/document.xml><?xml version="1.0" encoding="utf-8"?>
 <w:document xmlns:w="http://schemas.openxmlformats.org/wordprocessingml/2006/main" xmlns:m="http://schemas.openxmlformats.org/officeDocument/2006/math" xmlns:r="http://schemas.openxmlformats.org/officeDocument/2006/relationships" xmlns:o="urn:schemas-microsoft-com:office:office" xmlns:v="urn:schemas-microsoft-com:vml" xmlns:w10="urn:schemas-microsoft-com:office:word" xmlns:a="http://schemas.openxmlformats.org/drawingml/2006/main" xmlns:pic="http://schemas.openxmlformats.org/drawingml/2006/picture" xmlns:wp="http://schemas.openxmlformats.org/drawingml/2006/wordprocessingDrawing">
   <w:body>
-    <w:bookmarkStart w:id="78" w:name="Xf2ecee67e627b13c32e3c15bfc4ce569ecb8d6b"/>
+    <w:bookmarkStart w:id="79" w:name="Xf2ecee67e627b13c32e3c15bfc4ce569ecb8d6b"/>
     <w:p>
       <w:pPr>
         <w:pStyle w:val="Heading1"/>
@@ -86,25 +86,34 @@
         <w:t xml:space="preserve"> </w:t>
       </w:r>
       <w:r>
-        <w:t xml:space="preserve">2026-04-26 (v6 — factory-calibration shortcut for</w:t>
-      </w:r>
-      <w:r>
-        <w:t xml:space="preserve"> </w:t>
-      </w:r>
-      <w:r>
-        <w:t xml:space="preserve">Stages A/B; expanded list of shadowed-on-OAK comparisons; CSV + PNG</w:t>
-      </w:r>
-      <w:r>
-        <w:t xml:space="preserve"> </w:t>
-      </w:r>
-      <w:r>
-        <w:t xml:space="preserve">exports from the plotter; KPI color thresholds locked at</w:t>
-      </w:r>
-      <w:r>
-        <w:t xml:space="preserve"> </w:t>
-      </w:r>
-      <w:r>
-        <w:t xml:space="preserve">green &lt; 5 mm / yellow &lt; 15 mm / red ≥ 15 mm).</w:t>
+        <w:t xml:space="preserve">2026-04-26 (v7 — GUI calibration button is Stage C</w:t>
+      </w:r>
+      <w:r>
+        <w:t xml:space="preserve"> </w:t>
+      </w:r>
+      <w:r>
+        <w:t xml:space="preserve">only; Stages A/B are CLI-only to prevent operators accidentally</w:t>
+      </w:r>
+      <w:r>
+        <w:t xml:space="preserve"> </w:t>
+      </w:r>
+      <w:r>
+        <w:t xml:space="preserve">overriding factory tuning; clarified that the existing</w:t>
+      </w:r>
+      <w:r>
+        <w:t xml:space="preserve"> </w:t>
+      </w:r>
+      <w:r>
+        <w:rPr>
+          <w:rStyle w:val="VerbatimChar"/>
+        </w:rPr>
+        <w:t xml:space="preserve">web/index.html</w:t>
+      </w:r>
+      <w:r>
+        <w:t xml:space="preserve"> </w:t>
+      </w:r>
+      <w:r>
+        <w:t xml:space="preserve">is already three-column).</w:t>
       </w:r>
     </w:p>
     <w:p>
@@ -2208,299 +2217,13 @@
         <w:t xml:space="preserve"> </w:t>
       </w:r>
       <w:r>
-        <w:t xml:space="preserve">(where the OAK is plugged in), but</w:t>
-      </w:r>
-      <w:r>
-        <w:t xml:space="preserve"> </w:t>
-      </w:r>
-      <w:r>
-        <w:t xml:space="preserve">the user-facing capture flow is via a button in the laptop’s GUI —</w:t>
-      </w:r>
-      <w:r>
-        <w:t xml:space="preserve"> </w:t>
-      </w:r>
-      <w:r>
-        <w:t xml:space="preserve">the Pi is headless.</w:t>
-      </w:r>
-      <w:r>
-        <w:t xml:space="preserve"> </w:t>
-      </w:r>
-      <w:r>
-        <w:rPr>
-          <w:rStyle w:val="VerbatimChar"/>
-        </w:rPr>
-        <w:t xml:space="preserve">scripts/calibrate_oak.py</w:t>
-      </w:r>
-      <w:r>
-        <w:t xml:space="preserve"> </w:t>
-      </w:r>
-      <w:r>
-        <w:t xml:space="preserve">exposes a small ROS 2</w:t>
-      </w:r>
-      <w:r>
-        <w:t xml:space="preserve"> </w:t>
-      </w:r>
-      <w:r>
-        <w:t xml:space="preserve">service interface that the GUI calls:</w:t>
-      </w:r>
-    </w:p>
-    <w:p>
-      <w:pPr>
-        <w:numPr>
-          <w:ilvl w:val="0"/>
-          <w:numId w:val="1005"/>
-        </w:numPr>
-        <w:pStyle w:val="Compact"/>
-      </w:pPr>
-      <w:r>
-        <w:rPr>
-          <w:rStyle w:val="VerbatimChar"/>
-        </w:rPr>
-        <w:t xml:space="preserve">/calibrate/capture_frame</w:t>
-      </w:r>
-      <w:r>
-        <w:t xml:space="preserve"> </w:t>
-      </w:r>
-      <w:r>
-        <w:t xml:space="preserve">(Trigger) — grab one synced</w:t>
-      </w:r>
-      <w:r>
-        <w:t xml:space="preserve"> </w:t>
-      </w:r>
-      <w:r>
-        <w:t xml:space="preserve">chessboard pair (Stage A) or the leveled-platform ArUco frame</w:t>
-      </w:r>
-      <w:r>
-        <w:t xml:space="preserve"> </w:t>
-      </w:r>
-      <w:r>
-        <w:t xml:space="preserve">(Stage C). The script auto-detects the chessboard / board and</w:t>
-      </w:r>
-      <w:r>
-        <w:t xml:space="preserve"> </w:t>
-      </w:r>
-      <w:r>
-        <w:t xml:space="preserve">accepts or rejects the frame, returning a status to the GUI</w:t>
-      </w:r>
-      <w:r>
-        <w:t xml:space="preserve"> </w:t>
-      </w:r>
-      <w:r>
-        <w:t xml:space="preserve">(success:</w:t>
-      </w:r>
-      <w:r>
-        <w:t xml:space="preserve"> </w:t>
-      </w:r>
-      <w:r>
-        <w:t xml:space="preserve">“</w:t>
-      </w:r>
-      <w:r>
-        <w:t xml:space="preserve">frame N/30 captured</w:t>
-      </w:r>
-      <w:r>
-        <w:t xml:space="preserve">”</w:t>
-      </w:r>
-      <w:r>
-        <w:t xml:space="preserve">, failure:</w:t>
-      </w:r>
-      <w:r>
-        <w:t xml:space="preserve"> </w:t>
-      </w:r>
-      <w:r>
-        <w:t xml:space="preserve">“</w:t>
-      </w:r>
-      <w:r>
-        <w:t xml:space="preserve">chessboard not detected</w:t>
-      </w:r>
-      <w:r>
-        <w:t xml:space="preserve">”</w:t>
-      </w:r>
-      <w:r>
-        <w:t xml:space="preserve">).</w:t>
-      </w:r>
-    </w:p>
-    <w:p>
-      <w:pPr>
-        <w:numPr>
-          <w:ilvl w:val="0"/>
-          <w:numId w:val="1005"/>
-        </w:numPr>
-        <w:pStyle w:val="Compact"/>
-      </w:pPr>
-      <w:r>
-        <w:rPr>
-          <w:rStyle w:val="VerbatimChar"/>
-        </w:rPr>
-        <w:t xml:space="preserve">/calibrate/solve</w:t>
-      </w:r>
-      <w:r>
-        <w:t xml:space="preserve"> </w:t>
-      </w:r>
-      <w:r>
-        <w:t xml:space="preserve">(Trigger) — runs</w:t>
-      </w:r>
-      <w:r>
-        <w:t xml:space="preserve"> </w:t>
-      </w:r>
-      <w:r>
-        <w:rPr>
-          <w:rStyle w:val="VerbatimChar"/>
-        </w:rPr>
-        <w:t xml:space="preserve">cv2.calibrateCamera</w:t>
-      </w:r>
-      <w:r>
-        <w:t xml:space="preserve"> </w:t>
-      </w:r>
-      <w:r>
-        <w:t xml:space="preserve">/</w:t>
-      </w:r>
-      <w:r>
-        <w:t xml:space="preserve"> </w:t>
-      </w:r>
-      <w:r>
-        <w:rPr>
-          <w:rStyle w:val="VerbatimChar"/>
-        </w:rPr>
-        <w:t xml:space="preserve">cv2.stereoCalibrate</w:t>
-      </w:r>
-      <w:r>
-        <w:t xml:space="preserve"> </w:t>
-      </w:r>
-      <w:r>
-        <w:t xml:space="preserve">/</w:t>
-      </w:r>
-      <w:r>
-        <w:t xml:space="preserve"> </w:t>
-      </w:r>
-      <w:r>
-        <w:rPr>
-          <w:rStyle w:val="VerbatimChar"/>
-        </w:rPr>
-        <w:t xml:space="preserve">cv2.stereoRectify</w:t>
-      </w:r>
-      <w:r>
-        <w:t xml:space="preserve"> </w:t>
-      </w:r>
-      <w:r>
-        <w:t xml:space="preserve">on the captured set</w:t>
-      </w:r>
-      <w:r>
-        <w:t xml:space="preserve"> </w:t>
-      </w:r>
-      <w:r>
-        <w:t xml:space="preserve">and writes the YAML if the acceptance gates pass.</w:t>
-      </w:r>
-    </w:p>
-    <w:p>
-      <w:pPr>
-        <w:numPr>
-          <w:ilvl w:val="0"/>
-          <w:numId w:val="1005"/>
-        </w:numPr>
-        <w:pStyle w:val="Compact"/>
-      </w:pPr>
-      <w:r>
-        <w:rPr>
-          <w:rStyle w:val="VerbatimChar"/>
-        </w:rPr>
-        <w:t xml:space="preserve">/calibrate/reset</w:t>
-      </w:r>
-      <w:r>
-        <w:t xml:space="preserve"> </w:t>
-      </w:r>
-      <w:r>
-        <w:t xml:space="preserve">(Trigger) — clears captured-frame buffer.</w:t>
-      </w:r>
-    </w:p>
-    <w:p>
-      <w:pPr>
-        <w:pStyle w:val="FirstParagraph"/>
-      </w:pPr>
-      <w:r>
-        <w:t xml:space="preserve">The GUI’s Vision Debug panel shows the live OAK feed with detected</w:t>
-      </w:r>
-      <w:r>
-        <w:t xml:space="preserve"> </w:t>
-      </w:r>
-      <w:r>
-        <w:t xml:space="preserve">chessboard corners drawn in real time, plus a counter</w:t>
-      </w:r>
-      <w:r>
-        <w:t xml:space="preserve"> </w:t>
-      </w:r>
-      <w:r>
-        <w:t xml:space="preserve">“</w:t>
-      </w:r>
-      <w:r>
-        <w:t xml:space="preserve">N/30 frames</w:t>
-      </w:r>
-      <w:r>
-        <w:t xml:space="preserve">”</w:t>
-      </w:r>
-      <w:r>
-        <w:t xml:space="preserve"> </w:t>
-      </w:r>
-      <w:r>
-        <w:t xml:space="preserve">and the three buttons above. The chessboard geometry comes from</w:t>
-      </w:r>
-      <w:r>
-        <w:t xml:space="preserve"> </w:t>
-      </w:r>
-      <w:r>
-        <w:rPr>
-          <w:rStyle w:val="VerbatimChar"/>
-        </w:rPr>
-        <w:t xml:space="preserve">chessboard.yaml</w:t>
-      </w:r>
-      <w:r>
-        <w:t xml:space="preserve"> </w:t>
-      </w:r>
-      <w:r>
-        <w:t xml:space="preserve">produced by</w:t>
-      </w:r>
-      <w:r>
-        <w:t xml:space="preserve"> </w:t>
-      </w:r>
-      <w:r>
-        <w:rPr>
-          <w:rStyle w:val="VerbatimChar"/>
-        </w:rPr>
-        <w:t xml:space="preserve">generate_chessboard.py</w:t>
-      </w:r>
-      <w:r>
-        <w:t xml:space="preserve"> </w:t>
-      </w:r>
-      <w:r>
-        <w:t xml:space="preserve">so changing</w:t>
-      </w:r>
-      <w:r>
-        <w:t xml:space="preserve"> </w:t>
-      </w:r>
-      <w:r>
-        <w:t xml:space="preserve">the printed board doesn’t require code edits.</w:t>
-      </w:r>
-    </w:p>
-    <w:p>
-      <w:pPr>
-        <w:pStyle w:val="BodyText"/>
-      </w:pPr>
-      <w:r>
-        <w:rPr>
-          <w:rStyle w:val="VerbatimChar"/>
-        </w:rPr>
-        <w:t xml:space="preserve">scripts/calibrate_oak.py</w:t>
-      </w:r>
-      <w:r>
-        <w:t xml:space="preserve"> </w:t>
-      </w:r>
-      <w:r>
-        <w:t xml:space="preserve">runs in three independent stages so that</w:t>
-      </w:r>
-      <w:r>
-        <w:t xml:space="preserve"> </w:t>
-      </w:r>
-      <w:r>
-        <w:t xml:space="preserve">moving the camera only invalidates the cheap stage.</w:t>
+        <w:t xml:space="preserve">(where the OAK is plugged in). The</w:t>
+      </w:r>
+      <w:r>
+        <w:t xml:space="preserve"> </w:t>
+      </w:r>
+      <w:r>
+        <w:t xml:space="preserve">user-facing flow is</w:t>
       </w:r>
       <w:r>
         <w:t xml:space="preserve"> </w:t>
@@ -2510,126 +2233,647 @@
           <w:bCs/>
           <w:b/>
         </w:rPr>
-        <w:t xml:space="preserve">Stages A and B</w:t>
-      </w:r>
+        <w:t xml:space="preserve">split by audience</w:t>
+      </w:r>
+      <w:r>
+        <w:t xml:space="preserve"> </w:t>
+      </w:r>
+      <w:r>
+        <w:t xml:space="preserve">(locked v7, 2026-04-26):</w:t>
+      </w:r>
+    </w:p>
+    <w:p>
+      <w:pPr>
+        <w:numPr>
+          <w:ilvl w:val="0"/>
+          <w:numId w:val="1005"/>
+        </w:numPr>
+      </w:pPr>
       <w:r>
         <w:rPr>
           <w:bCs/>
           <w:b/>
         </w:rPr>
-        <w:t xml:space="preserve"> </w:t>
-      </w:r>
+        <w:t xml:space="preserve">GUI button — Stage C only.</w:t>
+      </w:r>
+      <w:r>
+        <w:t xml:space="preserve"> </w:t>
+      </w:r>
+      <w:r>
+        <w:t xml:space="preserve">The laptop’s GUI exposes capture /</w:t>
+      </w:r>
+      <w:r>
+        <w:t xml:space="preserve"> </w:t>
+      </w:r>
+      <w:r>
+        <w:t xml:space="preserve">solve / reset for the camera-to-world ArUco-ring step only. This</w:t>
+      </w:r>
+      <w:r>
+        <w:t xml:space="preserve"> </w:t>
+      </w:r>
+      <w:r>
+        <w:t xml:space="preserve">is the operation that matters between demo runs (every camera arm</w:t>
+      </w:r>
+      <w:r>
+        <w:t xml:space="preserve"> </w:t>
+      </w:r>
+      <w:r>
+        <w:t xml:space="preserve">move re-runs it) and is the only one a non-developer operator</w:t>
+      </w:r>
+      <w:r>
+        <w:t xml:space="preserve"> </w:t>
+      </w:r>
+      <w:r>
+        <w:t xml:space="preserve">ever needs.</w:t>
+      </w:r>
+    </w:p>
+    <w:p>
+      <w:pPr>
+        <w:numPr>
+          <w:ilvl w:val="0"/>
+          <w:numId w:val="1005"/>
+        </w:numPr>
+      </w:pPr>
       <w:r>
         <w:rPr>
           <w:bCs/>
           <w:b/>
         </w:rPr>
-        <w:t xml:space="preserve">are optional now (v6 default):</w:t>
-      </w:r>
-      <w:r>
-        <w:t xml:space="preserve"> </w:t>
-      </w:r>
-      <w:r>
-        <w:t xml:space="preserve">the OAK ships with factory-calibrated</w:t>
-      </w:r>
-      <w:r>
-        <w:t xml:space="preserve"> </w:t>
-      </w:r>
-      <w:r>
-        <w:t xml:space="preserve">intrinsics and stereo extrinsics stored on its EEPROM, accessible via</w:t>
-      </w:r>
-      <w:r>
-        <w:t xml:space="preserve"> </w:t>
-      </w:r>
-      <w:r>
-        <w:rPr>
-          <w:rStyle w:val="VerbatimChar"/>
-        </w:rPr>
-        <w:t xml:space="preserve">Device.readCalibration()</w:t>
-      </w:r>
-      <w:r>
-        <w:t xml:space="preserve">. The default flow uses those directly:</w:t>
-      </w:r>
-    </w:p>
-    <w:p>
-      <w:pPr>
-        <w:pStyle w:val="SourceCode"/>
-      </w:pPr>
-      <w:r>
-        <w:rPr>
-          <w:rStyle w:val="CommentTok"/>
-        </w:rPr>
-        <w:t xml:space="preserve"># Default — write factory cal into oak_intrinsics.yaml in seconds</w:t>
-      </w:r>
-      <w:r>
-        <w:br/>
-      </w:r>
-      <w:r>
-        <w:rPr>
-          <w:rStyle w:val="ExtensionTok"/>
-        </w:rPr>
-        <w:t xml:space="preserve">python3</w:t>
-      </w:r>
-      <w:r>
-        <w:rPr>
-          <w:rStyle w:val="NormalTok"/>
-        </w:rPr>
-        <w:t xml:space="preserve"> scripts/calibrate_oak.py </w:t>
-      </w:r>
-      <w:r>
-        <w:rPr>
-          <w:rStyle w:val="AttributeTok"/>
-        </w:rPr>
-        <w:t xml:space="preserve">--stage</w:t>
-      </w:r>
-      <w:r>
-        <w:rPr>
-          <w:rStyle w:val="NormalTok"/>
-        </w:rPr>
-        <w:t xml:space="preserve"> factory</w:t>
-      </w:r>
-    </w:p>
-    <w:p>
-      <w:pPr>
-        <w:pStyle w:val="FirstParagraph"/>
-      </w:pPr>
-      <w:r>
-        <w:t xml:space="preserve">Re-doing Stages A/B manually only buys you a slightly tighter</w:t>
-      </w:r>
-      <w:r>
-        <w:t xml:space="preserve"> </w:t>
-      </w:r>
-      <w:r>
-        <w:t xml:space="preserve">comparison-vs-truth baseline (your own chessboard captures may</w:t>
-      </w:r>
-      <w:r>
-        <w:t xml:space="preserve"> </w:t>
-      </w:r>
-      <w:r>
-        <w:t xml:space="preserve">out-perform the factory &lt;0.3 px reprojection target by a small</w:t>
-      </w:r>
-      <w:r>
-        <w:t xml:space="preserve"> </w:t>
-      </w:r>
-      <w:r>
-        <w:t xml:space="preserve">margin). For the demo, use factory; document this in the report.</w:t>
-      </w:r>
-    </w:p>
-    <w:p>
-      <w:pPr>
-        <w:pStyle w:val="BodyText"/>
-      </w:pPr>
-      <w:r>
-        <w:t xml:space="preserve">Stage C (camera-to-world via the ArUco ring) is</w:t>
-      </w:r>
-      <w:r>
-        <w:t xml:space="preserve"> </w:t>
+        <w:t xml:space="preserve">CLI only —</w:t>
       </w:r>
       <w:r>
         <w:rPr>
           <w:bCs/>
           <w:b/>
         </w:rPr>
+        <w:t xml:space="preserve"> </w:t>
+      </w:r>
+      <w:r>
+        <w:rPr>
+          <w:rStyle w:val="VerbatimChar"/>
+          <w:bCs/>
+          <w:b/>
+        </w:rPr>
+        <w:t xml:space="preserve">--stage factory</w:t>
+      </w:r>
+      <w:r>
+        <w:rPr>
+          <w:bCs/>
+          <w:b/>
+        </w:rPr>
+        <w:t xml:space="preserve">,</w:t>
+      </w:r>
+      <w:r>
+        <w:rPr>
+          <w:bCs/>
+          <w:b/>
+        </w:rPr>
+        <w:t xml:space="preserve"> </w:t>
+      </w:r>
+      <w:r>
+        <w:rPr>
+          <w:rStyle w:val="VerbatimChar"/>
+          <w:bCs/>
+          <w:b/>
+        </w:rPr>
+        <w:t xml:space="preserve">--stage A</w:t>
+      </w:r>
+      <w:r>
+        <w:rPr>
+          <w:bCs/>
+          <w:b/>
+        </w:rPr>
+        <w:t xml:space="preserve">,</w:t>
+      </w:r>
+      <w:r>
+        <w:rPr>
+          <w:bCs/>
+          <w:b/>
+        </w:rPr>
+        <w:t xml:space="preserve"> </w:t>
+      </w:r>
+      <w:r>
+        <w:rPr>
+          <w:rStyle w:val="VerbatimChar"/>
+          <w:bCs/>
+          <w:b/>
+        </w:rPr>
+        <w:t xml:space="preserve">--stage B</w:t>
+      </w:r>
+      <w:r>
+        <w:rPr>
+          <w:bCs/>
+          <w:b/>
+        </w:rPr>
+        <w:t xml:space="preserve">.</w:t>
+      </w:r>
+      <w:r>
+        <w:t xml:space="preserve"> </w:t>
+      </w:r>
+      <w:r>
+        <w:t xml:space="preserve">Reading</w:t>
+      </w:r>
+      <w:r>
+        <w:t xml:space="preserve"> </w:t>
+      </w:r>
+      <w:r>
+        <w:t xml:space="preserve">factory cal from EEPROM and any custom chessboard recalibration</w:t>
+      </w:r>
+      <w:r>
+        <w:t xml:space="preserve"> </w:t>
+      </w:r>
+      <w:r>
+        <w:t xml:space="preserve">happen only via SSH +</w:t>
+      </w:r>
+      <w:r>
+        <w:t xml:space="preserve"> </w:t>
+      </w:r>
+      <w:r>
+        <w:rPr>
+          <w:rStyle w:val="VerbatimChar"/>
+        </w:rPr>
+        <w:t xml:space="preserve">python3 calibrate_oak.py</w:t>
+      </w:r>
+      <w:r>
+        <w:t xml:space="preserve"> </w:t>
+      </w:r>
+      <w:r>
+        <w:t xml:space="preserve">on the Pi.</w:t>
+      </w:r>
+      <w:r>
+        <w:t xml:space="preserve"> </w:t>
+      </w:r>
+      <w:r>
+        <w:t xml:space="preserve">Reasoning: A and B</w:t>
+      </w:r>
+      <w:r>
+        <w:t xml:space="preserve"> </w:t>
+      </w:r>
+      <w:r>
+        <w:rPr>
+          <w:iCs/>
+          <w:i/>
+        </w:rPr>
+        <w:t xml:space="preserve">override</w:t>
+      </w:r>
+      <w:r>
+        <w:t xml:space="preserve"> </w:t>
+      </w:r>
+      <w:r>
+        <w:t xml:space="preserve">the OAK’s factory-tuned intrinsics</w:t>
+      </w:r>
+      <w:r>
+        <w:t xml:space="preserve"> </w:t>
+      </w:r>
+      <w:r>
+        <w:t xml:space="preserve">and stereo extrinsics. A misclick by an operator could replace a</w:t>
+      </w:r>
+      <w:r>
+        <w:t xml:space="preserve"> </w:t>
+      </w:r>
+      <w:r>
+        <w:t xml:space="preserve">working factory cal with a half-baked custom one and silently</w:t>
+      </w:r>
+      <w:r>
+        <w:t xml:space="preserve"> </w:t>
+      </w:r>
+      <w:r>
+        <w:t xml:space="preserve">degrade the controller. Gating these behind the CLI keeps them</w:t>
+      </w:r>
+      <w:r>
+        <w:t xml:space="preserve"> </w:t>
+      </w:r>
+      <w:r>
+        <w:t xml:space="preserve">available to advanced users without surfacing the foot-gun.</w:t>
+      </w:r>
+    </w:p>
+    <w:p>
+      <w:pPr>
+        <w:pStyle w:val="FirstParagraph"/>
+      </w:pPr>
+      <w:r>
+        <w:t xml:space="preserve">The</w:t>
+      </w:r>
+      <w:r>
+        <w:t xml:space="preserve"> </w:t>
+      </w:r>
+      <w:r>
+        <w:rPr>
+          <w:rStyle w:val="VerbatimChar"/>
+        </w:rPr>
+        <w:t xml:space="preserve">stewart_vision</w:t>
+      </w:r>
+      <w:r>
+        <w:t xml:space="preserve"> </w:t>
+      </w:r>
+      <w:r>
+        <w:t xml:space="preserve">calibration ROS node therefore implements ONLY</w:t>
+      </w:r>
+      <w:r>
+        <w:t xml:space="preserve"> </w:t>
+      </w:r>
+      <w:r>
+        <w:t xml:space="preserve">Stage C service handlers:</w:t>
+      </w:r>
+    </w:p>
+    <w:p>
+      <w:pPr>
+        <w:numPr>
+          <w:ilvl w:val="0"/>
+          <w:numId w:val="1006"/>
+        </w:numPr>
+        <w:pStyle w:val="Compact"/>
+      </w:pPr>
+      <w:r>
+        <w:rPr>
+          <w:rStyle w:val="VerbatimChar"/>
+        </w:rPr>
+        <w:t xml:space="preserve">/calibrate/capture_frame</w:t>
+      </w:r>
+      <w:r>
+        <w:t xml:space="preserve"> </w:t>
+      </w:r>
+      <w:r>
+        <w:t xml:space="preserve">(Trigger) — grab one frame of the</w:t>
+      </w:r>
+      <w:r>
+        <w:t xml:space="preserve"> </w:t>
+      </w:r>
+      <w:r>
+        <w:t xml:space="preserve">leveled platform’s ArUco ring; auto-detects the board and</w:t>
+      </w:r>
+      <w:r>
+        <w:t xml:space="preserve"> </w:t>
+      </w:r>
+      <w:r>
+        <w:t xml:space="preserve">returns success (</w:t>
+      </w:r>
+      <w:r>
+        <w:t xml:space="preserve">“</w:t>
+      </w:r>
+      <w:r>
+        <w:t xml:space="preserve">ArUco ring detected, all 8 markers visible</w:t>
+      </w:r>
+      <w:r>
+        <w:t xml:space="preserve">”</w:t>
+      </w:r>
+      <w:r>
+        <w:t xml:space="preserve">)</w:t>
+      </w:r>
+      <w:r>
+        <w:t xml:space="preserve"> </w:t>
+      </w:r>
+      <w:r>
+        <w:t xml:space="preserve">or failure (</w:t>
+      </w:r>
+      <w:r>
+        <w:t xml:space="preserve">“</w:t>
+      </w:r>
+      <w:r>
+        <w:t xml:space="preserve">only 5 markers visible — check lighting and angle</w:t>
+      </w:r>
+      <w:r>
+        <w:t xml:space="preserve">”</w:t>
+      </w:r>
+      <w:r>
+        <w:t xml:space="preserve">).</w:t>
+      </w:r>
+    </w:p>
+    <w:p>
+      <w:pPr>
+        <w:numPr>
+          <w:ilvl w:val="0"/>
+          <w:numId w:val="1006"/>
+        </w:numPr>
+        <w:pStyle w:val="Compact"/>
+      </w:pPr>
+      <w:r>
+        <w:rPr>
+          <w:rStyle w:val="VerbatimChar"/>
+        </w:rPr>
+        <w:t xml:space="preserve">/calibrate/solve</w:t>
+      </w:r>
+      <w:r>
+        <w:t xml:space="preserve"> </w:t>
+      </w:r>
+      <w:r>
+        <w:t xml:space="preserve">(Trigger) —</w:t>
+      </w:r>
+      <w:r>
+        <w:t xml:space="preserve"> </w:t>
+      </w:r>
+      <w:r>
+        <w:rPr>
+          <w:rStyle w:val="VerbatimChar"/>
+        </w:rPr>
+        <w:t xml:space="preserve">cv2.aruco.estimatePoseBoard</w:t>
+      </w:r>
+      <w:r>
+        <w:t xml:space="preserve"> </w:t>
+      </w:r>
+      <w:r>
+        <w:t xml:space="preserve">over the accepted frames; writes</w:t>
+      </w:r>
+      <w:r>
+        <w:t xml:space="preserve"> </w:t>
+      </w:r>
+      <w:r>
+        <w:rPr>
+          <w:rStyle w:val="VerbatimChar"/>
+        </w:rPr>
+        <w:t xml:space="preserve">oak_extrinsics.yaml</w:t>
+      </w:r>
+      <w:r>
+        <w:t xml:space="preserve"> </w:t>
+      </w:r>
+      <w:r>
+        <w:t xml:space="preserve">if the</w:t>
+      </w:r>
+      <w:r>
+        <w:t xml:space="preserve"> </w:t>
+      </w:r>
+      <w:r>
+        <w:t xml:space="preserve">reprojection gate passes.</w:t>
+      </w:r>
+    </w:p>
+    <w:p>
+      <w:pPr>
+        <w:numPr>
+          <w:ilvl w:val="0"/>
+          <w:numId w:val="1006"/>
+        </w:numPr>
+        <w:pStyle w:val="Compact"/>
+      </w:pPr>
+      <w:r>
+        <w:rPr>
+          <w:rStyle w:val="VerbatimChar"/>
+        </w:rPr>
+        <w:t xml:space="preserve">/calibrate/reset</w:t>
+      </w:r>
+      <w:r>
+        <w:t xml:space="preserve"> </w:t>
+      </w:r>
+      <w:r>
+        <w:t xml:space="preserve">(Trigger) — clears the captured-frame buffer.</w:t>
+      </w:r>
+    </w:p>
+    <w:p>
+      <w:pPr>
+        <w:pStyle w:val="FirstParagraph"/>
+      </w:pPr>
+      <w:r>
+        <w:t xml:space="preserve">There is</w:t>
+      </w:r>
+      <w:r>
+        <w:t xml:space="preserve"> </w:t>
+      </w:r>
+      <w:r>
+        <w:rPr>
+          <w:bCs/>
+          <w:b/>
+        </w:rPr>
+        <w:t xml:space="preserve">no</w:t>
+      </w:r>
+      <w:r>
+        <w:t xml:space="preserve"> </w:t>
+      </w:r>
+      <w:r>
+        <w:rPr>
+          <w:rStyle w:val="VerbatimChar"/>
+        </w:rPr>
+        <w:t xml:space="preserve">/calibrate/stage</w:t>
+      </w:r>
+      <w:r>
+        <w:t xml:space="preserve"> </w:t>
+      </w:r>
+      <w:r>
+        <w:t xml:space="preserve">selector exposed via ROS — Stages</w:t>
+      </w:r>
+      <w:r>
+        <w:t xml:space="preserve"> </w:t>
+      </w:r>
+      <w:r>
+        <w:t xml:space="preserve">A/B literally cannot be triggered from the GUI even if someone</w:t>
+      </w:r>
+      <w:r>
+        <w:t xml:space="preserve"> </w:t>
+      </w:r>
+      <w:r>
+        <w:t xml:space="preserve">malicious typed the right service name. They only run when the</w:t>
+      </w:r>
+      <w:r>
+        <w:t xml:space="preserve"> </w:t>
+      </w:r>
+      <w:r>
+        <w:t xml:space="preserve">calibrate_oak.py CLI is invoked on the Pi with the explicit flag.</w:t>
+      </w:r>
+    </w:p>
+    <w:p>
+      <w:pPr>
+        <w:pStyle w:val="BodyText"/>
+      </w:pPr>
+      <w:r>
+        <w:t xml:space="preserve">The GUI’s Vision Debug panel shows the live OAK feed with detected</w:t>
+      </w:r>
+      <w:r>
+        <w:t xml:space="preserve"> </w:t>
+      </w:r>
+      <w:r>
+        <w:t xml:space="preserve">ArUco markers drawn in real time, plus the three buttons above.</w:t>
+      </w:r>
+      <w:r>
+        <w:t xml:space="preserve"> </w:t>
+      </w:r>
+      <w:r>
+        <w:t xml:space="preserve">The marker geometry comes from</w:t>
+      </w:r>
+      <w:r>
+        <w:t xml:space="preserve"> </w:t>
+      </w:r>
+      <w:r>
+        <w:rPr>
+          <w:rStyle w:val="VerbatimChar"/>
+        </w:rPr>
+        <w:t xml:space="preserve">marker_layout.yaml</w:t>
+      </w:r>
+      <w:r>
+        <w:t xml:space="preserve"> </w:t>
+      </w:r>
+      <w:r>
+        <w:t xml:space="preserve">produced by</w:t>
+      </w:r>
+      <w:r>
+        <w:t xml:space="preserve"> </w:t>
+      </w:r>
+      <w:r>
+        <w:rPr>
+          <w:rStyle w:val="VerbatimChar"/>
+        </w:rPr>
+        <w:t xml:space="preserve">generate_aruco_ring.py</w:t>
+      </w:r>
+      <w:r>
+        <w:t xml:space="preserve"> </w:t>
+      </w:r>
+      <w:r>
+        <w:t xml:space="preserve">so reprinting the ring doesn’t require code</w:t>
+      </w:r>
+      <w:r>
+        <w:t xml:space="preserve"> </w:t>
+      </w:r>
+      <w:r>
+        <w:t xml:space="preserve">edits.</w:t>
+      </w:r>
+    </w:p>
+    <w:p>
+      <w:pPr>
+        <w:pStyle w:val="BodyText"/>
+      </w:pPr>
+      <w:r>
+        <w:rPr>
+          <w:rStyle w:val="VerbatimChar"/>
+        </w:rPr>
+        <w:t xml:space="preserve">scripts/calibrate_oak.py</w:t>
+      </w:r>
+      <w:r>
+        <w:t xml:space="preserve"> </w:t>
+      </w:r>
+      <w:r>
+        <w:t xml:space="preserve">runs in three independent stages so that</w:t>
+      </w:r>
+      <w:r>
+        <w:t xml:space="preserve"> </w:t>
+      </w:r>
+      <w:r>
+        <w:t xml:space="preserve">moving the camera only invalidates the cheap stage.</w:t>
+      </w:r>
+      <w:r>
+        <w:t xml:space="preserve"> </w:t>
+      </w:r>
+      <w:r>
+        <w:rPr>
+          <w:bCs/>
+          <w:b/>
+        </w:rPr>
+        <w:t xml:space="preserve">Stages A and B</w:t>
+      </w:r>
+      <w:r>
+        <w:rPr>
+          <w:bCs/>
+          <w:b/>
+        </w:rPr>
+        <w:t xml:space="preserve"> </w:t>
+      </w:r>
+      <w:r>
+        <w:rPr>
+          <w:bCs/>
+          <w:b/>
+        </w:rPr>
+        <w:t xml:space="preserve">are optional now (v6 default):</w:t>
+      </w:r>
+      <w:r>
+        <w:t xml:space="preserve"> </w:t>
+      </w:r>
+      <w:r>
+        <w:t xml:space="preserve">the OAK ships with factory-calibrated</w:t>
+      </w:r>
+      <w:r>
+        <w:t xml:space="preserve"> </w:t>
+      </w:r>
+      <w:r>
+        <w:t xml:space="preserve">intrinsics and stereo extrinsics stored on its EEPROM, accessible via</w:t>
+      </w:r>
+      <w:r>
+        <w:t xml:space="preserve"> </w:t>
+      </w:r>
+      <w:r>
+        <w:rPr>
+          <w:rStyle w:val="VerbatimChar"/>
+        </w:rPr>
+        <w:t xml:space="preserve">Device.readCalibration()</w:t>
+      </w:r>
+      <w:r>
+        <w:t xml:space="preserve">. The default flow uses those directly:</w:t>
+      </w:r>
+    </w:p>
+    <w:p>
+      <w:pPr>
+        <w:pStyle w:val="SourceCode"/>
+      </w:pPr>
+      <w:r>
+        <w:rPr>
+          <w:rStyle w:val="CommentTok"/>
+        </w:rPr>
+        <w:t xml:space="preserve"># Default — write factory cal into oak_intrinsics.yaml in seconds</w:t>
+      </w:r>
+      <w:r>
+        <w:br/>
+      </w:r>
+      <w:r>
+        <w:rPr>
+          <w:rStyle w:val="ExtensionTok"/>
+        </w:rPr>
+        <w:t xml:space="preserve">python3</w:t>
+      </w:r>
+      <w:r>
+        <w:rPr>
+          <w:rStyle w:val="NormalTok"/>
+        </w:rPr>
+        <w:t xml:space="preserve"> scripts/calibrate_oak.py </w:t>
+      </w:r>
+      <w:r>
+        <w:rPr>
+          <w:rStyle w:val="AttributeTok"/>
+        </w:rPr>
+        <w:t xml:space="preserve">--stage</w:t>
+      </w:r>
+      <w:r>
+        <w:rPr>
+          <w:rStyle w:val="NormalTok"/>
+        </w:rPr>
+        <w:t xml:space="preserve"> factory</w:t>
+      </w:r>
+    </w:p>
+    <w:p>
+      <w:pPr>
+        <w:pStyle w:val="FirstParagraph"/>
+      </w:pPr>
+      <w:r>
+        <w:t xml:space="preserve">Re-doing Stages A/B manually only buys you a slightly tighter</w:t>
+      </w:r>
+      <w:r>
+        <w:t xml:space="preserve"> </w:t>
+      </w:r>
+      <w:r>
+        <w:t xml:space="preserve">comparison-vs-truth baseline (your own chessboard captures may</w:t>
+      </w:r>
+      <w:r>
+        <w:t xml:space="preserve"> </w:t>
+      </w:r>
+      <w:r>
+        <w:t xml:space="preserve">out-perform the factory &lt;0.3 px reprojection target by a small</w:t>
+      </w:r>
+      <w:r>
+        <w:t xml:space="preserve"> </w:t>
+      </w:r>
+      <w:r>
+        <w:t xml:space="preserve">margin). For the demo, use factory; document this in the report.</w:t>
+      </w:r>
+    </w:p>
+    <w:p>
+      <w:pPr>
+        <w:pStyle w:val="BodyText"/>
+      </w:pPr>
+      <w:r>
+        <w:t xml:space="preserve">Stage C (camera-to-world via the ArUco ring) is</w:t>
+      </w:r>
+      <w:r>
+        <w:t xml:space="preserve"> </w:t>
+      </w:r>
+      <w:r>
+        <w:rPr>
+          <w:bCs/>
+          <w:b/>
+        </w:rPr>
         <w:t xml:space="preserve">always</w:t>
       </w:r>
       <w:r>
@@ -2658,7 +2902,7 @@
       <w:pPr>
         <w:numPr>
           <w:ilvl w:val="0"/>
-          <w:numId w:val="1006"/>
+          <w:numId w:val="1007"/>
         </w:numPr>
         <w:pStyle w:val="Compact"/>
       </w:pPr>
@@ -2670,7 +2914,7 @@
       <w:pPr>
         <w:numPr>
           <w:ilvl w:val="0"/>
-          <w:numId w:val="1006"/>
+          <w:numId w:val="1007"/>
         </w:numPr>
         <w:pStyle w:val="Compact"/>
       </w:pPr>
@@ -2682,7 +2926,7 @@
       <w:pPr>
         <w:numPr>
           <w:ilvl w:val="0"/>
-          <w:numId w:val="1006"/>
+          <w:numId w:val="1007"/>
         </w:numPr>
         <w:pStyle w:val="Compact"/>
       </w:pPr>
@@ -2709,7 +2953,7 @@
       <w:pPr>
         <w:numPr>
           <w:ilvl w:val="0"/>
-          <w:numId w:val="1006"/>
+          <w:numId w:val="1007"/>
         </w:numPr>
         <w:pStyle w:val="Compact"/>
       </w:pPr>
@@ -2760,7 +3004,7 @@
       <w:pPr>
         <w:numPr>
           <w:ilvl w:val="0"/>
-          <w:numId w:val="1007"/>
+          <w:numId w:val="1008"/>
         </w:numPr>
         <w:pStyle w:val="Compact"/>
       </w:pPr>
@@ -2772,7 +3016,7 @@
       <w:pPr>
         <w:numPr>
           <w:ilvl w:val="0"/>
-          <w:numId w:val="1007"/>
+          <w:numId w:val="1008"/>
         </w:numPr>
         <w:pStyle w:val="Compact"/>
       </w:pPr>
@@ -2793,7 +3037,7 @@
       <w:pPr>
         <w:numPr>
           <w:ilvl w:val="0"/>
-          <w:numId w:val="1007"/>
+          <w:numId w:val="1008"/>
         </w:numPr>
         <w:pStyle w:val="Compact"/>
       </w:pPr>
@@ -2820,7 +3064,7 @@
       <w:pPr>
         <w:numPr>
           <w:ilvl w:val="0"/>
-          <w:numId w:val="1007"/>
+          <w:numId w:val="1008"/>
         </w:numPr>
         <w:pStyle w:val="Compact"/>
       </w:pPr>
@@ -2832,7 +3076,7 @@
       <w:pPr>
         <w:numPr>
           <w:ilvl w:val="0"/>
-          <w:numId w:val="1007"/>
+          <w:numId w:val="1008"/>
         </w:numPr>
         <w:pStyle w:val="Compact"/>
       </w:pPr>
@@ -2961,7 +3205,7 @@
       <w:pPr>
         <w:numPr>
           <w:ilvl w:val="0"/>
-          <w:numId w:val="1008"/>
+          <w:numId w:val="1009"/>
         </w:numPr>
         <w:pStyle w:val="Compact"/>
       </w:pPr>
@@ -2979,7 +3223,7 @@
       <w:pPr>
         <w:numPr>
           <w:ilvl w:val="0"/>
-          <w:numId w:val="1008"/>
+          <w:numId w:val="1009"/>
         </w:numPr>
         <w:pStyle w:val="Compact"/>
       </w:pPr>
@@ -2991,7 +3235,7 @@
       <w:pPr>
         <w:numPr>
           <w:ilvl w:val="0"/>
-          <w:numId w:val="1008"/>
+          <w:numId w:val="1009"/>
         </w:numPr>
         <w:pStyle w:val="Compact"/>
       </w:pPr>
@@ -3060,7 +3304,7 @@
       <w:pPr>
         <w:numPr>
           <w:ilvl w:val="0"/>
-          <w:numId w:val="1008"/>
+          <w:numId w:val="1009"/>
         </w:numPr>
         <w:pStyle w:val="Compact"/>
       </w:pPr>
@@ -3084,7 +3328,7 @@
       <w:pPr>
         <w:numPr>
           <w:ilvl w:val="0"/>
-          <w:numId w:val="1008"/>
+          <w:numId w:val="1009"/>
         </w:numPr>
         <w:pStyle w:val="Compact"/>
       </w:pPr>
@@ -3893,7 +4137,7 @@
       <w:pPr>
         <w:numPr>
           <w:ilvl w:val="0"/>
-          <w:numId w:val="1009"/>
+          <w:numId w:val="1010"/>
         </w:numPr>
         <w:pStyle w:val="Compact"/>
       </w:pPr>
@@ -3963,7 +4207,7 @@
       <w:pPr>
         <w:numPr>
           <w:ilvl w:val="0"/>
-          <w:numId w:val="1009"/>
+          <w:numId w:val="1010"/>
         </w:numPr>
         <w:pStyle w:val="Compact"/>
       </w:pPr>
@@ -4006,7 +4250,7 @@
       <w:pPr>
         <w:numPr>
           <w:ilvl w:val="0"/>
-          <w:numId w:val="1009"/>
+          <w:numId w:val="1010"/>
         </w:numPr>
         <w:pStyle w:val="Compact"/>
       </w:pPr>
@@ -4780,7 +5024,7 @@
       <w:pPr>
         <w:numPr>
           <w:ilvl w:val="0"/>
-          <w:numId w:val="1010"/>
+          <w:numId w:val="1011"/>
         </w:numPr>
         <w:pStyle w:val="Compact"/>
       </w:pPr>
@@ -4820,7 +5064,7 @@
       <w:pPr>
         <w:numPr>
           <w:ilvl w:val="0"/>
-          <w:numId w:val="1010"/>
+          <w:numId w:val="1011"/>
         </w:numPr>
         <w:pStyle w:val="Compact"/>
       </w:pPr>
@@ -4919,7 +5163,7 @@
       <w:pPr>
         <w:numPr>
           <w:ilvl w:val="0"/>
-          <w:numId w:val="1011"/>
+          <w:numId w:val="1012"/>
         </w:numPr>
         <w:pStyle w:val="Compact"/>
       </w:pPr>
@@ -4952,7 +5196,7 @@
       <w:pPr>
         <w:numPr>
           <w:ilvl w:val="0"/>
-          <w:numId w:val="1011"/>
+          <w:numId w:val="1012"/>
         </w:numPr>
         <w:pStyle w:val="Compact"/>
       </w:pPr>
@@ -5002,7 +5246,7 @@
       <w:pPr>
         <w:numPr>
           <w:ilvl w:val="0"/>
-          <w:numId w:val="1012"/>
+          <w:numId w:val="1013"/>
         </w:numPr>
         <w:pStyle w:val="Compact"/>
       </w:pPr>
@@ -5020,7 +5264,7 @@
       <w:pPr>
         <w:numPr>
           <w:ilvl w:val="0"/>
-          <w:numId w:val="1012"/>
+          <w:numId w:val="1013"/>
         </w:numPr>
         <w:pStyle w:val="Compact"/>
       </w:pPr>
@@ -5032,7 +5276,7 @@
       <w:pPr>
         <w:numPr>
           <w:ilvl w:val="0"/>
-          <w:numId w:val="1012"/>
+          <w:numId w:val="1013"/>
         </w:numPr>
         <w:pStyle w:val="Compact"/>
       </w:pPr>
@@ -5050,7 +5294,7 @@
       <w:pPr>
         <w:numPr>
           <w:ilvl w:val="0"/>
-          <w:numId w:val="1012"/>
+          <w:numId w:val="1013"/>
         </w:numPr>
         <w:pStyle w:val="Compact"/>
       </w:pPr>
@@ -5223,7 +5467,7 @@
       <w:pPr>
         <w:numPr>
           <w:ilvl w:val="0"/>
-          <w:numId w:val="1013"/>
+          <w:numId w:val="1014"/>
         </w:numPr>
         <w:pStyle w:val="Compact"/>
       </w:pPr>
@@ -5247,7 +5491,7 @@
       <w:pPr>
         <w:numPr>
           <w:ilvl w:val="0"/>
-          <w:numId w:val="1013"/>
+          <w:numId w:val="1014"/>
         </w:numPr>
         <w:pStyle w:val="Compact"/>
       </w:pPr>
@@ -5277,7 +5521,7 @@
       <w:pPr>
         <w:numPr>
           <w:ilvl w:val="0"/>
-          <w:numId w:val="1013"/>
+          <w:numId w:val="1014"/>
         </w:numPr>
         <w:pStyle w:val="Compact"/>
       </w:pPr>
@@ -5289,7 +5533,7 @@
       <w:pPr>
         <w:numPr>
           <w:ilvl w:val="0"/>
-          <w:numId w:val="1013"/>
+          <w:numId w:val="1014"/>
         </w:numPr>
         <w:pStyle w:val="Compact"/>
       </w:pPr>
@@ -5453,7 +5697,7 @@
       <w:pPr>
         <w:numPr>
           <w:ilvl w:val="0"/>
-          <w:numId w:val="1014"/>
+          <w:numId w:val="1015"/>
         </w:numPr>
         <w:pStyle w:val="Compact"/>
       </w:pPr>
@@ -5465,7 +5709,7 @@
       <w:pPr>
         <w:numPr>
           <w:ilvl w:val="0"/>
-          <w:numId w:val="1014"/>
+          <w:numId w:val="1015"/>
         </w:numPr>
         <w:pStyle w:val="Compact"/>
       </w:pPr>
@@ -5493,7 +5737,7 @@
       <w:pPr>
         <w:numPr>
           <w:ilvl w:val="0"/>
-          <w:numId w:val="1014"/>
+          <w:numId w:val="1015"/>
         </w:numPr>
         <w:pStyle w:val="Compact"/>
       </w:pPr>
@@ -5515,7 +5759,7 @@
       <w:pPr>
         <w:numPr>
           <w:ilvl w:val="0"/>
-          <w:numId w:val="1014"/>
+          <w:numId w:val="1015"/>
         </w:numPr>
         <w:pStyle w:val="Compact"/>
       </w:pPr>
@@ -5746,7 +5990,7 @@
       <w:pPr>
         <w:numPr>
           <w:ilvl w:val="0"/>
-          <w:numId w:val="1015"/>
+          <w:numId w:val="1016"/>
         </w:numPr>
         <w:pStyle w:val="Compact"/>
       </w:pPr>
@@ -5786,7 +6030,7 @@
       <w:pPr>
         <w:numPr>
           <w:ilvl w:val="0"/>
-          <w:numId w:val="1015"/>
+          <w:numId w:val="1016"/>
         </w:numPr>
         <w:pStyle w:val="Compact"/>
       </w:pPr>
@@ -6052,7 +6296,7 @@
       <w:pPr>
         <w:numPr>
           <w:ilvl w:val="0"/>
-          <w:numId w:val="1016"/>
+          <w:numId w:val="1017"/>
         </w:numPr>
         <w:pStyle w:val="Compact"/>
       </w:pPr>
@@ -6097,7 +6341,7 @@
       <w:pPr>
         <w:numPr>
           <w:ilvl w:val="0"/>
-          <w:numId w:val="1016"/>
+          <w:numId w:val="1017"/>
         </w:numPr>
         <w:pStyle w:val="Compact"/>
       </w:pPr>
@@ -6115,7 +6359,7 @@
       <w:pPr>
         <w:numPr>
           <w:ilvl w:val="0"/>
-          <w:numId w:val="1016"/>
+          <w:numId w:val="1017"/>
         </w:numPr>
         <w:pStyle w:val="Compact"/>
       </w:pPr>
@@ -6457,7 +6701,7 @@
       <w:pPr>
         <w:numPr>
           <w:ilvl w:val="0"/>
-          <w:numId w:val="1017"/>
+          <w:numId w:val="1018"/>
         </w:numPr>
         <w:pStyle w:val="Compact"/>
       </w:pPr>
@@ -6494,61 +6738,61 @@
       <w:pPr>
         <w:numPr>
           <w:ilvl w:val="1"/>
+          <w:numId w:val="1019"/>
+        </w:numPr>
+        <w:pStyle w:val="Compact"/>
+      </w:pPr>
+      <w:r>
+        <w:t xml:space="preserve">Demo 1: orbit radius silently clamped to ≥ 35 mm.</w:t>
+      </w:r>
+    </w:p>
+    <w:p>
+      <w:pPr>
+        <w:numPr>
+          <w:ilvl w:val="1"/>
+          <w:numId w:val="1019"/>
+        </w:numPr>
+        <w:pStyle w:val="Compact"/>
+      </w:pPr>
+      <w:r>
+        <w:t xml:space="preserve">Demo 2: clicks inside the red disk flash and are ignored.</w:t>
+      </w:r>
+    </w:p>
+    <w:p>
+      <w:pPr>
+        <w:numPr>
+          <w:ilvl w:val="1"/>
+          <w:numId w:val="1019"/>
+        </w:numPr>
+        <w:pStyle w:val="Compact"/>
+      </w:pPr>
+      <w:r>
+        <w:t xml:space="preserve">Demo 3: any path sample inside the dead-zone fails the</w:t>
+      </w:r>
+      <w:r>
+        <w:t xml:space="preserve"> </w:t>
+      </w:r>
+      <w:r>
+        <w:t xml:space="preserve">pre-flight check and the entire path is rejected (operator must</w:t>
+      </w:r>
+      <w:r>
+        <w:t xml:space="preserve"> </w:t>
+      </w:r>
+      <w:r>
+        <w:t xml:space="preserve">redraw — silent clipping was considered and rejected; a redrawn</w:t>
+      </w:r>
+      <w:r>
+        <w:t xml:space="preserve"> </w:t>
+      </w:r>
+      <w:r>
+        <w:t xml:space="preserve">path is more honest than a silently-mutated one).</w:t>
+      </w:r>
+    </w:p>
+    <w:p>
+      <w:pPr>
+        <w:numPr>
+          <w:ilvl w:val="0"/>
           <w:numId w:val="1018"/>
-        </w:numPr>
-        <w:pStyle w:val="Compact"/>
-      </w:pPr>
-      <w:r>
-        <w:t xml:space="preserve">Demo 1: orbit radius silently clamped to ≥ 35 mm.</w:t>
-      </w:r>
-    </w:p>
-    <w:p>
-      <w:pPr>
-        <w:numPr>
-          <w:ilvl w:val="1"/>
-          <w:numId w:val="1018"/>
-        </w:numPr>
-        <w:pStyle w:val="Compact"/>
-      </w:pPr>
-      <w:r>
-        <w:t xml:space="preserve">Demo 2: clicks inside the red disk flash and are ignored.</w:t>
-      </w:r>
-    </w:p>
-    <w:p>
-      <w:pPr>
-        <w:numPr>
-          <w:ilvl w:val="1"/>
-          <w:numId w:val="1018"/>
-        </w:numPr>
-        <w:pStyle w:val="Compact"/>
-      </w:pPr>
-      <w:r>
-        <w:t xml:space="preserve">Demo 3: any path sample inside the dead-zone fails the</w:t>
-      </w:r>
-      <w:r>
-        <w:t xml:space="preserve"> </w:t>
-      </w:r>
-      <w:r>
-        <w:t xml:space="preserve">pre-flight check and the entire path is rejected (operator must</w:t>
-      </w:r>
-      <w:r>
-        <w:t xml:space="preserve"> </w:t>
-      </w:r>
-      <w:r>
-        <w:t xml:space="preserve">redraw — silent clipping was considered and rejected; a redrawn</w:t>
-      </w:r>
-      <w:r>
-        <w:t xml:space="preserve"> </w:t>
-      </w:r>
-      <w:r>
-        <w:t xml:space="preserve">path is more honest than a silently-mutated one).</w:t>
-      </w:r>
-    </w:p>
-    <w:p>
-      <w:pPr>
-        <w:numPr>
-          <w:ilvl w:val="0"/>
-          <w:numId w:val="1017"/>
         </w:numPr>
         <w:pStyle w:val="Compact"/>
       </w:pPr>
@@ -6619,7 +6863,7 @@
       <w:pPr>
         <w:numPr>
           <w:ilvl w:val="0"/>
-          <w:numId w:val="1017"/>
+          <w:numId w:val="1018"/>
         </w:numPr>
         <w:pStyle w:val="Compact"/>
       </w:pPr>
@@ -6668,7 +6912,7 @@
       <w:pPr>
         <w:numPr>
           <w:ilvl w:val="0"/>
-          <w:numId w:val="1017"/>
+          <w:numId w:val="1018"/>
         </w:numPr>
         <w:pStyle w:val="Compact"/>
       </w:pPr>
@@ -6929,13 +7173,108 @@
         <w:t xml:space="preserve">to keep all live information visible at once.</w:t>
       </w:r>
     </w:p>
-    <w:bookmarkStart w:id="46" w:name="three-column-layout"/>
+    <w:bookmarkStart w:id="46" w:name="X7faa6626b72c040da1b42e778aec96567c67437"/>
     <w:p>
       <w:pPr>
         <w:pStyle w:val="Heading3"/>
       </w:pPr>
       <w:r>
-        <w:t xml:space="preserve">11.0 Three-column layout</w:t>
+        <w:t xml:space="preserve">11.0 Three-column layout (already in</w:t>
+      </w:r>
+      <w:r>
+        <w:t xml:space="preserve"> </w:t>
+      </w:r>
+      <w:r>
+        <w:rPr>
+          <w:rStyle w:val="VerbatimChar"/>
+        </w:rPr>
+        <w:t xml:space="preserve">web/index.html</w:t>
+      </w:r>
+      <w:r>
+        <w:t xml:space="preserve">)</w:t>
+      </w:r>
+    </w:p>
+    <w:p>
+      <w:pPr>
+        <w:pStyle w:val="FirstParagraph"/>
+      </w:pPr>
+      <w:r>
+        <w:t xml:space="preserve">The current</w:t>
+      </w:r>
+      <w:r>
+        <w:t xml:space="preserve"> </w:t>
+      </w:r>
+      <w:r>
+        <w:rPr>
+          <w:rStyle w:val="VerbatimChar"/>
+        </w:rPr>
+        <w:t xml:space="preserve">web/index.html</w:t>
+      </w:r>
+      <w:r>
+        <w:t xml:space="preserve"> </w:t>
+      </w:r>
+      <w:r>
+        <w:t xml:space="preserve">is already three-column on</w:t>
+      </w:r>
+      <w:r>
+        <w:t xml:space="preserve"> </w:t>
+      </w:r>
+      <w:r>
+        <w:rPr>
+          <w:rStyle w:val="VerbatimChar"/>
+        </w:rPr>
+        <w:t xml:space="preserve">lg:</w:t>
+      </w:r>
+      <w:r>
+        <w:t xml:space="preserve"> </w:t>
+      </w:r>
+      <w:r>
+        <w:t xml:space="preserve">breakpoint</w:t>
+      </w:r>
+      <w:r>
+        <w:t xml:space="preserve"> </w:t>
+      </w:r>
+      <w:r>
+        <w:t xml:space="preserve">and above (</w:t>
+      </w:r>
+      <w:r>
+        <w:rPr>
+          <w:rStyle w:val="VerbatimChar"/>
+        </w:rPr>
+        <w:t xml:space="preserve">&lt;main class="grid lg:grid-cols-3"&gt;</w:t>
+      </w:r>
+      <w:r>
+        <w:t xml:space="preserve"> </w:t>
+      </w:r>
+      <w:r>
+        <w:t xml:space="preserve">with three</w:t>
+      </w:r>
+      <w:r>
+        <w:t xml:space="preserve"> </w:t>
+      </w:r>
+      <w:r>
+        <w:rPr>
+          <w:rStyle w:val="VerbatimChar"/>
+        </w:rPr>
+        <w:t xml:space="preserve">&lt;section class="lg:col-span-1"&gt;</w:t>
+      </w:r>
+      <w:r>
+        <w:t xml:space="preserve"> </w:t>
+      </w:r>
+      <w:r>
+        <w:t xml:space="preserve">children). On screens narrower than</w:t>
+      </w:r>
+      <w:r>
+        <w:t xml:space="preserve"> </w:t>
+      </w:r>
+      <w:r>
+        <w:t xml:space="preserve">1280 px the columns stack vertically. The vision-driven demos add</w:t>
+      </w:r>
+      <w:r>
+        <w:t xml:space="preserve"> </w:t>
+      </w:r>
+      <w:r>
+        <w:t xml:space="preserve">panels into the existing layout rather than restructuring it:</w:t>
       </w:r>
     </w:p>
     <w:p>
@@ -6973,7 +7312,7 @@
         <w:rPr>
           <w:rStyle w:val="VerbatimChar"/>
         </w:rPr>
-        <w:t xml:space="preserve">│  Vision      │  Demo control panels:         │  Existing    │</w:t>
+        <w:t xml:space="preserve">│  + Vision    │  + Demo 1 (Orbit)             │  Homing      │</w:t>
       </w:r>
       <w:r>
         <w:br/>
@@ -6982,7 +7321,7 @@
         <w:rPr>
           <w:rStyle w:val="VerbatimChar"/>
         </w:rPr>
-        <w:t xml:space="preserve">│  Debug       │   • Demo 1 (Orbit)            │  controls    │</w:t>
+        <w:t xml:space="preserve">│    Debug     │  + Demo 2 (Goto)              │  Jog         │</w:t>
       </w:r>
       <w:r>
         <w:br/>
@@ -6991,7 +7330,7 @@
         <w:rPr>
           <w:rStyle w:val="VerbatimChar"/>
         </w:rPr>
-        <w:t xml:space="preserve">│   • Live     │   • Demo 2 (Goto)             │   • Homing   │</w:t>
+        <w:t xml:space="preserve">│  + Calib     │  + Demo 3 (Path) [stretch]    │  Level       │</w:t>
       </w:r>
       <w:r>
         <w:br/>
@@ -7000,7 +7339,7 @@
         <w:rPr>
           <w:rStyle w:val="VerbatimChar"/>
         </w:rPr>
-        <w:t xml:space="preserve">│     stereo   │   • Demo 3 (Path) [stretch]   │   • Jog      │</w:t>
+        <w:t xml:space="preserve">│    Stage C   │   each with Start / Stop +    │  Reset stack │</w:t>
       </w:r>
       <w:r>
         <w:br/>
@@ -7009,7 +7348,7 @@
         <w:rPr>
           <w:rStyle w:val="VerbatimChar"/>
         </w:rPr>
-        <w:t xml:space="preserve">│     feed     │  Each with Start / Stop +     │   • Level    │</w:t>
+        <w:t xml:space="preserve">│    only      │   graphical SVG disk view     │  (existing)  │</w:t>
       </w:r>
       <w:r>
         <w:br/>
@@ -7018,7 +7357,7 @@
         <w:rPr>
           <w:rStyle w:val="VerbatimChar"/>
         </w:rPr>
-        <w:t xml:space="preserve">│   • Status   │  graphical SVG disk view.     │   • Reset    │</w:t>
+        <w:t xml:space="preserve">│              │                               │              │</w:t>
       </w:r>
       <w:r>
         <w:br/>
@@ -7027,7 +7366,7 @@
         <w:rPr>
           <w:rStyle w:val="VerbatimChar"/>
         </w:rPr>
-        <w:t xml:space="preserve">│   • Latency  │                               │     stack    │</w:t>
+        <w:t xml:space="preserve">│  Encoder &amp;   │  (Open-loop "rolling ball"    │              │</w:t>
       </w:r>
       <w:r>
         <w:br/>
@@ -7036,7 +7375,7 @@
         <w:rPr>
           <w:rStyle w:val="VerbatimChar"/>
         </w:rPr>
-        <w:t xml:space="preserve">│              │                               │              │</w:t>
+        <w:t xml:space="preserve">│  current     │   panel hidden by default     │              │</w:t>
       </w:r>
       <w:r>
         <w:br/>
@@ -7045,7 +7384,7 @@
         <w:rPr>
           <w:rStyle w:val="VerbatimChar"/>
         </w:rPr>
-        <w:t xml:space="preserve">│  Encoder &amp;   │                               │              │</w:t>
+        <w:t xml:space="preserve">│  debug       │   when vision is active)      │              │</w:t>
       </w:r>
       <w:r>
         <w:br/>
@@ -7054,7 +7393,7 @@
         <w:rPr>
           <w:rStyle w:val="VerbatimChar"/>
         </w:rPr>
-        <w:t xml:space="preserve">│  current     │                               │              │</w:t>
+        <w:t xml:space="preserve">│  (existing)  │                               │              │</w:t>
       </w:r>
       <w:r>
         <w:br/>
@@ -7063,33 +7402,6 @@
         <w:rPr>
           <w:rStyle w:val="VerbatimChar"/>
         </w:rPr>
-        <w:t xml:space="preserve">│  debug       │                               │              │</w:t>
-      </w:r>
-      <w:r>
-        <w:br/>
-      </w:r>
-      <w:r>
-        <w:rPr>
-          <w:rStyle w:val="VerbatimChar"/>
-        </w:rPr>
-        <w:t xml:space="preserve">│  values      │                               │              │</w:t>
-      </w:r>
-      <w:r>
-        <w:br/>
-      </w:r>
-      <w:r>
-        <w:rPr>
-          <w:rStyle w:val="VerbatimChar"/>
-        </w:rPr>
-        <w:t xml:space="preserve">│  (existing)  │                               │              │</w:t>
-      </w:r>
-      <w:r>
-        <w:br/>
-      </w:r>
-      <w:r>
-        <w:rPr>
-          <w:rStyle w:val="VerbatimChar"/>
-        </w:rPr>
         <w:t xml:space="preserve">└──────────────┴──────────────────────────────┴──────────────┘</w:t>
       </w:r>
     </w:p>
@@ -7098,13 +7410,22 @@
         <w:pStyle w:val="FirstParagraph"/>
       </w:pPr>
       <w:r>
-        <w:t xml:space="preserve">All three columns scroll independently. On screens narrower than</w:t>
-      </w:r>
-      <w:r>
-        <w:t xml:space="preserve"> </w:t>
-      </w:r>
-      <w:r>
-        <w:t xml:space="preserve">1280 px the columns stack vertically (mobile-friendly fallback).</w:t>
+        <w:rPr>
+          <w:rStyle w:val="VerbatimChar"/>
+        </w:rPr>
+        <w:t xml:space="preserve">+</w:t>
+      </w:r>
+      <w:r>
+        <w:t xml:space="preserve"> </w:t>
+      </w:r>
+      <w:r>
+        <w:t xml:space="preserve">= NEW panels added by the vision work. Existing panels keep</w:t>
+      </w:r>
+      <w:r>
+        <w:t xml:space="preserve"> </w:t>
+      </w:r>
+      <w:r>
+        <w:t xml:space="preserve">working unchanged.</w:t>
       </w:r>
     </w:p>
     <w:bookmarkEnd w:id="46"/>
@@ -7139,7 +7460,7 @@
       <w:pPr>
         <w:numPr>
           <w:ilvl w:val="0"/>
-          <w:numId w:val="1019"/>
+          <w:numId w:val="1020"/>
         </w:numPr>
         <w:pStyle w:val="Compact"/>
       </w:pPr>
@@ -7181,7 +7502,7 @@
       <w:pPr>
         <w:numPr>
           <w:ilvl w:val="0"/>
-          <w:numId w:val="1019"/>
+          <w:numId w:val="1020"/>
         </w:numPr>
         <w:pStyle w:val="Compact"/>
       </w:pPr>
@@ -7199,7 +7520,7 @@
       <w:pPr>
         <w:numPr>
           <w:ilvl w:val="0"/>
-          <w:numId w:val="1019"/>
+          <w:numId w:val="1020"/>
         </w:numPr>
         <w:pStyle w:val="Compact"/>
       </w:pPr>
@@ -7235,7 +7556,7 @@
       <w:pPr>
         <w:numPr>
           <w:ilvl w:val="0"/>
-          <w:numId w:val="1019"/>
+          <w:numId w:val="1020"/>
         </w:numPr>
         <w:pStyle w:val="Compact"/>
       </w:pPr>
@@ -7271,7 +7592,7 @@
       <w:pPr>
         <w:numPr>
           <w:ilvl w:val="0"/>
-          <w:numId w:val="1019"/>
+          <w:numId w:val="1020"/>
         </w:numPr>
         <w:pStyle w:val="Compact"/>
       </w:pPr>
@@ -7283,7 +7604,7 @@
       <w:pPr>
         <w:numPr>
           <w:ilvl w:val="1"/>
-          <w:numId w:val="1020"/>
+          <w:numId w:val="1021"/>
         </w:numPr>
         <w:pStyle w:val="Compact"/>
       </w:pPr>
@@ -7295,7 +7616,7 @@
       <w:pPr>
         <w:numPr>
           <w:ilvl w:val="1"/>
-          <w:numId w:val="1020"/>
+          <w:numId w:val="1021"/>
         </w:numPr>
         <w:pStyle w:val="Compact"/>
       </w:pPr>
@@ -7307,7 +7628,7 @@
       <w:pPr>
         <w:numPr>
           <w:ilvl w:val="1"/>
-          <w:numId w:val="1020"/>
+          <w:numId w:val="1021"/>
         </w:numPr>
         <w:pStyle w:val="Compact"/>
       </w:pPr>
@@ -7328,7 +7649,7 @@
       <w:pPr>
         <w:numPr>
           <w:ilvl w:val="1"/>
-          <w:numId w:val="1020"/>
+          <w:numId w:val="1021"/>
         </w:numPr>
         <w:pStyle w:val="Compact"/>
       </w:pPr>
@@ -7356,7 +7677,7 @@
       <w:pPr>
         <w:numPr>
           <w:ilvl w:val="2"/>
-          <w:numId w:val="1021"/>
+          <w:numId w:val="1022"/>
         </w:numPr>
         <w:pStyle w:val="Compact"/>
       </w:pPr>
@@ -7378,7 +7699,7 @@
       <w:pPr>
         <w:numPr>
           <w:ilvl w:val="2"/>
-          <w:numId w:val="1021"/>
+          <w:numId w:val="1022"/>
         </w:numPr>
         <w:pStyle w:val="Compact"/>
       </w:pPr>
@@ -7400,7 +7721,7 @@
       <w:pPr>
         <w:numPr>
           <w:ilvl w:val="2"/>
-          <w:numId w:val="1021"/>
+          <w:numId w:val="1022"/>
         </w:numPr>
         <w:pStyle w:val="Compact"/>
       </w:pPr>
@@ -7438,108 +7759,74 @@
     </w:p>
     <w:p>
       <w:pPr>
-        <w:numPr>
-          <w:ilvl w:val="0"/>
-          <w:numId w:val="1022"/>
-        </w:numPr>
-        <w:pStyle w:val="Compact"/>
-      </w:pPr>
-      <w:r>
-        <w:t xml:space="preserve">Live OAK left-eye feed with detected chessboard / ArUco board</w:t>
-      </w:r>
-      <w:r>
-        <w:t xml:space="preserve"> </w:t>
-      </w:r>
-      <w:r>
-        <w:t xml:space="preserve">corners drawn in real time (so the user can see whether the</w:t>
-      </w:r>
-      <w:r>
-        <w:t xml:space="preserve"> </w:t>
-      </w:r>
-      <w:r>
-        <w:t xml:space="preserve">current pose is being accepted).</w:t>
-      </w:r>
-    </w:p>
-    <w:p>
-      <w:pPr>
-        <w:numPr>
-          <w:ilvl w:val="0"/>
-          <w:numId w:val="1022"/>
-        </w:numPr>
-        <w:pStyle w:val="Compact"/>
-      </w:pPr>
-      <w:r>
-        <w:t xml:space="preserve">Frame counter</w:t>
-      </w:r>
-      <w:r>
-        <w:t xml:space="preserve"> </w:t>
-      </w:r>
-      <w:r>
-        <w:t xml:space="preserve">“</w:t>
-      </w:r>
-      <w:r>
-        <w:t xml:space="preserve">N/30 captured</w:t>
-      </w:r>
-      <w:r>
-        <w:t xml:space="preserve">”</w:t>
-      </w:r>
-      <w:r>
-        <w:t xml:space="preserve"> </w:t>
-      </w:r>
-      <w:r>
-        <w:t xml:space="preserve">for Stage A.</w:t>
-      </w:r>
-    </w:p>
-    <w:p>
-      <w:pPr>
-        <w:numPr>
-          <w:ilvl w:val="0"/>
-          <w:numId w:val="1022"/>
-        </w:numPr>
-        <w:pStyle w:val="Compact"/>
-      </w:pPr>
-      <w:r>
-        <w:t xml:space="preserve">Three buttons:</w:t>
-      </w:r>
-    </w:p>
-    <w:p>
-      <w:pPr>
-        <w:numPr>
-          <w:ilvl w:val="1"/>
-          <w:numId w:val="1023"/>
-        </w:numPr>
-        <w:pStyle w:val="Compact"/>
-      </w:pPr>
+        <w:pStyle w:val="BodyText"/>
+      </w:pPr>
+      <w:r>
+        <w:t xml:space="preserve">This panel exposes</w:t>
+      </w:r>
+      <w:r>
+        <w:t xml:space="preserve"> </w:t>
+      </w:r>
       <w:r>
         <w:rPr>
           <w:bCs/>
           <w:b/>
         </w:rPr>
-        <w:t xml:space="preserve">Capture frame</w:t>
-      </w:r>
-      <w:r>
-        <w:t xml:space="preserve"> </w:t>
-      </w:r>
-      <w:r>
-        <w:t xml:space="preserve">— calls</w:t>
-      </w:r>
-      <w:r>
-        <w:t xml:space="preserve"> </w:t>
-      </w:r>
-      <w:r>
-        <w:rPr>
-          <w:rStyle w:val="VerbatimChar"/>
-        </w:rPr>
-        <w:t xml:space="preserve">/calibrate/capture_frame</w:t>
-      </w:r>
-      <w:r>
-        <w:t xml:space="preserve">. Result</w:t>
-      </w:r>
-      <w:r>
-        <w:t xml:space="preserve"> </w:t>
-      </w:r>
-      <w:r>
-        <w:t xml:space="preserve">toast:</w:t>
+        <w:t xml:space="preserve">Stage C only</w:t>
+      </w:r>
+      <w:r>
+        <w:t xml:space="preserve"> </w:t>
+      </w:r>
+      <w:r>
+        <w:t xml:space="preserve">— the ArUco-ring camera-to-world</w:t>
+      </w:r>
+      <w:r>
+        <w:t xml:space="preserve"> </w:t>
+      </w:r>
+      <w:r>
+        <w:t xml:space="preserve">step that’s re-run after every camera arm move. Stages A/B are</w:t>
+      </w:r>
+      <w:r>
+        <w:t xml:space="preserve"> </w:t>
+      </w:r>
+      <w:r>
+        <w:t xml:space="preserve">CLI-only by design (see §6).</w:t>
+      </w:r>
+    </w:p>
+    <w:p>
+      <w:pPr>
+        <w:numPr>
+          <w:ilvl w:val="0"/>
+          <w:numId w:val="1023"/>
+        </w:numPr>
+        <w:pStyle w:val="Compact"/>
+      </w:pPr>
+      <w:r>
+        <w:t xml:space="preserve">Live OAK left-eye feed with detected ArUco-ring corners drawn in</w:t>
+      </w:r>
+      <w:r>
+        <w:t xml:space="preserve"> </w:t>
+      </w:r>
+      <w:r>
+        <w:t xml:space="preserve">real time (so the user can see whether the current pose has all</w:t>
+      </w:r>
+      <w:r>
+        <w:t xml:space="preserve"> </w:t>
+      </w:r>
+      <w:r>
+        <w:t xml:space="preserve">8 markers visible before pressing Capture).</w:t>
+      </w:r>
+    </w:p>
+    <w:p>
+      <w:pPr>
+        <w:numPr>
+          <w:ilvl w:val="0"/>
+          <w:numId w:val="1023"/>
+        </w:numPr>
+        <w:pStyle w:val="Compact"/>
+      </w:pPr>
+      <w:r>
+        <w:t xml:space="preserve">Frame counter</w:t>
       </w:r>
       <w:r>
         <w:t xml:space="preserve"> </w:t>
@@ -7548,7 +7835,7 @@
         <w:t xml:space="preserve">“</w:t>
       </w:r>
       <w:r>
-        <w:t xml:space="preserve">frame N/30 captured</w:t>
+        <w:t xml:space="preserve">N captured</w:t>
       </w:r>
       <w:r>
         <w:t xml:space="preserve">”</w:t>
@@ -7557,53 +7844,38 @@
         <w:t xml:space="preserve"> </w:t>
       </w:r>
       <w:r>
-        <w:t xml:space="preserve">or</w:t>
-      </w:r>
-      <w:r>
-        <w:t xml:space="preserve"> </w:t>
-      </w:r>
-      <w:r>
-        <w:t xml:space="preserve">“</w:t>
-      </w:r>
-      <w:r>
-        <w:t xml:space="preserve">chessboard not detected, try</w:t>
-      </w:r>
-      <w:r>
-        <w:t xml:space="preserve"> </w:t>
-      </w:r>
-      <w:r>
-        <w:t xml:space="preserve">again</w:t>
-      </w:r>
-      <w:r>
-        <w:t xml:space="preserve">”</w:t>
-      </w:r>
-      <w:r>
-        <w:t xml:space="preserve"> </w:t>
-      </w:r>
-      <w:r>
-        <w:t xml:space="preserve">or</w:t>
-      </w:r>
-      <w:r>
-        <w:t xml:space="preserve"> </w:t>
-      </w:r>
-      <w:r>
-        <w:t xml:space="preserve">“</w:t>
-      </w:r>
-      <w:r>
-        <w:t xml:space="preserve">pose too similar to a captured one — vary angle</w:t>
-      </w:r>
-      <w:r>
-        <w:t xml:space="preserve">”</w:t>
-      </w:r>
-      <w:r>
-        <w:t xml:space="preserve">.</w:t>
+        <w:t xml:space="preserve">— typically 1–3 frames is enough for</w:t>
+      </w:r>
+      <w:r>
+        <w:t xml:space="preserve"> </w:t>
+      </w:r>
+      <w:r>
+        <w:t xml:space="preserve">Stage C with a well-leveled platform; the solver accepts a</w:t>
+      </w:r>
+      <w:r>
+        <w:t xml:space="preserve"> </w:t>
+      </w:r>
+      <w:r>
+        <w:t xml:space="preserve">single frame as long as ≥ 3 markers are detected.</w:t>
+      </w:r>
+    </w:p>
+    <w:p>
+      <w:pPr>
+        <w:numPr>
+          <w:ilvl w:val="0"/>
+          <w:numId w:val="1023"/>
+        </w:numPr>
+        <w:pStyle w:val="Compact"/>
+      </w:pPr>
+      <w:r>
+        <w:t xml:space="preserve">Three buttons (only Stage C operations exposed via ROS):</w:t>
       </w:r>
     </w:p>
     <w:p>
       <w:pPr>
         <w:numPr>
           <w:ilvl w:val="1"/>
-          <w:numId w:val="1023"/>
+          <w:numId w:val="1024"/>
         </w:numPr>
         <w:pStyle w:val="Compact"/>
       </w:pPr>
@@ -7612,7 +7884,7 @@
           <w:bCs/>
           <w:b/>
         </w:rPr>
-        <w:t xml:space="preserve">Solve</w:t>
+        <w:t xml:space="preserve">Capture frame</w:t>
       </w:r>
       <w:r>
         <w:t xml:space="preserve"> </w:t>
@@ -7627,29 +7899,62 @@
         <w:rPr>
           <w:rStyle w:val="VerbatimChar"/>
         </w:rPr>
-        <w:t xml:space="preserve">/calibrate/solve</w:t>
-      </w:r>
-      <w:r>
-        <w:t xml:space="preserve">. Disabled until ≥ 30 frames.</w:t>
-      </w:r>
-      <w:r>
-        <w:t xml:space="preserve"> </w:t>
-      </w:r>
-      <w:r>
-        <w:t xml:space="preserve">Returns reprojection error per eye + epipolar error; refuses</w:t>
-      </w:r>
-      <w:r>
-        <w:t xml:space="preserve"> </w:t>
-      </w:r>
-      <w:r>
-        <w:t xml:space="preserve">to write the YAML if acceptance gates fail.</w:t>
+        <w:t xml:space="preserve">/calibrate/capture_frame</w:t>
+      </w:r>
+      <w:r>
+        <w:t xml:space="preserve">. Result</w:t>
+      </w:r>
+      <w:r>
+        <w:t xml:space="preserve"> </w:t>
+      </w:r>
+      <w:r>
+        <w:t xml:space="preserve">toast:</w:t>
+      </w:r>
+      <w:r>
+        <w:t xml:space="preserve"> </w:t>
+      </w:r>
+      <w:r>
+        <w:t xml:space="preserve">“</w:t>
+      </w:r>
+      <w:r>
+        <w:t xml:space="preserve">all 8 markers detected</w:t>
+      </w:r>
+      <w:r>
+        <w:t xml:space="preserve">”</w:t>
+      </w:r>
+      <w:r>
+        <w:t xml:space="preserve"> </w:t>
+      </w:r>
+      <w:r>
+        <w:t xml:space="preserve">/</w:t>
+      </w:r>
+      <w:r>
+        <w:t xml:space="preserve"> </w:t>
+      </w:r>
+      <w:r>
+        <w:t xml:space="preserve">“</w:t>
+      </w:r>
+      <w:r>
+        <w:t xml:space="preserve">only N/8 markers visible —</w:t>
+      </w:r>
+      <w:r>
+        <w:t xml:space="preserve"> </w:t>
+      </w:r>
+      <w:r>
+        <w:t xml:space="preserve">rotate camera or improve lighting</w:t>
+      </w:r>
+      <w:r>
+        <w:t xml:space="preserve">”</w:t>
+      </w:r>
+      <w:r>
+        <w:t xml:space="preserve">.</w:t>
       </w:r>
     </w:p>
     <w:p>
       <w:pPr>
         <w:numPr>
           <w:ilvl w:val="1"/>
-          <w:numId w:val="1023"/>
+          <w:numId w:val="1024"/>
         </w:numPr>
         <w:pStyle w:val="Compact"/>
       </w:pPr>
@@ -7658,93 +7963,130 @@
           <w:bCs/>
           <w:b/>
         </w:rPr>
-        <w:t xml:space="preserve">Reset</w:t>
-      </w:r>
-      <w:r>
-        <w:t xml:space="preserve"> </w:t>
-      </w:r>
-      <w:r>
-        <w:t xml:space="preserve">— clears the buffer.</w:t>
-      </w:r>
-    </w:p>
-    <w:p>
-      <w:pPr>
-        <w:numPr>
-          <w:ilvl w:val="0"/>
-          <w:numId w:val="1022"/>
-        </w:numPr>
-        <w:pStyle w:val="Compact"/>
-      </w:pPr>
-      <w:r>
-        <w:t xml:space="preserve">Stage selector:</w:t>
-      </w:r>
-      <w:r>
-        <w:t xml:space="preserve"> </w:t>
-      </w:r>
-      <w:r>
-        <w:t xml:space="preserve">“</w:t>
-      </w:r>
-      <w:r>
-        <w:t xml:space="preserve">Stage A (intrinsics)</w:t>
-      </w:r>
-      <w:r>
-        <w:t xml:space="preserve">”</w:t>
-      </w:r>
-      <w:r>
-        <w:t xml:space="preserve"> </w:t>
-      </w:r>
-      <w:r>
-        <w:t xml:space="preserve">/</w:t>
-      </w:r>
-      <w:r>
-        <w:t xml:space="preserve"> </w:t>
-      </w:r>
-      <w:r>
-        <w:t xml:space="preserve">“</w:t>
-      </w:r>
-      <w:r>
-        <w:t xml:space="preserve">Stage B (stereo)</w:t>
-      </w:r>
-      <w:r>
-        <w:t xml:space="preserve">”</w:t>
-      </w:r>
-      <w:r>
-        <w:t xml:space="preserve"> </w:t>
-      </w:r>
-      <w:r>
-        <w:t xml:space="preserve">/</w:t>
-      </w:r>
-      <w:r>
-        <w:t xml:space="preserve"> </w:t>
-      </w:r>
-      <w:r>
-        <w:t xml:space="preserve">“</w:t>
-      </w:r>
-      <w:r>
-        <w:t xml:space="preserve">Stage C (camera-to-world)</w:t>
-      </w:r>
-      <w:r>
-        <w:t xml:space="preserve">”</w:t>
-      </w:r>
-      <w:r>
-        <w:t xml:space="preserve">. Stage C is the one re-run after</w:t>
-      </w:r>
-      <w:r>
-        <w:t xml:space="preserve"> </w:t>
-      </w:r>
-      <w:r>
-        <w:t xml:space="preserve">every camera move; the others run rarely.</w:t>
-      </w:r>
-    </w:p>
-    <w:p>
-      <w:pPr>
-        <w:pStyle w:val="FirstParagraph"/>
+        <w:t xml:space="preserve">Solve</w:t>
+      </w:r>
+      <w:r>
+        <w:t xml:space="preserve"> </w:t>
+      </w:r>
+      <w:r>
+        <w:t xml:space="preserve">— calls</w:t>
+      </w:r>
+      <w:r>
+        <w:t xml:space="preserve"> </w:t>
+      </w:r>
+      <w:r>
+        <w:rPr>
+          <w:rStyle w:val="VerbatimChar"/>
+        </w:rPr>
+        <w:t xml:space="preserve">/calibrate/solve</w:t>
+      </w:r>
+      <w:r>
+        <w:t xml:space="preserve">. Runs</w:t>
+      </w:r>
+      <w:r>
+        <w:t xml:space="preserve"> </w:t>
+      </w:r>
+      <w:r>
+        <w:rPr>
+          <w:rStyle w:val="VerbatimChar"/>
+        </w:rPr>
+        <w:t xml:space="preserve">cv2.aruco.estimatePoseBoard</w:t>
+      </w:r>
+      <w:r>
+        <w:t xml:space="preserve"> </w:t>
+      </w:r>
+      <w:r>
+        <w:t xml:space="preserve">over the accepted frames; writes</w:t>
+      </w:r>
+      <w:r>
+        <w:t xml:space="preserve"> </w:t>
+      </w:r>
+      <w:r>
+        <w:rPr>
+          <w:rStyle w:val="VerbatimChar"/>
+        </w:rPr>
+        <w:t xml:space="preserve">oak_extrinsics.yaml</w:t>
+      </w:r>
+      <w:r>
+        <w:t xml:space="preserve"> </w:t>
+      </w:r>
+      <w:r>
+        <w:t xml:space="preserve">if mean reprojection error &lt; 2 px.</w:t>
+      </w:r>
+    </w:p>
+    <w:p>
+      <w:pPr>
+        <w:numPr>
+          <w:ilvl w:val="1"/>
+          <w:numId w:val="1024"/>
+        </w:numPr>
+        <w:pStyle w:val="Compact"/>
       </w:pPr>
       <w:r>
         <w:rPr>
           <w:bCs/>
           <w:b/>
         </w:rPr>
+        <w:t xml:space="preserve">Reset</w:t>
+      </w:r>
+      <w:r>
+        <w:t xml:space="preserve"> </w:t>
+      </w:r>
+      <w:r>
+        <w:t xml:space="preserve">— clears the buffer.</w:t>
+      </w:r>
+    </w:p>
+    <w:p>
+      <w:pPr>
+        <w:pStyle w:val="FirstParagraph"/>
+      </w:pPr>
+      <w:r>
+        <w:t xml:space="preserve">The GUI does</w:t>
+      </w:r>
+      <w:r>
+        <w:t xml:space="preserve"> </w:t>
+      </w:r>
+      <w:r>
+        <w:rPr>
+          <w:bCs/>
+          <w:b/>
+        </w:rPr>
+        <w:t xml:space="preserve">not</w:t>
+      </w:r>
+      <w:r>
+        <w:t xml:space="preserve"> </w:t>
+      </w:r>
+      <w:r>
+        <w:t xml:space="preserve">offer a stage selector. Operators cannot</w:t>
+      </w:r>
+      <w:r>
+        <w:t xml:space="preserve"> </w:t>
+      </w:r>
+      <w:r>
+        <w:t xml:space="preserve">override the OAK’s factory intrinsics or stereo extrinsics from</w:t>
+      </w:r>
+      <w:r>
+        <w:t xml:space="preserve"> </w:t>
+      </w:r>
+      <w:r>
+        <w:t xml:space="preserve">the browser — those are protected behind the CLI flow on the Pi</w:t>
+      </w:r>
+      <w:r>
+        <w:t xml:space="preserve"> </w:t>
+      </w:r>
+      <w:r>
+        <w:t xml:space="preserve">to prevent accidental damage to a working calibration.</w:t>
+      </w:r>
+    </w:p>
+    <w:p>
+      <w:pPr>
+        <w:pStyle w:val="BodyText"/>
+      </w:pPr>
+      <w:r>
+        <w:rPr>
+          <w:bCs/>
+          <w:b/>
+        </w:rPr>
         <w:t xml:space="preserve">Encoder &amp; current debug</w:t>
       </w:r>
       <w:r>
@@ -7809,7 +8151,7 @@
       <w:pPr>
         <w:numPr>
           <w:ilvl w:val="0"/>
-          <w:numId w:val="1024"/>
+          <w:numId w:val="1025"/>
         </w:numPr>
         <w:pStyle w:val="Compact"/>
       </w:pPr>
@@ -7821,7 +8163,7 @@
       <w:pPr>
         <w:numPr>
           <w:ilvl w:val="0"/>
-          <w:numId w:val="1024"/>
+          <w:numId w:val="1025"/>
         </w:numPr>
         <w:pStyle w:val="Compact"/>
       </w:pPr>
@@ -7833,7 +8175,7 @@
       <w:pPr>
         <w:numPr>
           <w:ilvl w:val="0"/>
-          <w:numId w:val="1024"/>
+          <w:numId w:val="1025"/>
         </w:numPr>
         <w:pStyle w:val="Compact"/>
       </w:pPr>
@@ -7845,7 +8187,7 @@
       <w:pPr>
         <w:numPr>
           <w:ilvl w:val="0"/>
-          <w:numId w:val="1024"/>
+          <w:numId w:val="1025"/>
         </w:numPr>
         <w:pStyle w:val="Compact"/>
       </w:pPr>
@@ -7931,7 +8273,7 @@
       <w:pPr>
         <w:numPr>
           <w:ilvl w:val="0"/>
-          <w:numId w:val="1024"/>
+          <w:numId w:val="1025"/>
         </w:numPr>
         <w:pStyle w:val="Compact"/>
       </w:pPr>
@@ -7977,7 +8319,7 @@
       <w:pPr>
         <w:numPr>
           <w:ilvl w:val="0"/>
-          <w:numId w:val="1024"/>
+          <w:numId w:val="1025"/>
         </w:numPr>
         <w:pStyle w:val="Compact"/>
       </w:pPr>
@@ -8011,7 +8353,7 @@
       <w:pPr>
         <w:numPr>
           <w:ilvl w:val="0"/>
-          <w:numId w:val="1024"/>
+          <w:numId w:val="1025"/>
         </w:numPr>
         <w:pStyle w:val="Compact"/>
       </w:pPr>
@@ -8056,7 +8398,7 @@
       <w:pPr>
         <w:numPr>
           <w:ilvl w:val="0"/>
-          <w:numId w:val="1025"/>
+          <w:numId w:val="1026"/>
         </w:numPr>
         <w:pStyle w:val="Compact"/>
       </w:pPr>
@@ -8074,7 +8416,7 @@
       <w:pPr>
         <w:numPr>
           <w:ilvl w:val="0"/>
-          <w:numId w:val="1025"/>
+          <w:numId w:val="1026"/>
         </w:numPr>
         <w:pStyle w:val="Compact"/>
       </w:pPr>
@@ -8104,7 +8446,7 @@
       <w:pPr>
         <w:numPr>
           <w:ilvl w:val="0"/>
-          <w:numId w:val="1025"/>
+          <w:numId w:val="1026"/>
         </w:numPr>
         <w:pStyle w:val="Compact"/>
       </w:pPr>
@@ -8122,7 +8464,7 @@
       <w:pPr>
         <w:numPr>
           <w:ilvl w:val="0"/>
-          <w:numId w:val="1025"/>
+          <w:numId w:val="1026"/>
         </w:numPr>
         <w:pStyle w:val="Compact"/>
       </w:pPr>
@@ -8155,7 +8497,7 @@
       <w:pPr>
         <w:numPr>
           <w:ilvl w:val="0"/>
-          <w:numId w:val="1025"/>
+          <w:numId w:val="1026"/>
         </w:numPr>
         <w:pStyle w:val="Compact"/>
       </w:pPr>
@@ -8188,7 +8530,7 @@
       <w:pPr>
         <w:numPr>
           <w:ilvl w:val="0"/>
-          <w:numId w:val="1025"/>
+          <w:numId w:val="1026"/>
         </w:numPr>
         <w:pStyle w:val="Compact"/>
       </w:pPr>
@@ -8237,7 +8579,7 @@
       <w:pPr>
         <w:numPr>
           <w:ilvl w:val="0"/>
-          <w:numId w:val="1025"/>
+          <w:numId w:val="1026"/>
         </w:numPr>
         <w:pStyle w:val="Compact"/>
       </w:pPr>
@@ -8316,7 +8658,7 @@
       <w:pPr>
         <w:numPr>
           <w:ilvl w:val="0"/>
-          <w:numId w:val="1026"/>
+          <w:numId w:val="1027"/>
         </w:numPr>
         <w:pStyle w:val="Compact"/>
       </w:pPr>
@@ -8350,7 +8692,7 @@
       <w:pPr>
         <w:numPr>
           <w:ilvl w:val="0"/>
-          <w:numId w:val="1026"/>
+          <w:numId w:val="1027"/>
         </w:numPr>
         <w:pStyle w:val="Compact"/>
       </w:pPr>
@@ -8402,7 +8744,7 @@
       <w:pPr>
         <w:numPr>
           <w:ilvl w:val="0"/>
-          <w:numId w:val="1026"/>
+          <w:numId w:val="1027"/>
         </w:numPr>
         <w:pStyle w:val="Compact"/>
       </w:pPr>
@@ -8426,7 +8768,7 @@
       <w:pPr>
         <w:numPr>
           <w:ilvl w:val="0"/>
-          <w:numId w:val="1026"/>
+          <w:numId w:val="1027"/>
         </w:numPr>
         <w:pStyle w:val="Compact"/>
       </w:pPr>
@@ -8465,7 +8807,7 @@
       <w:pPr>
         <w:numPr>
           <w:ilvl w:val="0"/>
-          <w:numId w:val="1026"/>
+          <w:numId w:val="1027"/>
         </w:numPr>
         <w:pStyle w:val="Compact"/>
       </w:pPr>
@@ -8501,7 +8843,7 @@
       <w:pPr>
         <w:numPr>
           <w:ilvl w:val="0"/>
-          <w:numId w:val="1027"/>
+          <w:numId w:val="1028"/>
         </w:numPr>
         <w:pStyle w:val="Compact"/>
       </w:pPr>
@@ -8529,7 +8871,7 @@
       <w:pPr>
         <w:numPr>
           <w:ilvl w:val="0"/>
-          <w:numId w:val="1027"/>
+          <w:numId w:val="1028"/>
         </w:numPr>
         <w:pStyle w:val="Compact"/>
       </w:pPr>
@@ -8541,7 +8883,7 @@
       <w:pPr>
         <w:numPr>
           <w:ilvl w:val="1"/>
-          <w:numId w:val="1028"/>
+          <w:numId w:val="1029"/>
         </w:numPr>
         <w:pStyle w:val="Compact"/>
       </w:pPr>
@@ -8593,7 +8935,7 @@
       <w:pPr>
         <w:numPr>
           <w:ilvl w:val="1"/>
-          <w:numId w:val="1028"/>
+          <w:numId w:val="1029"/>
         </w:numPr>
         <w:pStyle w:val="Compact"/>
       </w:pPr>
@@ -8621,7 +8963,7 @@
       <w:pPr>
         <w:numPr>
           <w:ilvl w:val="0"/>
-          <w:numId w:val="1027"/>
+          <w:numId w:val="1028"/>
         </w:numPr>
         <w:pStyle w:val="Compact"/>
       </w:pPr>
@@ -8645,7 +8987,7 @@
       <w:pPr>
         <w:numPr>
           <w:ilvl w:val="0"/>
-          <w:numId w:val="1027"/>
+          <w:numId w:val="1028"/>
         </w:numPr>
         <w:pStyle w:val="Compact"/>
       </w:pPr>
@@ -8673,7 +9015,7 @@
       <w:pPr>
         <w:numPr>
           <w:ilvl w:val="0"/>
-          <w:numId w:val="1027"/>
+          <w:numId w:val="1028"/>
         </w:numPr>
         <w:pStyle w:val="Compact"/>
       </w:pPr>
@@ -8691,7 +9033,7 @@
       <w:pPr>
         <w:numPr>
           <w:ilvl w:val="0"/>
-          <w:numId w:val="1027"/>
+          <w:numId w:val="1028"/>
         </w:numPr>
         <w:pStyle w:val="Compact"/>
       </w:pPr>
@@ -8725,7 +9067,7 @@
       <w:pPr>
         <w:numPr>
           <w:ilvl w:val="0"/>
-          <w:numId w:val="1027"/>
+          <w:numId w:val="1028"/>
         </w:numPr>
         <w:pStyle w:val="Compact"/>
       </w:pPr>
@@ -8817,7 +9159,7 @@
       <w:pPr>
         <w:numPr>
           <w:ilvl w:val="0"/>
-          <w:numId w:val="1027"/>
+          <w:numId w:val="1028"/>
         </w:numPr>
         <w:pStyle w:val="Compact"/>
       </w:pPr>
@@ -8839,7 +9181,7 @@
       <w:pPr>
         <w:numPr>
           <w:ilvl w:val="0"/>
-          <w:numId w:val="1027"/>
+          <w:numId w:val="1028"/>
         </w:numPr>
         <w:pStyle w:val="Compact"/>
       </w:pPr>
@@ -8888,7 +9230,7 @@
       <w:pPr>
         <w:numPr>
           <w:ilvl w:val="0"/>
-          <w:numId w:val="1027"/>
+          <w:numId w:val="1028"/>
         </w:numPr>
         <w:pStyle w:val="Compact"/>
       </w:pPr>
@@ -8937,7 +9279,7 @@
       <w:pPr>
         <w:numPr>
           <w:ilvl w:val="0"/>
-          <w:numId w:val="1029"/>
+          <w:numId w:val="1030"/>
         </w:numPr>
       </w:pPr>
       <w:r>
@@ -9012,7 +9354,7 @@
       <w:pPr>
         <w:numPr>
           <w:ilvl w:val="0"/>
-          <w:numId w:val="1029"/>
+          <w:numId w:val="1030"/>
         </w:numPr>
       </w:pPr>
       <w:r>
@@ -9135,7 +9477,7 @@
       <w:pPr>
         <w:numPr>
           <w:ilvl w:val="0"/>
-          <w:numId w:val="1029"/>
+          <w:numId w:val="1030"/>
         </w:numPr>
       </w:pPr>
       <w:r>
@@ -9210,7 +9552,7 @@
       <w:pPr>
         <w:numPr>
           <w:ilvl w:val="0"/>
-          <w:numId w:val="1030"/>
+          <w:numId w:val="1031"/>
         </w:numPr>
         <w:pStyle w:val="Compact"/>
       </w:pPr>
@@ -9238,7 +9580,7 @@
       <w:pPr>
         <w:numPr>
           <w:ilvl w:val="0"/>
-          <w:numId w:val="1030"/>
+          <w:numId w:val="1031"/>
         </w:numPr>
         <w:pStyle w:val="Compact"/>
       </w:pPr>
@@ -9322,7 +9664,7 @@
       <w:pPr>
         <w:numPr>
           <w:ilvl w:val="0"/>
-          <w:numId w:val="1031"/>
+          <w:numId w:val="1032"/>
         </w:numPr>
         <w:pStyle w:val="Compact"/>
       </w:pPr>
@@ -9334,7 +9676,7 @@
       <w:pPr>
         <w:numPr>
           <w:ilvl w:val="0"/>
-          <w:numId w:val="1031"/>
+          <w:numId w:val="1032"/>
         </w:numPr>
         <w:pStyle w:val="Compact"/>
       </w:pPr>
@@ -9346,7 +9688,7 @@
       <w:pPr>
         <w:numPr>
           <w:ilvl w:val="0"/>
-          <w:numId w:val="1031"/>
+          <w:numId w:val="1032"/>
         </w:numPr>
         <w:pStyle w:val="Compact"/>
       </w:pPr>
@@ -9358,7 +9700,7 @@
       <w:pPr>
         <w:numPr>
           <w:ilvl w:val="0"/>
-          <w:numId w:val="1031"/>
+          <w:numId w:val="1032"/>
         </w:numPr>
         <w:pStyle w:val="Compact"/>
       </w:pPr>
@@ -9376,7 +9718,7 @@
       <w:pPr>
         <w:numPr>
           <w:ilvl w:val="0"/>
-          <w:numId w:val="1031"/>
+          <w:numId w:val="1032"/>
         </w:numPr>
         <w:pStyle w:val="Compact"/>
       </w:pPr>
@@ -9436,7 +9778,7 @@
       <w:pPr>
         <w:numPr>
           <w:ilvl w:val="0"/>
-          <w:numId w:val="1032"/>
+          <w:numId w:val="1033"/>
         </w:numPr>
         <w:pStyle w:val="Compact"/>
       </w:pPr>
@@ -9448,7 +9790,7 @@
       <w:pPr>
         <w:numPr>
           <w:ilvl w:val="0"/>
-          <w:numId w:val="1032"/>
+          <w:numId w:val="1033"/>
         </w:numPr>
         <w:pStyle w:val="Compact"/>
       </w:pPr>
@@ -9460,7 +9802,7 @@
       <w:pPr>
         <w:numPr>
           <w:ilvl w:val="0"/>
-          <w:numId w:val="1032"/>
+          <w:numId w:val="1033"/>
         </w:numPr>
         <w:pStyle w:val="Compact"/>
       </w:pPr>
@@ -9575,7 +9917,7 @@
       <w:pPr>
         <w:numPr>
           <w:ilvl w:val="0"/>
-          <w:numId w:val="1033"/>
+          <w:numId w:val="1034"/>
         </w:numPr>
         <w:pStyle w:val="Compact"/>
       </w:pPr>
@@ -9650,7 +9992,7 @@
       <w:pPr>
         <w:numPr>
           <w:ilvl w:val="0"/>
-          <w:numId w:val="1033"/>
+          <w:numId w:val="1034"/>
         </w:numPr>
         <w:pStyle w:val="Compact"/>
       </w:pPr>
@@ -9680,7 +10022,7 @@
       <w:pPr>
         <w:numPr>
           <w:ilvl w:val="0"/>
-          <w:numId w:val="1033"/>
+          <w:numId w:val="1034"/>
         </w:numPr>
         <w:pStyle w:val="Compact"/>
       </w:pPr>
@@ -9710,7 +10052,7 @@
       <w:pPr>
         <w:numPr>
           <w:ilvl w:val="0"/>
-          <w:numId w:val="1033"/>
+          <w:numId w:val="1034"/>
         </w:numPr>
         <w:pStyle w:val="Compact"/>
       </w:pPr>
@@ -9728,7 +10070,7 @@
       <w:pPr>
         <w:numPr>
           <w:ilvl w:val="0"/>
-          <w:numId w:val="1033"/>
+          <w:numId w:val="1034"/>
         </w:numPr>
         <w:pStyle w:val="Compact"/>
       </w:pPr>
@@ -10538,13 +10880,13 @@
       </w:tr>
     </w:tbl>
     <w:bookmarkEnd w:id="58"/>
-    <w:bookmarkStart w:id="59" w:name="Xce44ac3575dfe6ca572e2d46ca08522c929c2e4"/>
+    <w:bookmarkStart w:id="59" w:name="X2e5f8ae4d4226bef16aaa053691e71297ceebc2"/>
     <w:p>
       <w:pPr>
         <w:pStyle w:val="Heading3"/>
       </w:pPr>
       <w:r>
-        <w:t xml:space="preserve">Calibration services (Stage A/B/C, called by the GUI)</w:t>
+        <w:t xml:space="preserve">Calibration services (Stage C ONLY — A/B are CLI-only by design)</w:t>
       </w:r>
     </w:p>
     <w:tbl>
@@ -10636,7 +10978,7 @@
               <w:jc w:val="left"/>
             </w:pPr>
             <w:r>
-              <w:t xml:space="preserve">One frame per click; rejects bad poses.</w:t>
+              <w:t xml:space="preserve">One frame per click; rejects frames with &lt; 3 ArUco markers visible.</w:t>
             </w:r>
           </w:p>
         </w:tc>
@@ -10677,7 +11019,34 @@
               <w:jc w:val="left"/>
             </w:pPr>
             <w:r>
-              <w:t xml:space="preserve">Runs the OpenCV solver, writes YAML if gates pass.</w:t>
+              <w:t xml:space="preserve">Runs</w:t>
+            </w:r>
+            <w:r>
+              <w:t xml:space="preserve"> </w:t>
+            </w:r>
+            <w:r>
+              <w:rPr>
+                <w:rStyle w:val="VerbatimChar"/>
+              </w:rPr>
+              <w:t xml:space="preserve">cv2.aruco.estimatePoseBoard</w:t>
+            </w:r>
+            <w:r>
+              <w:t xml:space="preserve">, writes</w:t>
+            </w:r>
+            <w:r>
+              <w:t xml:space="preserve"> </w:t>
+            </w:r>
+            <w:r>
+              <w:rPr>
+                <w:rStyle w:val="VerbatimChar"/>
+              </w:rPr>
+              <w:t xml:space="preserve">oak_extrinsics.yaml</w:t>
+            </w:r>
+            <w:r>
+              <w:t xml:space="preserve"> </w:t>
+            </w:r>
+            <w:r>
+              <w:t xml:space="preserve">if reprojection error &lt; 2 px.</w:t>
             </w:r>
           </w:p>
         </w:tc>
@@ -10723,48 +11092,43 @@
           </w:p>
         </w:tc>
       </w:tr>
-      <w:tr>
-        <w:tc>
-          <w:tcPr/>
-          <w:p>
-            <w:pPr>
-              <w:pStyle w:val="Compact"/>
-              <w:jc w:val="left"/>
-            </w:pPr>
-            <w:r>
-              <w:rPr>
-                <w:rStyle w:val="VerbatimChar"/>
-              </w:rPr>
-              <w:t xml:space="preserve">/calibrate/stage</w:t>
-            </w:r>
-          </w:p>
-        </w:tc>
-        <w:tc>
-          <w:tcPr/>
-          <w:p>
-            <w:pPr>
-              <w:pStyle w:val="Compact"/>
-              <w:jc w:val="left"/>
-            </w:pPr>
-            <w:r>
-              <w:t xml:space="preserve">std_srvs/SetBool style or custom</w:t>
-            </w:r>
-          </w:p>
-        </w:tc>
-        <w:tc>
-          <w:tcPr/>
-          <w:p>
-            <w:pPr>
-              <w:pStyle w:val="Compact"/>
-              <w:jc w:val="left"/>
-            </w:pPr>
-            <w:r>
-              <w:t xml:space="preserve">Select A / B / C.</w:t>
-            </w:r>
-          </w:p>
-        </w:tc>
-      </w:tr>
     </w:tbl>
+    <w:p>
+      <w:pPr>
+        <w:pStyle w:val="BodyText"/>
+      </w:pPr>
+      <w:r>
+        <w:t xml:space="preserve">There is</w:t>
+      </w:r>
+      <w:r>
+        <w:t xml:space="preserve"> </w:t>
+      </w:r>
+      <w:r>
+        <w:rPr>
+          <w:bCs/>
+          <w:b/>
+        </w:rPr>
+        <w:t xml:space="preserve">no</w:t>
+      </w:r>
+      <w:r>
+        <w:t xml:space="preserve"> </w:t>
+      </w:r>
+      <w:r>
+        <w:t xml:space="preserve">stage selector service. Stages A/B (custom intrinsics</w:t>
+      </w:r>
+      <w:r>
+        <w:t xml:space="preserve"> </w:t>
+      </w:r>
+      <w:r>
+        <w:t xml:space="preserve">and stereo recalibration) override the OAK’s factory tuning and</w:t>
+      </w:r>
+      <w:r>
+        <w:t xml:space="preserve"> </w:t>
+      </w:r>
+      <w:r>
+        <w:t xml:space="preserve">therefore live behind the CLI only — see §6 for the rationale.</w:t>
+      </w:r>
+    </w:p>
     <w:bookmarkEnd w:id="59"/>
     <w:bookmarkStart w:id="60" w:name="new-control_cmd-payloads-existing-topic"/>
     <w:p>
@@ -10823,7 +11187,7 @@
       <w:pPr>
         <w:numPr>
           <w:ilvl w:val="0"/>
-          <w:numId w:val="1034"/>
+          <w:numId w:val="1035"/>
         </w:numPr>
         <w:pStyle w:val="Compact"/>
       </w:pPr>
@@ -10838,7 +11202,7 @@
       <w:pPr>
         <w:numPr>
           <w:ilvl w:val="0"/>
-          <w:numId w:val="1034"/>
+          <w:numId w:val="1035"/>
         </w:numPr>
         <w:pStyle w:val="Compact"/>
       </w:pPr>
@@ -10859,7 +11223,7 @@
       <w:pPr>
         <w:numPr>
           <w:ilvl w:val="0"/>
-          <w:numId w:val="1034"/>
+          <w:numId w:val="1035"/>
         </w:numPr>
         <w:pStyle w:val="Compact"/>
       </w:pPr>
@@ -10880,7 +11244,7 @@
       <w:pPr>
         <w:numPr>
           <w:ilvl w:val="0"/>
-          <w:numId w:val="1034"/>
+          <w:numId w:val="1035"/>
         </w:numPr>
         <w:pStyle w:val="Compact"/>
       </w:pPr>
@@ -10901,7 +11265,7 @@
       <w:pPr>
         <w:numPr>
           <w:ilvl w:val="0"/>
-          <w:numId w:val="1034"/>
+          <w:numId w:val="1035"/>
         </w:numPr>
         <w:pStyle w:val="Compact"/>
       </w:pPr>
@@ -10993,7 +11357,7 @@
       <w:pPr>
         <w:numPr>
           <w:ilvl w:val="0"/>
-          <w:numId w:val="1035"/>
+          <w:numId w:val="1036"/>
         </w:numPr>
         <w:pStyle w:val="Compact"/>
       </w:pPr>
@@ -11887,7 +12251,7 @@
       <w:pPr>
         <w:numPr>
           <w:ilvl w:val="0"/>
-          <w:numId w:val="1036"/>
+          <w:numId w:val="1037"/>
         </w:numPr>
         <w:pStyle w:val="Compact"/>
       </w:pPr>
@@ -11905,7 +12269,7 @@
       <w:pPr>
         <w:numPr>
           <w:ilvl w:val="0"/>
-          <w:numId w:val="1036"/>
+          <w:numId w:val="1037"/>
         </w:numPr>
         <w:pStyle w:val="Compact"/>
       </w:pPr>
@@ -11917,7 +12281,7 @@
       <w:pPr>
         <w:numPr>
           <w:ilvl w:val="0"/>
-          <w:numId w:val="1036"/>
+          <w:numId w:val="1037"/>
         </w:numPr>
         <w:pStyle w:val="Compact"/>
       </w:pPr>
@@ -11929,7 +12293,7 @@
       <w:pPr>
         <w:numPr>
           <w:ilvl w:val="0"/>
-          <w:numId w:val="1036"/>
+          <w:numId w:val="1037"/>
         </w:numPr>
         <w:pStyle w:val="Compact"/>
       </w:pPr>
@@ -11941,7 +12305,7 @@
       <w:pPr>
         <w:numPr>
           <w:ilvl w:val="0"/>
-          <w:numId w:val="1036"/>
+          <w:numId w:val="1037"/>
         </w:numPr>
         <w:pStyle w:val="Compact"/>
       </w:pPr>
@@ -11962,7 +12326,7 @@
       <w:pPr>
         <w:numPr>
           <w:ilvl w:val="0"/>
-          <w:numId w:val="1036"/>
+          <w:numId w:val="1037"/>
         </w:numPr>
         <w:pStyle w:val="Compact"/>
       </w:pPr>
@@ -11974,7 +12338,7 @@
       <w:pPr>
         <w:numPr>
           <w:ilvl w:val="0"/>
-          <w:numId w:val="1036"/>
+          <w:numId w:val="1037"/>
         </w:numPr>
         <w:pStyle w:val="Compact"/>
       </w:pPr>
@@ -12074,7 +12438,7 @@
       <w:pPr>
         <w:numPr>
           <w:ilvl w:val="0"/>
-          <w:numId w:val="1037"/>
+          <w:numId w:val="1038"/>
         </w:numPr>
         <w:pStyle w:val="Compact"/>
       </w:pPr>
@@ -12092,7 +12456,7 @@
       <w:pPr>
         <w:numPr>
           <w:ilvl w:val="0"/>
-          <w:numId w:val="1037"/>
+          <w:numId w:val="1038"/>
         </w:numPr>
         <w:pStyle w:val="Compact"/>
       </w:pPr>
@@ -12104,7 +12468,7 @@
       <w:pPr>
         <w:numPr>
           <w:ilvl w:val="0"/>
-          <w:numId w:val="1037"/>
+          <w:numId w:val="1038"/>
         </w:numPr>
         <w:pStyle w:val="Compact"/>
       </w:pPr>
@@ -12122,7 +12486,7 @@
       <w:pPr>
         <w:numPr>
           <w:ilvl w:val="0"/>
-          <w:numId w:val="1037"/>
+          <w:numId w:val="1038"/>
         </w:numPr>
         <w:pStyle w:val="Compact"/>
       </w:pPr>
@@ -12134,7 +12498,7 @@
       <w:pPr>
         <w:numPr>
           <w:ilvl w:val="0"/>
-          <w:numId w:val="1037"/>
+          <w:numId w:val="1038"/>
         </w:numPr>
         <w:pStyle w:val="Compact"/>
       </w:pPr>
@@ -12263,7 +12627,7 @@
       <w:pPr>
         <w:numPr>
           <w:ilvl w:val="0"/>
-          <w:numId w:val="1038"/>
+          <w:numId w:val="1039"/>
         </w:numPr>
         <w:pStyle w:val="Compact"/>
       </w:pPr>
@@ -12281,7 +12645,7 @@
       <w:pPr>
         <w:numPr>
           <w:ilvl w:val="0"/>
-          <w:numId w:val="1038"/>
+          <w:numId w:val="1039"/>
         </w:numPr>
         <w:pStyle w:val="Compact"/>
       </w:pPr>
@@ -12293,7 +12657,7 @@
       <w:pPr>
         <w:numPr>
           <w:ilvl w:val="0"/>
-          <w:numId w:val="1038"/>
+          <w:numId w:val="1039"/>
         </w:numPr>
         <w:pStyle w:val="Compact"/>
       </w:pPr>
@@ -12311,7 +12675,7 @@
       <w:pPr>
         <w:numPr>
           <w:ilvl w:val="0"/>
-          <w:numId w:val="1038"/>
+          <w:numId w:val="1039"/>
         </w:numPr>
         <w:pStyle w:val="Compact"/>
       </w:pPr>
@@ -12329,7 +12693,7 @@
       <w:pPr>
         <w:numPr>
           <w:ilvl w:val="0"/>
-          <w:numId w:val="1038"/>
+          <w:numId w:val="1039"/>
         </w:numPr>
         <w:pStyle w:val="Compact"/>
       </w:pPr>
@@ -12398,7 +12762,7 @@
       <w:pPr>
         <w:numPr>
           <w:ilvl w:val="0"/>
-          <w:numId w:val="1039"/>
+          <w:numId w:val="1040"/>
         </w:numPr>
         <w:pStyle w:val="Compact"/>
       </w:pPr>
@@ -12416,7 +12780,7 @@
       <w:pPr>
         <w:numPr>
           <w:ilvl w:val="0"/>
-          <w:numId w:val="1039"/>
+          <w:numId w:val="1040"/>
         </w:numPr>
         <w:pStyle w:val="Compact"/>
       </w:pPr>
@@ -12440,7 +12804,7 @@
       <w:pPr>
         <w:numPr>
           <w:ilvl w:val="0"/>
-          <w:numId w:val="1039"/>
+          <w:numId w:val="1040"/>
         </w:numPr>
         <w:pStyle w:val="Compact"/>
       </w:pPr>
@@ -12452,55 +12816,55 @@
       <w:pPr>
         <w:numPr>
           <w:ilvl w:val="1"/>
+          <w:numId w:val="1041"/>
+        </w:numPr>
+        <w:pStyle w:val="Compact"/>
+      </w:pPr>
+      <w:r>
+        <w:t xml:space="preserve">mean error vs truth (mm)</w:t>
+      </w:r>
+    </w:p>
+    <w:p>
+      <w:pPr>
+        <w:numPr>
+          <w:ilvl w:val="1"/>
+          <w:numId w:val="1041"/>
+        </w:numPr>
+        <w:pStyle w:val="Compact"/>
+      </w:pPr>
+      <w:r>
+        <w:t xml:space="preserve">RMS error vs truth (mm)</w:t>
+      </w:r>
+    </w:p>
+    <w:p>
+      <w:pPr>
+        <w:numPr>
+          <w:ilvl w:val="1"/>
+          <w:numId w:val="1041"/>
+        </w:numPr>
+        <w:pStyle w:val="Compact"/>
+      </w:pPr>
+      <w:r>
+        <w:t xml:space="preserve">95th-percentile error (mm)</w:t>
+      </w:r>
+    </w:p>
+    <w:p>
+      <w:pPr>
+        <w:numPr>
+          <w:ilvl w:val="1"/>
+          <w:numId w:val="1041"/>
+        </w:numPr>
+        <w:pStyle w:val="Compact"/>
+      </w:pPr>
+      <w:r>
+        <w:t xml:space="preserve">frames where the method produced no estimate (failure rate)</w:t>
+      </w:r>
+    </w:p>
+    <w:p>
+      <w:pPr>
+        <w:numPr>
+          <w:ilvl w:val="0"/>
           <w:numId w:val="1040"/>
-        </w:numPr>
-        <w:pStyle w:val="Compact"/>
-      </w:pPr>
-      <w:r>
-        <w:t xml:space="preserve">mean error vs truth (mm)</w:t>
-      </w:r>
-    </w:p>
-    <w:p>
-      <w:pPr>
-        <w:numPr>
-          <w:ilvl w:val="1"/>
-          <w:numId w:val="1040"/>
-        </w:numPr>
-        <w:pStyle w:val="Compact"/>
-      </w:pPr>
-      <w:r>
-        <w:t xml:space="preserve">RMS error vs truth (mm)</w:t>
-      </w:r>
-    </w:p>
-    <w:p>
-      <w:pPr>
-        <w:numPr>
-          <w:ilvl w:val="1"/>
-          <w:numId w:val="1040"/>
-        </w:numPr>
-        <w:pStyle w:val="Compact"/>
-      </w:pPr>
-      <w:r>
-        <w:t xml:space="preserve">95th-percentile error (mm)</w:t>
-      </w:r>
-    </w:p>
-    <w:p>
-      <w:pPr>
-        <w:numPr>
-          <w:ilvl w:val="1"/>
-          <w:numId w:val="1040"/>
-        </w:numPr>
-        <w:pStyle w:val="Compact"/>
-      </w:pPr>
-      <w:r>
-        <w:t xml:space="preserve">frames where the method produced no estimate (failure rate)</w:t>
-      </w:r>
-    </w:p>
-    <w:p>
-      <w:pPr>
-        <w:numPr>
-          <w:ilvl w:val="0"/>
-          <w:numId w:val="1039"/>
         </w:numPr>
         <w:pStyle w:val="Compact"/>
       </w:pPr>
@@ -12783,7 +13147,7 @@
       <w:pPr>
         <w:numPr>
           <w:ilvl w:val="0"/>
-          <w:numId w:val="1041"/>
+          <w:numId w:val="1042"/>
         </w:numPr>
         <w:pStyle w:val="Compact"/>
       </w:pPr>
@@ -12818,7 +13182,7 @@
       <w:pPr>
         <w:numPr>
           <w:ilvl w:val="0"/>
-          <w:numId w:val="1041"/>
+          <w:numId w:val="1042"/>
         </w:numPr>
         <w:pStyle w:val="Compact"/>
       </w:pPr>
@@ -12853,7 +13217,7 @@
       <w:pPr>
         <w:numPr>
           <w:ilvl w:val="0"/>
-          <w:numId w:val="1041"/>
+          <w:numId w:val="1042"/>
         </w:numPr>
         <w:pStyle w:val="Compact"/>
       </w:pPr>
@@ -13011,7 +13375,7 @@
       <w:pPr>
         <w:numPr>
           <w:ilvl w:val="0"/>
-          <w:numId w:val="1042"/>
+          <w:numId w:val="1043"/>
         </w:numPr>
         <w:pStyle w:val="Compact"/>
       </w:pPr>
@@ -13039,7 +13403,7 @@
       <w:pPr>
         <w:numPr>
           <w:ilvl w:val="0"/>
-          <w:numId w:val="1042"/>
+          <w:numId w:val="1043"/>
         </w:numPr>
         <w:pStyle w:val="Compact"/>
       </w:pPr>
@@ -13082,7 +13446,7 @@
       <w:pPr>
         <w:numPr>
           <w:ilvl w:val="0"/>
-          <w:numId w:val="1042"/>
+          <w:numId w:val="1043"/>
         </w:numPr>
         <w:pStyle w:val="Compact"/>
       </w:pPr>
@@ -13140,7 +13504,7 @@
       <w:pPr>
         <w:numPr>
           <w:ilvl w:val="0"/>
-          <w:numId w:val="1042"/>
+          <w:numId w:val="1043"/>
         </w:numPr>
         <w:pStyle w:val="Compact"/>
       </w:pPr>
@@ -13189,7 +13553,7 @@
       <w:pPr>
         <w:numPr>
           <w:ilvl w:val="0"/>
-          <w:numId w:val="1042"/>
+          <w:numId w:val="1043"/>
         </w:numPr>
         <w:pStyle w:val="Compact"/>
       </w:pPr>
@@ -13241,7 +13605,7 @@
       <w:pPr>
         <w:numPr>
           <w:ilvl w:val="0"/>
-          <w:numId w:val="1042"/>
+          <w:numId w:val="1043"/>
         </w:numPr>
         <w:pStyle w:val="Compact"/>
       </w:pPr>
@@ -13293,7 +13657,7 @@
       <w:pPr>
         <w:numPr>
           <w:ilvl w:val="0"/>
-          <w:numId w:val="1042"/>
+          <w:numId w:val="1043"/>
         </w:numPr>
         <w:pStyle w:val="Compact"/>
       </w:pPr>
@@ -13342,7 +13706,7 @@
       <w:pPr>
         <w:numPr>
           <w:ilvl w:val="0"/>
-          <w:numId w:val="1042"/>
+          <w:numId w:val="1043"/>
         </w:numPr>
         <w:pStyle w:val="Compact"/>
       </w:pPr>
@@ -13379,7 +13743,7 @@
       <w:pPr>
         <w:numPr>
           <w:ilvl w:val="0"/>
-          <w:numId w:val="1042"/>
+          <w:numId w:val="1043"/>
         </w:numPr>
         <w:pStyle w:val="Compact"/>
       </w:pPr>
@@ -13428,7 +13792,7 @@
       <w:pPr>
         <w:numPr>
           <w:ilvl w:val="0"/>
-          <w:numId w:val="1042"/>
+          <w:numId w:val="1043"/>
         </w:numPr>
         <w:pStyle w:val="Compact"/>
       </w:pPr>
@@ -13462,7 +13826,7 @@
       <w:pPr>
         <w:numPr>
           <w:ilvl w:val="0"/>
-          <w:numId w:val="1042"/>
+          <w:numId w:val="1043"/>
         </w:numPr>
         <w:pStyle w:val="Compact"/>
       </w:pPr>
@@ -13490,7 +13854,7 @@
       <w:pPr>
         <w:numPr>
           <w:ilvl w:val="0"/>
-          <w:numId w:val="1042"/>
+          <w:numId w:val="1043"/>
         </w:numPr>
         <w:pStyle w:val="Compact"/>
       </w:pPr>
@@ -13518,7 +13882,7 @@
       <w:pPr>
         <w:numPr>
           <w:ilvl w:val="0"/>
-          <w:numId w:val="1042"/>
+          <w:numId w:val="1043"/>
         </w:numPr>
         <w:pStyle w:val="Compact"/>
       </w:pPr>
@@ -13552,7 +13916,7 @@
       <w:pPr>
         <w:numPr>
           <w:ilvl w:val="0"/>
-          <w:numId w:val="1042"/>
+          <w:numId w:val="1043"/>
         </w:numPr>
         <w:pStyle w:val="Compact"/>
       </w:pPr>
@@ -13580,7 +13944,7 @@
       <w:pPr>
         <w:numPr>
           <w:ilvl w:val="0"/>
-          <w:numId w:val="1042"/>
+          <w:numId w:val="1043"/>
         </w:numPr>
         <w:pStyle w:val="Compact"/>
       </w:pPr>
@@ -13608,7 +13972,7 @@
       <w:pPr>
         <w:numPr>
           <w:ilvl w:val="0"/>
-          <w:numId w:val="1042"/>
+          <w:numId w:val="1043"/>
         </w:numPr>
         <w:pStyle w:val="Compact"/>
       </w:pPr>
@@ -13636,7 +14000,7 @@
       <w:pPr>
         <w:numPr>
           <w:ilvl w:val="0"/>
-          <w:numId w:val="1042"/>
+          <w:numId w:val="1043"/>
         </w:numPr>
         <w:pStyle w:val="Compact"/>
       </w:pPr>
@@ -13676,7 +14040,7 @@
       <w:pPr>
         <w:numPr>
           <w:ilvl w:val="0"/>
-          <w:numId w:val="1042"/>
+          <w:numId w:val="1043"/>
         </w:numPr>
         <w:pStyle w:val="Compact"/>
       </w:pPr>
@@ -13734,7 +14098,7 @@
       <w:pPr>
         <w:numPr>
           <w:ilvl w:val="0"/>
-          <w:numId w:val="1042"/>
+          <w:numId w:val="1043"/>
         </w:numPr>
         <w:pStyle w:val="Compact"/>
       </w:pPr>
@@ -13783,7 +14147,7 @@
       <w:pPr>
         <w:numPr>
           <w:ilvl w:val="0"/>
-          <w:numId w:val="1042"/>
+          <w:numId w:val="1043"/>
         </w:numPr>
         <w:pStyle w:val="Compact"/>
       </w:pPr>
@@ -13827,7 +14191,7 @@
       </w:r>
     </w:p>
     <w:bookmarkEnd w:id="71"/>
-    <w:bookmarkStart w:id="76" w:name="open-questions"/>
+    <w:bookmarkStart w:id="77" w:name="open-questions"/>
     <w:p>
       <w:pPr>
         <w:pStyle w:val="Heading2"/>
@@ -15424,12 +15788,192 @@
       </w:tr>
     </w:tbl>
     <w:bookmarkEnd w:id="74"/>
-    <w:bookmarkStart w:id="75" w:name="still-open"/>
+    <w:bookmarkStart w:id="75" w:name="resolved-in-v7-2026-04-26"/>
     <w:p>
       <w:pPr>
         <w:pStyle w:val="Heading3"/>
       </w:pPr>
       <w:r>
+        <w:t xml:space="preserve">Resolved in v7 (2026-04-26)</w:t>
+      </w:r>
+    </w:p>
+    <w:tbl>
+      <w:tblPr>
+        <w:tblStyle w:val="Table"/>
+        <w:tblW w:type="pct" w:w="5000"/>
+        <w:tblLook w:firstRow="1" w:lastRow="0" w:firstColumn="0" w:lastColumn="0" w:noHBand="0" w:noVBand="0" w:val="0020"/>
+        <w:jc w:val="start"/>
+      </w:tblPr>
+      <w:tblGrid>
+        <w:gridCol w:w="2640"/>
+        <w:gridCol w:w="2640"/>
+        <w:gridCol w:w="2640"/>
+      </w:tblGrid>
+      <w:tr>
+        <w:trPr>
+          <w:tblHeader w:val="true"/>
+        </w:trPr>
+        <w:tc>
+          <w:tcPr/>
+          <w:p>
+            <w:pPr>
+              <w:pStyle w:val="Compact"/>
+              <w:jc w:val="left"/>
+            </w:pPr>
+            <w:r>
+              <w:t xml:space="preserve">#</w:t>
+            </w:r>
+          </w:p>
+        </w:tc>
+        <w:tc>
+          <w:tcPr/>
+          <w:p>
+            <w:pPr>
+              <w:pStyle w:val="Compact"/>
+              <w:jc w:val="left"/>
+            </w:pPr>
+            <w:r>
+              <w:t xml:space="preserve">Question</w:t>
+            </w:r>
+          </w:p>
+        </w:tc>
+        <w:tc>
+          <w:tcPr/>
+          <w:p>
+            <w:pPr>
+              <w:pStyle w:val="Compact"/>
+              <w:jc w:val="left"/>
+            </w:pPr>
+            <w:r>
+              <w:t xml:space="preserve">Decision</w:t>
+            </w:r>
+          </w:p>
+        </w:tc>
+      </w:tr>
+      <w:tr>
+        <w:tc>
+          <w:tcPr/>
+          <w:p>
+            <w:pPr>
+              <w:pStyle w:val="Compact"/>
+              <w:jc w:val="left"/>
+            </w:pPr>
+            <w:r>
+              <w:t xml:space="preserve">Q36</w:t>
+            </w:r>
+          </w:p>
+        </w:tc>
+        <w:tc>
+          <w:tcPr/>
+          <w:p>
+            <w:pPr>
+              <w:pStyle w:val="Compact"/>
+              <w:jc w:val="left"/>
+            </w:pPr>
+            <w:r>
+              <w:t xml:space="preserve">GUI calibration scope</w:t>
+            </w:r>
+          </w:p>
+        </w:tc>
+        <w:tc>
+          <w:tcPr/>
+          <w:p>
+            <w:pPr>
+              <w:pStyle w:val="Compact"/>
+              <w:jc w:val="left"/>
+            </w:pPr>
+            <w:r>
+              <w:t xml:space="preserve">Stage C ONLY (camera-to-world ArUco ring). Stages A/B never reachable from the GUI — they override factory tuning and live behind the CLI flow on the Pi to prevent operator misclicks.</w:t>
+            </w:r>
+          </w:p>
+        </w:tc>
+      </w:tr>
+      <w:tr>
+        <w:tc>
+          <w:tcPr/>
+          <w:p>
+            <w:pPr>
+              <w:pStyle w:val="Compact"/>
+              <w:jc w:val="left"/>
+            </w:pPr>
+            <w:r>
+              <w:t xml:space="preserve">Q37</w:t>
+            </w:r>
+          </w:p>
+        </w:tc>
+        <w:tc>
+          <w:tcPr/>
+          <w:p>
+            <w:pPr>
+              <w:pStyle w:val="Compact"/>
+              <w:jc w:val="left"/>
+            </w:pPr>
+            <w:r>
+              <w:t xml:space="preserve">Existing</w:t>
+            </w:r>
+            <w:r>
+              <w:t xml:space="preserve"> </w:t>
+            </w:r>
+            <w:r>
+              <w:rPr>
+                <w:rStyle w:val="VerbatimChar"/>
+              </w:rPr>
+              <w:t xml:space="preserve">web/index.html</w:t>
+            </w:r>
+            <w:r>
+              <w:t xml:space="preserve"> </w:t>
+            </w:r>
+            <w:r>
+              <w:t xml:space="preserve">layout</w:t>
+            </w:r>
+          </w:p>
+        </w:tc>
+        <w:tc>
+          <w:tcPr/>
+          <w:p>
+            <w:pPr>
+              <w:pStyle w:val="Compact"/>
+              <w:jc w:val="left"/>
+            </w:pPr>
+            <w:r>
+              <w:t xml:space="preserve">Already three-column (</w:t>
+            </w:r>
+            <w:r>
+              <w:rPr>
+                <w:rStyle w:val="VerbatimChar"/>
+              </w:rPr>
+              <w:t xml:space="preserve">lg:grid-cols-3</w:t>
+            </w:r>
+            <w:r>
+              <w:t xml:space="preserve">); the vision work</w:t>
+            </w:r>
+            <w:r>
+              <w:t xml:space="preserve"> </w:t>
+            </w:r>
+            <w:r>
+              <w:rPr>
+                <w:iCs/>
+                <w:i/>
+              </w:rPr>
+              <w:t xml:space="preserve">adds panels into</w:t>
+            </w:r>
+            <w:r>
+              <w:t xml:space="preserve"> </w:t>
+            </w:r>
+            <w:r>
+              <w:t xml:space="preserve">the existing structure rather than restructuring.</w:t>
+            </w:r>
+          </w:p>
+        </w:tc>
+      </w:tr>
+    </w:tbl>
+    <w:bookmarkEnd w:id="75"/>
+    <w:bookmarkStart w:id="76" w:name="still-open"/>
+    <w:p>
+      <w:pPr>
+        <w:pStyle w:val="Heading3"/>
+      </w:pPr>
+      <w:r>
         <w:t xml:space="preserve">Still open</w:t>
       </w:r>
     </w:p>
@@ -15438,7 +15982,7 @@
         <w:pStyle w:val="FirstParagraph"/>
       </w:pPr>
       <w:r>
-        <w:t xml:space="preserve">None — spec locked at v6 (2026-04-26).</w:t>
+        <w:t xml:space="preserve">None — spec locked at v7 (2026-04-26).</w:t>
       </w:r>
     </w:p>
     <w:p>
@@ -15448,9 +15992,9 @@
         </w:pict>
       </w:r>
     </w:p>
-    <w:bookmarkEnd w:id="75"/>
     <w:bookmarkEnd w:id="76"/>
-    <w:bookmarkStart w:id="77" w:name="references"/>
+    <w:bookmarkEnd w:id="77"/>
+    <w:bookmarkStart w:id="78" w:name="references"/>
     <w:p>
       <w:pPr>
         <w:pStyle w:val="Heading2"/>
@@ -15463,7 +16007,7 @@
       <w:pPr>
         <w:numPr>
           <w:ilvl w:val="0"/>
-          <w:numId w:val="1043"/>
+          <w:numId w:val="1044"/>
         </w:numPr>
         <w:pStyle w:val="Compact"/>
       </w:pPr>
@@ -15490,7 +16034,7 @@
       <w:pPr>
         <w:numPr>
           <w:ilvl w:val="0"/>
-          <w:numId w:val="1043"/>
+          <w:numId w:val="1044"/>
         </w:numPr>
         <w:pStyle w:val="Compact"/>
       </w:pPr>
@@ -15511,7 +16055,7 @@
       <w:pPr>
         <w:numPr>
           <w:ilvl w:val="0"/>
-          <w:numId w:val="1043"/>
+          <w:numId w:val="1044"/>
         </w:numPr>
         <w:pStyle w:val="Compact"/>
       </w:pPr>
@@ -15550,7 +16094,7 @@
       <w:pPr>
         <w:numPr>
           <w:ilvl w:val="0"/>
-          <w:numId w:val="1043"/>
+          <w:numId w:val="1044"/>
         </w:numPr>
         <w:pStyle w:val="Compact"/>
       </w:pPr>
@@ -15577,7 +16121,7 @@
       <w:pPr>
         <w:numPr>
           <w:ilvl w:val="0"/>
-          <w:numId w:val="1043"/>
+          <w:numId w:val="1044"/>
         </w:numPr>
         <w:pStyle w:val="Compact"/>
       </w:pPr>
@@ -15604,7 +16148,7 @@
       <w:pPr>
         <w:numPr>
           <w:ilvl w:val="0"/>
-          <w:numId w:val="1043"/>
+          <w:numId w:val="1044"/>
         </w:numPr>
         <w:pStyle w:val="Compact"/>
       </w:pPr>
@@ -15628,7 +16172,7 @@
       <w:pPr>
         <w:numPr>
           <w:ilvl w:val="0"/>
-          <w:numId w:val="1043"/>
+          <w:numId w:val="1044"/>
         </w:numPr>
         <w:pStyle w:val="Compact"/>
       </w:pPr>
@@ -15646,7 +16190,7 @@
       <w:pPr>
         <w:numPr>
           <w:ilvl w:val="0"/>
-          <w:numId w:val="1043"/>
+          <w:numId w:val="1044"/>
         </w:numPr>
         <w:pStyle w:val="Compact"/>
       </w:pPr>
@@ -15658,7 +16202,7 @@
       <w:pPr>
         <w:numPr>
           <w:ilvl w:val="0"/>
-          <w:numId w:val="1043"/>
+          <w:numId w:val="1044"/>
         </w:numPr>
         <w:pStyle w:val="Compact"/>
       </w:pPr>
@@ -15742,7 +16286,7 @@
       <w:pPr>
         <w:numPr>
           <w:ilvl w:val="0"/>
-          <w:numId w:val="1043"/>
+          <w:numId w:val="1044"/>
         </w:numPr>
         <w:pStyle w:val="Compact"/>
       </w:pPr>
@@ -15750,8 +16294,8 @@
         <w:t xml:space="preserve">Luxonis DepthAI documentation (OAK-D-PRO-AF pipeline).</w:t>
       </w:r>
     </w:p>
-    <w:bookmarkEnd w:id="77"/>
     <w:bookmarkEnd w:id="78"/>
+    <w:bookmarkEnd w:id="79"/>
     <w:sectPr/>
   </w:body>
 </w:document>
@@ -16038,34 +16582,7 @@
     <w:abstractNumId w:val="991"/>
   </w:num>
   <w:num w:numId="1006">
-    <w:abstractNumId w:val="99411"/>
-    <w:lvlOverride w:ilvl="0">
-      <w:startOverride w:val="1"/>
-    </w:lvlOverride>
-    <w:lvlOverride w:ilvl="1">
-      <w:startOverride w:val="1"/>
-    </w:lvlOverride>
-    <w:lvlOverride w:ilvl="2">
-      <w:startOverride w:val="1"/>
-    </w:lvlOverride>
-    <w:lvlOverride w:ilvl="3">
-      <w:startOverride w:val="1"/>
-    </w:lvlOverride>
-    <w:lvlOverride w:ilvl="4">
-      <w:startOverride w:val="1"/>
-    </w:lvlOverride>
-    <w:lvlOverride w:ilvl="5">
-      <w:startOverride w:val="1"/>
-    </w:lvlOverride>
-    <w:lvlOverride w:ilvl="6">
-      <w:startOverride w:val="1"/>
-    </w:lvlOverride>
-    <w:lvlOverride w:ilvl="7">
-      <w:startOverride w:val="1"/>
-    </w:lvlOverride>
-    <w:lvlOverride w:ilvl="8">
-      <w:startOverride w:val="1"/>
-    </w:lvlOverride>
+    <w:abstractNumId w:val="991"/>
   </w:num>
   <w:num w:numId="1007">
     <w:abstractNumId w:val="99411"/>
@@ -16188,9 +16705,6 @@
     </w:lvlOverride>
   </w:num>
   <w:num w:numId="1011">
-    <w:abstractNumId w:val="991"/>
-  </w:num>
-  <w:num w:numId="1012">
     <w:abstractNumId w:val="99411"/>
     <w:lvlOverride w:ilvl="0">
       <w:startOverride w:val="1"/>
@@ -16220,19 +16734,10 @@
       <w:startOverride w:val="1"/>
     </w:lvlOverride>
   </w:num>
-  <w:num w:numId="1013">
+  <w:num w:numId="1012">
     <w:abstractNumId w:val="991"/>
   </w:num>
-  <w:num w:numId="1014">
-    <w:abstractNumId w:val="991"/>
-  </w:num>
-  <w:num w:numId="1015">
-    <w:abstractNumId w:val="991"/>
-  </w:num>
-  <w:num w:numId="1016">
-    <w:abstractNumId w:val="991"/>
-  </w:num>
-  <w:num w:numId="1017">
+  <w:num w:numId="1013">
     <w:abstractNumId w:val="99411"/>
     <w:lvlOverride w:ilvl="0">
       <w:startOverride w:val="1"/>
@@ -16262,8 +16767,47 @@
       <w:startOverride w:val="1"/>
     </w:lvlOverride>
   </w:num>
+  <w:num w:numId="1014">
+    <w:abstractNumId w:val="991"/>
+  </w:num>
+  <w:num w:numId="1015">
+    <w:abstractNumId w:val="991"/>
+  </w:num>
+  <w:num w:numId="1016">
+    <w:abstractNumId w:val="991"/>
+  </w:num>
+  <w:num w:numId="1017">
+    <w:abstractNumId w:val="991"/>
+  </w:num>
   <w:num w:numId="1018">
-    <w:abstractNumId w:val="991"/>
+    <w:abstractNumId w:val="99411"/>
+    <w:lvlOverride w:ilvl="0">
+      <w:startOverride w:val="1"/>
+    </w:lvlOverride>
+    <w:lvlOverride w:ilvl="1">
+      <w:startOverride w:val="1"/>
+    </w:lvlOverride>
+    <w:lvlOverride w:ilvl="2">
+      <w:startOverride w:val="1"/>
+    </w:lvlOverride>
+    <w:lvlOverride w:ilvl="3">
+      <w:startOverride w:val="1"/>
+    </w:lvlOverride>
+    <w:lvlOverride w:ilvl="4">
+      <w:startOverride w:val="1"/>
+    </w:lvlOverride>
+    <w:lvlOverride w:ilvl="5">
+      <w:startOverride w:val="1"/>
+    </w:lvlOverride>
+    <w:lvlOverride w:ilvl="6">
+      <w:startOverride w:val="1"/>
+    </w:lvlOverride>
+    <w:lvlOverride w:ilvl="7">
+      <w:startOverride w:val="1"/>
+    </w:lvlOverride>
+    <w:lvlOverride w:ilvl="8">
+      <w:startOverride w:val="1"/>
+    </w:lvlOverride>
   </w:num>
   <w:num w:numId="1019">
     <w:abstractNumId w:val="991"/>
@@ -16332,34 +16876,7 @@
     <w:abstractNumId w:val="991"/>
   </w:num>
   <w:num w:numId="1041">
-    <w:abstractNumId w:val="99411"/>
-    <w:lvlOverride w:ilvl="0">
-      <w:startOverride w:val="1"/>
-    </w:lvlOverride>
-    <w:lvlOverride w:ilvl="1">
-      <w:startOverride w:val="1"/>
-    </w:lvlOverride>
-    <w:lvlOverride w:ilvl="2">
-      <w:startOverride w:val="1"/>
-    </w:lvlOverride>
-    <w:lvlOverride w:ilvl="3">
-      <w:startOverride w:val="1"/>
-    </w:lvlOverride>
-    <w:lvlOverride w:ilvl="4">
-      <w:startOverride w:val="1"/>
-    </w:lvlOverride>
-    <w:lvlOverride w:ilvl="5">
-      <w:startOverride w:val="1"/>
-    </w:lvlOverride>
-    <w:lvlOverride w:ilvl="6">
-      <w:startOverride w:val="1"/>
-    </w:lvlOverride>
-    <w:lvlOverride w:ilvl="7">
-      <w:startOverride w:val="1"/>
-    </w:lvlOverride>
-    <w:lvlOverride w:ilvl="8">
-      <w:startOverride w:val="1"/>
-    </w:lvlOverride>
+    <w:abstractNumId w:val="991"/>
   </w:num>
   <w:num w:numId="1042">
     <w:abstractNumId w:val="99411"/>
@@ -16392,6 +16909,36 @@
     </w:lvlOverride>
   </w:num>
   <w:num w:numId="1043">
+    <w:abstractNumId w:val="99411"/>
+    <w:lvlOverride w:ilvl="0">
+      <w:startOverride w:val="1"/>
+    </w:lvlOverride>
+    <w:lvlOverride w:ilvl="1">
+      <w:startOverride w:val="1"/>
+    </w:lvlOverride>
+    <w:lvlOverride w:ilvl="2">
+      <w:startOverride w:val="1"/>
+    </w:lvlOverride>
+    <w:lvlOverride w:ilvl="3">
+      <w:startOverride w:val="1"/>
+    </w:lvlOverride>
+    <w:lvlOverride w:ilvl="4">
+      <w:startOverride w:val="1"/>
+    </w:lvlOverride>
+    <w:lvlOverride w:ilvl="5">
+      <w:startOverride w:val="1"/>
+    </w:lvlOverride>
+    <w:lvlOverride w:ilvl="6">
+      <w:startOverride w:val="1"/>
+    </w:lvlOverride>
+    <w:lvlOverride w:ilvl="7">
+      <w:startOverride w:val="1"/>
+    </w:lvlOverride>
+    <w:lvlOverride w:ilvl="8">
+      <w:startOverride w:val="1"/>
+    </w:lvlOverride>
+  </w:num>
+  <w:num w:numId="1044">
     <w:abstractNumId w:val="991"/>
   </w:num>
 </w:numbering>

</xml_diff>

<commit_message>
v8: Auto-record rosbag2 bags on every demo run
New bag_recorder_node listens to /control_cmd for mode transitions
and runs `ros2 bag record` as a managed subprocess for every
BALL_TRACK_* demo. Bags land in ~/stable_bot_bags/ with timestamped
names like 20260426T103015Z_trajectory.bag.

Default topic allowlist is small messages only (~3 MB/min). Image
topics are opt-in via `record_images:on` on /control_cmd to keep
routine bags small; the GUI will expose this as a per-demo
checkbox once the index.html additions land.

Off-platform watchdog firing during a recording renames the bag
with a `_fault` suffix on close, so faulty runs are easy to filter
for post-mortems. Clean SIGINT shutdown so rosbag2 flushes mcap
properly.

Spec §13.6 documents the design + plotter integration. Q41–Q43
also locked in (Vision Debug placement, single shared SVG with
color-coded active panel, soft interlock between demos).

Co-Authored-By: Claude Opus 4.7 (1M context) <noreply@anthropic.com>
</commit_message>
<xml_diff>
--- a/stewart_bringup/docs/closed_loop_ball_demos.docx
+++ b/stewart_bringup/docs/closed_loop_ball_demos.docx
@@ -2,7 +2,7 @@
 <file path=word/document.xml><?xml version="1.0" encoding="utf-8"?>
 <w:document xmlns:w="http://schemas.openxmlformats.org/wordprocessingml/2006/main" xmlns:m="http://schemas.openxmlformats.org/officeDocument/2006/math" xmlns:r="http://schemas.openxmlformats.org/officeDocument/2006/relationships" xmlns:o="urn:schemas-microsoft-com:office:office" xmlns:v="urn:schemas-microsoft-com:vml" xmlns:w10="urn:schemas-microsoft-com:office:word" xmlns:a="http://schemas.openxmlformats.org/drawingml/2006/main" xmlns:pic="http://schemas.openxmlformats.org/drawingml/2006/picture" xmlns:wp="http://schemas.openxmlformats.org/drawingml/2006/wordprocessingDrawing">
   <w:body>
-    <w:bookmarkStart w:id="79" w:name="Xf2ecee67e627b13c32e3c15bfc4ce569ecb8d6b"/>
+    <w:bookmarkStart w:id="88" w:name="Xf2ecee67e627b13c32e3c15bfc4ce569ecb8d6b"/>
     <w:p>
       <w:pPr>
         <w:pStyle w:val="Heading1"/>
@@ -86,34 +86,25 @@
         <w:t xml:space="preserve"> </w:t>
       </w:r>
       <w:r>
-        <w:t xml:space="preserve">2026-04-26 (v7 — GUI calibration button is Stage C</w:t>
-      </w:r>
-      <w:r>
-        <w:t xml:space="preserve"> </w:t>
-      </w:r>
-      <w:r>
-        <w:t xml:space="preserve">only; Stages A/B are CLI-only to prevent operators accidentally</w:t>
-      </w:r>
-      <w:r>
-        <w:t xml:space="preserve"> </w:t>
-      </w:r>
-      <w:r>
-        <w:t xml:space="preserve">overriding factory tuning; clarified that the existing</w:t>
-      </w:r>
-      <w:r>
-        <w:t xml:space="preserve"> </w:t>
-      </w:r>
-      <w:r>
-        <w:rPr>
-          <w:rStyle w:val="VerbatimChar"/>
-        </w:rPr>
-        <w:t xml:space="preserve">web/index.html</w:t>
-      </w:r>
-      <w:r>
-        <w:t xml:space="preserve"> </w:t>
-      </w:r>
-      <w:r>
-        <w:t xml:space="preserve">is already three-column).</w:t>
+        <w:t xml:space="preserve">2026-04-26 (v8 — bag recording subsystem added;</w:t>
+      </w:r>
+      <w:r>
+        <w:t xml:space="preserve"> </w:t>
+      </w:r>
+      <w:r>
+        <w:t xml:space="preserve">auto-record on every demo Start, fault-tag bags when the off-platform</w:t>
+      </w:r>
+      <w:r>
+        <w:t xml:space="preserve"> </w:t>
+      </w:r>
+      <w:r>
+        <w:t xml:space="preserve">watchdog fires; image topics opt-in; closes the loop with the demo</w:t>
+      </w:r>
+      <w:r>
+        <w:t xml:space="preserve"> </w:t>
+      </w:r>
+      <w:r>
+        <w:t xml:space="preserve">plotter).</w:t>
       </w:r>
     </w:p>
     <w:p>
@@ -11756,7 +11747,7 @@
       </w:r>
     </w:p>
     <w:bookmarkEnd w:id="63"/>
-    <w:bookmarkStart w:id="70" w:name="Xab5fe00024443e1d01ff6f38864e58097c4fe3f"/>
+    <w:bookmarkStart w:id="69" w:name="Xab5fe00024443e1d01ff6f38864e58097c4fe3f"/>
     <w:p>
       <w:pPr>
         <w:pStyle w:val="Heading2"/>
@@ -12953,7 +12944,977 @@
       </w:r>
     </w:p>
     <w:bookmarkEnd w:id="68"/>
-    <w:bookmarkStart w:id="69" w:name="plotter-interface"/>
+    <w:bookmarkEnd w:id="69"/>
+    <w:bookmarkStart w:id="78" w:name="bag-recording-added-v8"/>
+    <w:p>
+      <w:pPr>
+        <w:pStyle w:val="Heading2"/>
+      </w:pPr>
+      <w:r>
+        <w:t xml:space="preserve">13.6 Bag recording (added v8)</w:t>
+      </w:r>
+    </w:p>
+    <w:p>
+      <w:pPr>
+        <w:pStyle w:val="FirstParagraph"/>
+      </w:pPr>
+      <w:r>
+        <w:t xml:space="preserve">Every demo run automatically produces a rosbag2 bag for offline</w:t>
+      </w:r>
+      <w:r>
+        <w:t xml:space="preserve"> </w:t>
+      </w:r>
+      <w:r>
+        <w:t xml:space="preserve">analysis, plotter consumption, regression testing, and</w:t>
+      </w:r>
+      <w:r>
+        <w:t xml:space="preserve"> </w:t>
+      </w:r>
+      <w:r>
+        <w:t xml:space="preserve">reproducibility.</w:t>
+      </w:r>
+      <w:r>
+        <w:t xml:space="preserve"> </w:t>
+      </w:r>
+      <w:r>
+        <w:rPr>
+          <w:rStyle w:val="VerbatimChar"/>
+        </w:rPr>
+        <w:t xml:space="preserve">bag_recorder_node</w:t>
+      </w:r>
+      <w:r>
+        <w:t xml:space="preserve"> </w:t>
+      </w:r>
+      <w:r>
+        <w:t xml:space="preserve">(in</w:t>
+      </w:r>
+      <w:r>
+        <w:t xml:space="preserve"> </w:t>
+      </w:r>
+      <w:r>
+        <w:rPr>
+          <w:rStyle w:val="VerbatimChar"/>
+        </w:rPr>
+        <w:t xml:space="preserve">stewart_vision</w:t>
+      </w:r>
+      <w:r>
+        <w:t xml:space="preserve">) listens</w:t>
+      </w:r>
+      <w:r>
+        <w:t xml:space="preserve"> </w:t>
+      </w:r>
+      <w:r>
+        <w:t xml:space="preserve">to</w:t>
+      </w:r>
+      <w:r>
+        <w:t xml:space="preserve"> </w:t>
+      </w:r>
+      <w:r>
+        <w:rPr>
+          <w:rStyle w:val="VerbatimChar"/>
+        </w:rPr>
+        <w:t xml:space="preserve">/control_cmd</w:t>
+      </w:r>
+      <w:r>
+        <w:t xml:space="preserve"> </w:t>
+      </w:r>
+      <w:r>
+        <w:t xml:space="preserve">for mode transitions and runs</w:t>
+      </w:r>
+      <w:r>
+        <w:t xml:space="preserve"> </w:t>
+      </w:r>
+      <w:r>
+        <w:rPr>
+          <w:rStyle w:val="VerbatimChar"/>
+        </w:rPr>
+        <w:t xml:space="preserve">ros2 bag record</w:t>
+      </w:r>
+      <w:r>
+        <w:t xml:space="preserve"> </w:t>
+      </w:r>
+      <w:r>
+        <w:t xml:space="preserve">as a managed subprocess.</w:t>
+      </w:r>
+    </w:p>
+    <w:bookmarkStart w:id="70" w:name="trigger"/>
+    <w:p>
+      <w:pPr>
+        <w:pStyle w:val="Heading3"/>
+      </w:pPr>
+      <w:r>
+        <w:t xml:space="preserve">Trigger</w:t>
+      </w:r>
+    </w:p>
+    <w:tbl>
+      <w:tblPr>
+        <w:tblStyle w:val="Table"/>
+        <w:tblW w:type="pct" w:w="5000"/>
+        <w:tblLook w:firstRow="1" w:lastRow="0" w:firstColumn="0" w:lastColumn="0" w:noHBand="0" w:noVBand="0" w:val="0020"/>
+        <w:jc w:val="start"/>
+      </w:tblPr>
+      <w:tblGrid>
+        <w:gridCol w:w="3960"/>
+        <w:gridCol w:w="3960"/>
+      </w:tblGrid>
+      <w:tr>
+        <w:trPr>
+          <w:tblHeader w:val="true"/>
+        </w:trPr>
+        <w:tc>
+          <w:tcPr/>
+          <w:p>
+            <w:pPr>
+              <w:pStyle w:val="Compact"/>
+              <w:jc w:val="left"/>
+            </w:pPr>
+            <w:r>
+              <w:t xml:space="preserve">Transition</w:t>
+            </w:r>
+          </w:p>
+        </w:tc>
+        <w:tc>
+          <w:tcPr/>
+          <w:p>
+            <w:pPr>
+              <w:pStyle w:val="Compact"/>
+              <w:jc w:val="left"/>
+            </w:pPr>
+            <w:r>
+              <w:t xml:space="preserve">Action</w:t>
+            </w:r>
+          </w:p>
+        </w:tc>
+      </w:tr>
+      <w:tr>
+        <w:tc>
+          <w:tcPr/>
+          <w:p>
+            <w:pPr>
+              <w:pStyle w:val="Compact"/>
+              <w:jc w:val="left"/>
+            </w:pPr>
+            <w:r>
+              <w:rPr>
+                <w:rStyle w:val="VerbatimChar"/>
+              </w:rPr>
+              <w:t xml:space="preserve">LEVEL_HOLD</w:t>
+            </w:r>
+            <w:r>
+              <w:t xml:space="preserve"> </w:t>
+            </w:r>
+            <w:r>
+              <w:t xml:space="preserve">→</w:t>
+            </w:r>
+            <w:r>
+              <w:t xml:space="preserve"> </w:t>
+            </w:r>
+            <w:r>
+              <w:rPr>
+                <w:rStyle w:val="VerbatimChar"/>
+              </w:rPr>
+              <w:t xml:space="preserve">BALL_TRACK_*</w:t>
+            </w:r>
+          </w:p>
+        </w:tc>
+        <w:tc>
+          <w:tcPr/>
+          <w:p>
+            <w:pPr>
+              <w:pStyle w:val="Compact"/>
+              <w:jc w:val="left"/>
+            </w:pPr>
+            <w:r>
+              <w:t xml:space="preserve">Start recording on a fixed topic allowlist.</w:t>
+            </w:r>
+          </w:p>
+        </w:tc>
+      </w:tr>
+      <w:tr>
+        <w:tc>
+          <w:tcPr/>
+          <w:p>
+            <w:pPr>
+              <w:pStyle w:val="Compact"/>
+              <w:jc w:val="left"/>
+            </w:pPr>
+            <w:r>
+              <w:rPr>
+                <w:rStyle w:val="VerbatimChar"/>
+              </w:rPr>
+              <w:t xml:space="preserve">BALL_TRACK_*</w:t>
+            </w:r>
+            <w:r>
+              <w:t xml:space="preserve"> </w:t>
+            </w:r>
+            <w:r>
+              <w:t xml:space="preserve">→</w:t>
+            </w:r>
+            <w:r>
+              <w:t xml:space="preserve"> </w:t>
+            </w:r>
+            <w:r>
+              <w:rPr>
+                <w:rStyle w:val="VerbatimChar"/>
+              </w:rPr>
+              <w:t xml:space="preserve">LEVEL_HOLD</w:t>
+            </w:r>
+          </w:p>
+        </w:tc>
+        <w:tc>
+          <w:tcPr/>
+          <w:p>
+            <w:pPr>
+              <w:pStyle w:val="Compact"/>
+              <w:jc w:val="left"/>
+            </w:pPr>
+            <w:r>
+              <w:t xml:space="preserve">SIGINT the recorder so rosbag2 flushes cleanly.</w:t>
+            </w:r>
+          </w:p>
+        </w:tc>
+      </w:tr>
+      <w:tr>
+        <w:tc>
+          <w:tcPr/>
+          <w:p>
+            <w:pPr>
+              <w:pStyle w:val="Compact"/>
+              <w:jc w:val="left"/>
+            </w:pPr>
+            <w:r>
+              <w:t xml:space="preserve">Off-platform watchdog fires during a recording</w:t>
+            </w:r>
+          </w:p>
+        </w:tc>
+        <w:tc>
+          <w:tcPr/>
+          <w:p>
+            <w:pPr>
+              <w:pStyle w:val="Compact"/>
+              <w:jc w:val="left"/>
+            </w:pPr>
+            <w:r>
+              <w:t xml:space="preserve">Bag is renamed with a</w:t>
+            </w:r>
+            <w:r>
+              <w:t xml:space="preserve"> </w:t>
+            </w:r>
+            <w:r>
+              <w:rPr>
+                <w:rStyle w:val="VerbatimChar"/>
+              </w:rPr>
+              <w:t xml:space="preserve">_fault</w:t>
+            </w:r>
+            <w:r>
+              <w:t xml:space="preserve"> </w:t>
+            </w:r>
+            <w:r>
+              <w:t xml:space="preserve">suffix on close so faulty runs are easy to filter for the post-mortem.</w:t>
+            </w:r>
+          </w:p>
+        </w:tc>
+      </w:tr>
+    </w:tbl>
+    <w:bookmarkEnd w:id="70"/>
+    <w:bookmarkStart w:id="71" w:name="Xea9fff3764218f0a2985ec7ef07d3b758e08ae0"/>
+    <w:p>
+      <w:pPr>
+        <w:pStyle w:val="Heading3"/>
+      </w:pPr>
+      <w:r>
+        <w:t xml:space="preserve">Topic allowlist (default — small messages only)</w:t>
+      </w:r>
+    </w:p>
+    <w:p>
+      <w:pPr>
+        <w:pStyle w:val="SourceCode"/>
+      </w:pPr>
+      <w:r>
+        <w:rPr>
+          <w:rStyle w:val="VerbatimChar"/>
+        </w:rPr>
+        <w:t xml:space="preserve">/encoders, /platform_rpy, /imu/data, /odrive_errors,</w:t>
+      </w:r>
+      <w:r>
+        <w:br/>
+      </w:r>
+      <w:r>
+        <w:rPr>
+          <w:rStyle w:val="VerbatimChar"/>
+        </w:rPr>
+        <w:t xml:space="preserve">/control_cmd, /control_result,</w:t>
+      </w:r>
+      <w:r>
+        <w:br/>
+      </w:r>
+      <w:r>
+        <w:rPr>
+          <w:rStyle w:val="VerbatimChar"/>
+        </w:rPr>
+        <w:t xml:space="preserve">/platform_pose, /platform_pose/markers_visible,</w:t>
+      </w:r>
+      <w:r>
+        <w:br/>
+      </w:r>
+      <w:r>
+        <w:rPr>
+          <w:rStyle w:val="VerbatimChar"/>
+        </w:rPr>
+        <w:t xml:space="preserve">/ball_state, /ball_state/cov, /ball_ref,</w:t>
+      </w:r>
+      <w:r>
+        <w:br/>
+      </w:r>
+      <w:r>
+        <w:rPr>
+          <w:rStyle w:val="VerbatimChar"/>
+        </w:rPr>
+        <w:t xml:space="preserve">/ball_xy_oak, /ball_xy_mono, /ball_xy_stereo,</w:t>
+      </w:r>
+      <w:r>
+        <w:br/>
+      </w:r>
+      <w:r>
+        <w:rPr>
+          <w:rStyle w:val="VerbatimChar"/>
+        </w:rPr>
+        <w:t xml:space="preserve">/method_comparison,</w:t>
+      </w:r>
+      <w:r>
+        <w:br/>
+      </w:r>
+      <w:r>
+        <w:rPr>
+          <w:rStyle w:val="VerbatimChar"/>
+        </w:rPr>
+        <w:t xml:space="preserve">/oak/ball/diagnostic, /oak/ball/v0/rgb_pixel, /oak/ball/v0/diagnostic,</w:t>
+      </w:r>
+      <w:r>
+        <w:br/>
+      </w:r>
+      <w:r>
+        <w:rPr>
+          <w:rStyle w:val="VerbatimChar"/>
+        </w:rPr>
+        <w:t xml:space="preserve">/oak/ball/v1/rgb_pixel,</w:t>
+      </w:r>
+      <w:r>
+        <w:br/>
+      </w:r>
+      <w:r>
+        <w:rPr>
+          <w:rStyle w:val="VerbatimChar"/>
+        </w:rPr>
+        <w:t xml:space="preserve">/ball_path/active</w:t>
+      </w:r>
+    </w:p>
+    <w:p>
+      <w:pPr>
+        <w:pStyle w:val="FirstParagraph"/>
+      </w:pPr>
+      <w:r>
+        <w:t xml:space="preserve">Total bandwidth: typically &lt; 50 KB/s = &lt; 3 MB / minute.</w:t>
+      </w:r>
+    </w:p>
+    <w:bookmarkEnd w:id="71"/>
+    <w:bookmarkStart w:id="72" w:name="image-recording-opt-in"/>
+    <w:p>
+      <w:pPr>
+        <w:pStyle w:val="Heading3"/>
+      </w:pPr>
+      <w:r>
+        <w:t xml:space="preserve">Image-recording opt-in</w:t>
+      </w:r>
+    </w:p>
+    <w:p>
+      <w:pPr>
+        <w:pStyle w:val="FirstParagraph"/>
+      </w:pPr>
+      <w:r>
+        <w:t xml:space="preserve">Image topics (~50 MB/min) are excluded by default. When a run is</w:t>
+      </w:r>
+      <w:r>
+        <w:t xml:space="preserve"> </w:t>
+      </w:r>
+      <w:r>
+        <w:t xml:space="preserve">going into the formal report and you need raw frames, publish</w:t>
+      </w:r>
+      <w:r>
+        <w:t xml:space="preserve"> </w:t>
+      </w:r>
+      <w:r>
+        <w:rPr>
+          <w:rStyle w:val="VerbatimChar"/>
+        </w:rPr>
+        <w:t xml:space="preserve">record_images:on</w:t>
+      </w:r>
+      <w:r>
+        <w:t xml:space="preserve"> </w:t>
+      </w:r>
+      <w:r>
+        <w:t xml:space="preserve">to</w:t>
+      </w:r>
+      <w:r>
+        <w:t xml:space="preserve"> </w:t>
+      </w:r>
+      <w:r>
+        <w:rPr>
+          <w:rStyle w:val="VerbatimChar"/>
+        </w:rPr>
+        <w:t xml:space="preserve">/control_cmd</w:t>
+      </w:r>
+      <w:r>
+        <w:t xml:space="preserve"> </w:t>
+      </w:r>
+      <w:r>
+        <w:t xml:space="preserve">BEFORE starting the demo. The</w:t>
+      </w:r>
+      <w:r>
+        <w:t xml:space="preserve"> </w:t>
+      </w:r>
+      <w:r>
+        <w:t xml:space="preserve">toggle persists until you publish</w:t>
+      </w:r>
+      <w:r>
+        <w:t xml:space="preserve"> </w:t>
+      </w:r>
+      <w:r>
+        <w:rPr>
+          <w:rStyle w:val="VerbatimChar"/>
+        </w:rPr>
+        <w:t xml:space="preserve">record_images:off</w:t>
+      </w:r>
+      <w:r>
+        <w:t xml:space="preserve"> </w:t>
+      </w:r>
+      <w:r>
+        <w:t xml:space="preserve">or restart</w:t>
+      </w:r>
+      <w:r>
+        <w:t xml:space="preserve"> </w:t>
+      </w:r>
+      <w:r>
+        <w:t xml:space="preserve">the node. The GUI will surface this as a checkbox in each demo</w:t>
+      </w:r>
+      <w:r>
+        <w:t xml:space="preserve"> </w:t>
+      </w:r>
+      <w:r>
+        <w:t xml:space="preserve">panel.</w:t>
+      </w:r>
+    </w:p>
+    <w:p>
+      <w:pPr>
+        <w:pStyle w:val="BodyText"/>
+      </w:pPr>
+      <w:r>
+        <w:t xml:space="preserve">Topics added when image recording is on:</w:t>
+      </w:r>
+    </w:p>
+    <w:p>
+      <w:pPr>
+        <w:pStyle w:val="SourceCode"/>
+      </w:pPr>
+      <w:r>
+        <w:rPr>
+          <w:rStyle w:val="VerbatimChar"/>
+        </w:rPr>
+        <w:t xml:space="preserve">/oak/rgb/image_compressed, /oak/left/image_compressed,</w:t>
+      </w:r>
+      <w:r>
+        <w:br/>
+      </w:r>
+      <w:r>
+        <w:rPr>
+          <w:rStyle w:val="VerbatimChar"/>
+        </w:rPr>
+        <w:t xml:space="preserve">/oak/right/image_compressed, /oak/disparity_compressed</w:t>
+      </w:r>
+    </w:p>
+    <w:bookmarkEnd w:id="72"/>
+    <w:bookmarkStart w:id="73" w:name="storage"/>
+    <w:p>
+      <w:pPr>
+        <w:pStyle w:val="Heading3"/>
+      </w:pPr>
+      <w:r>
+        <w:t xml:space="preserve">Storage</w:t>
+      </w:r>
+    </w:p>
+    <w:p>
+      <w:pPr>
+        <w:pStyle w:val="FirstParagraph"/>
+      </w:pPr>
+      <w:r>
+        <w:t xml:space="preserve">Bags land in</w:t>
+      </w:r>
+      <w:r>
+        <w:t xml:space="preserve"> </w:t>
+      </w:r>
+      <w:r>
+        <w:rPr>
+          <w:rStyle w:val="VerbatimChar"/>
+        </w:rPr>
+        <w:t xml:space="preserve">~/stable_bot_bags/</w:t>
+      </w:r>
+      <w:r>
+        <w:t xml:space="preserve"> </w:t>
+      </w:r>
+      <w:r>
+        <w:t xml:space="preserve">on the Pi:</w:t>
+      </w:r>
+    </w:p>
+    <w:p>
+      <w:pPr>
+        <w:pStyle w:val="SourceCode"/>
+      </w:pPr>
+      <w:r>
+        <w:rPr>
+          <w:rStyle w:val="VerbatimChar"/>
+        </w:rPr>
+        <w:t xml:space="preserve">~/stable_bot_bags/</w:t>
+      </w:r>
+      <w:r>
+        <w:br/>
+      </w:r>
+      <w:r>
+        <w:rPr>
+          <w:rStyle w:val="VerbatimChar"/>
+        </w:rPr>
+        <w:t xml:space="preserve">  20260426T103015Z_trajectory.bag/        # Demo 1</w:t>
+      </w:r>
+      <w:r>
+        <w:br/>
+      </w:r>
+      <w:r>
+        <w:rPr>
+          <w:rStyle w:val="VerbatimChar"/>
+        </w:rPr>
+        <w:t xml:space="preserve">  20260426T103420Z_goto.bag/              # Demo 2</w:t>
+      </w:r>
+      <w:r>
+        <w:br/>
+      </w:r>
+      <w:r>
+        <w:rPr>
+          <w:rStyle w:val="VerbatimChar"/>
+        </w:rPr>
+        <w:t xml:space="preserve">  20260426T103820Z_path.bag/              # Demo 3</w:t>
+      </w:r>
+      <w:r>
+        <w:br/>
+      </w:r>
+      <w:r>
+        <w:rPr>
+          <w:rStyle w:val="VerbatimChar"/>
+        </w:rPr>
+        <w:t xml:space="preserve">  20260426T104235Z_goto_fault.bag/        # ball fell off mid-demo</w:t>
+      </w:r>
+    </w:p>
+    <w:p>
+      <w:pPr>
+        <w:pStyle w:val="FirstParagraph"/>
+      </w:pPr>
+      <w:r>
+        <w:rPr>
+          <w:rStyle w:val="VerbatimChar"/>
+        </w:rPr>
+        <w:t xml:space="preserve">mcap</w:t>
+      </w:r>
+      <w:r>
+        <w:t xml:space="preserve"> </w:t>
+      </w:r>
+      <w:r>
+        <w:t xml:space="preserve">storage format (modern rosbag2 default; better random-access</w:t>
+      </w:r>
+      <w:r>
+        <w:t xml:space="preserve"> </w:t>
+      </w:r>
+      <w:r>
+        <w:t xml:space="preserve">seeking and smaller than sqlite3 for our schema). The plotter</w:t>
+      </w:r>
+      <w:r>
+        <w:t xml:space="preserve"> </w:t>
+      </w:r>
+      <w:r>
+        <w:t xml:space="preserve">(§13.5) opens these directly.</w:t>
+      </w:r>
+    </w:p>
+    <w:bookmarkEnd w:id="73"/>
+    <w:bookmarkStart w:id="74" w:name="disk-usage-and-rotation"/>
+    <w:p>
+      <w:pPr>
+        <w:pStyle w:val="Heading3"/>
+      </w:pPr>
+      <w:r>
+        <w:t xml:space="preserve">Disk usage and rotation</w:t>
+      </w:r>
+    </w:p>
+    <w:p>
+      <w:pPr>
+        <w:pStyle w:val="FirstParagraph"/>
+      </w:pPr>
+      <w:r>
+        <w:t xml:space="preserve">A typical demo run is 10–60 seconds. Without images, bags are</w:t>
+      </w:r>
+      <w:r>
+        <w:t xml:space="preserve"> </w:t>
+      </w:r>
+      <w:r>
+        <w:t xml:space="preserve">~1–3 MB each. The Pi has a 32 GB+ SD card, so even 1000 demo runs</w:t>
+      </w:r>
+      <w:r>
+        <w:t xml:space="preserve"> </w:t>
+      </w:r>
+      <w:r>
+        <w:t xml:space="preserve">fits comfortably without rotation.</w:t>
+      </w:r>
+      <w:r>
+        <w:t xml:space="preserve"> </w:t>
+      </w:r>
+      <w:r>
+        <w:rPr>
+          <w:bCs/>
+          <w:b/>
+        </w:rPr>
+        <w:t xml:space="preserve">No automatic deletion</w:t>
+      </w:r>
+      <w:r>
+        <w:t xml:space="preserve"> </w:t>
+      </w:r>
+      <w:r>
+        <w:t xml:space="preserve">— the</w:t>
+      </w:r>
+      <w:r>
+        <w:t xml:space="preserve"> </w:t>
+      </w:r>
+      <w:r>
+        <w:t xml:space="preserve">operator clears</w:t>
+      </w:r>
+      <w:r>
+        <w:t xml:space="preserve"> </w:t>
+      </w:r>
+      <w:r>
+        <w:rPr>
+          <w:rStyle w:val="VerbatimChar"/>
+        </w:rPr>
+        <w:t xml:space="preserve">~/stable_bot_bags/</w:t>
+      </w:r>
+      <w:r>
+        <w:t xml:space="preserve"> </w:t>
+      </w:r>
+      <w:r>
+        <w:t xml:space="preserve">manually when needed. (We</w:t>
+      </w:r>
+      <w:r>
+        <w:t xml:space="preserve"> </w:t>
+      </w:r>
+      <w:r>
+        <w:t xml:space="preserve">don’t want a</w:t>
+      </w:r>
+      <w:r>
+        <w:t xml:space="preserve"> </w:t>
+      </w:r>
+      <w:r>
+        <w:t xml:space="preserve">“</w:t>
+      </w:r>
+      <w:r>
+        <w:t xml:space="preserve">we lost the great demo run</w:t>
+      </w:r>
+      <w:r>
+        <w:t xml:space="preserve">”</w:t>
+      </w:r>
+      <w:r>
+        <w:t xml:space="preserve"> </w:t>
+      </w:r>
+      <w:r>
+        <w:t xml:space="preserve">footgun from a too-eager</w:t>
+      </w:r>
+      <w:r>
+        <w:t xml:space="preserve"> </w:t>
+      </w:r>
+      <w:r>
+        <w:t xml:space="preserve">auto-rotate.)</w:t>
+      </w:r>
+    </w:p>
+    <w:bookmarkEnd w:id="74"/>
+    <w:bookmarkStart w:id="75" w:name="plotter-consumption"/>
+    <w:p>
+      <w:pPr>
+        <w:pStyle w:val="Heading3"/>
+      </w:pPr>
+      <w:r>
+        <w:t xml:space="preserve">Plotter consumption</w:t>
+      </w:r>
+    </w:p>
+    <w:p>
+      <w:pPr>
+        <w:pStyle w:val="SourceCode"/>
+      </w:pPr>
+      <w:r>
+        <w:rPr>
+          <w:rStyle w:val="CommentTok"/>
+        </w:rPr>
+        <w:t xml:space="preserve"># On the Pi, after a run:</w:t>
+      </w:r>
+      <w:r>
+        <w:br/>
+      </w:r>
+      <w:r>
+        <w:rPr>
+          <w:rStyle w:val="ExtensionTok"/>
+        </w:rPr>
+        <w:t xml:space="preserve">ros2</w:t>
+      </w:r>
+      <w:r>
+        <w:rPr>
+          <w:rStyle w:val="NormalTok"/>
+        </w:rPr>
+        <w:t xml:space="preserve"> run stewart_vision plot_demo_run </w:t>
+      </w:r>
+      <w:r>
+        <w:rPr>
+          <w:rStyle w:val="DataTypeTok"/>
+        </w:rPr>
+        <w:t xml:space="preserve">\</w:t>
+      </w:r>
+      <w:r>
+        <w:br/>
+      </w:r>
+      <w:r>
+        <w:rPr>
+          <w:rStyle w:val="NormalTok"/>
+        </w:rPr>
+        <w:t xml:space="preserve">    </w:t>
+      </w:r>
+      <w:r>
+        <w:rPr>
+          <w:rStyle w:val="AttributeTok"/>
+        </w:rPr>
+        <w:t xml:space="preserve">--bag</w:t>
+      </w:r>
+      <w:r>
+        <w:rPr>
+          <w:rStyle w:val="NormalTok"/>
+        </w:rPr>
+        <w:t xml:space="preserve"> ~/stable_bot_bags/20260426T103015Z_trajectory.bag </w:t>
+      </w:r>
+      <w:r>
+        <w:rPr>
+          <w:rStyle w:val="DataTypeTok"/>
+        </w:rPr>
+        <w:t xml:space="preserve">\</w:t>
+      </w:r>
+      <w:r>
+        <w:br/>
+      </w:r>
+      <w:r>
+        <w:rPr>
+          <w:rStyle w:val="NormalTok"/>
+        </w:rPr>
+        <w:t xml:space="preserve">    </w:t>
+      </w:r>
+      <w:r>
+        <w:rPr>
+          <w:rStyle w:val="AttributeTok"/>
+        </w:rPr>
+        <w:t xml:space="preserve">--demo</w:t>
+      </w:r>
+      <w:r>
+        <w:rPr>
+          <w:rStyle w:val="NormalTok"/>
+        </w:rPr>
+        <w:t xml:space="preserve"> 1 </w:t>
+      </w:r>
+      <w:r>
+        <w:rPr>
+          <w:rStyle w:val="DataTypeTok"/>
+        </w:rPr>
+        <w:t xml:space="preserve">\</w:t>
+      </w:r>
+      <w:r>
+        <w:br/>
+      </w:r>
+      <w:r>
+        <w:rPr>
+          <w:rStyle w:val="NormalTok"/>
+        </w:rPr>
+        <w:t xml:space="preserve">    </w:t>
+      </w:r>
+      <w:r>
+        <w:rPr>
+          <w:rStyle w:val="AttributeTok"/>
+        </w:rPr>
+        <w:t xml:space="preserve">--out</w:t>
+      </w:r>
+      <w:r>
+        <w:rPr>
+          <w:rStyle w:val="NormalTok"/>
+        </w:rPr>
+        <w:t xml:space="preserve"> ~/stable_bot_reports/20260426T103015Z/</w:t>
+      </w:r>
+    </w:p>
+    <w:p>
+      <w:pPr>
+        <w:pStyle w:val="FirstParagraph"/>
+      </w:pPr>
+      <w:r>
+        <w:t xml:space="preserve">The plotter writes the HTML index + per-panel PNGs + comparison.csv</w:t>
+      </w:r>
+      <w:r>
+        <w:t xml:space="preserve"> </w:t>
+      </w:r>
+      <w:r>
+        <w:t xml:space="preserve">+ summary.json into</w:t>
+      </w:r>
+      <w:r>
+        <w:t xml:space="preserve"> </w:t>
+      </w:r>
+      <w:r>
+        <w:rPr>
+          <w:rStyle w:val="VerbatimChar"/>
+        </w:rPr>
+        <w:t xml:space="preserve">--out</w:t>
+      </w:r>
+      <w:r>
+        <w:t xml:space="preserve"> </w:t>
+      </w:r>
+      <w:r>
+        <w:t xml:space="preserve">(see §13.5).</w:t>
+      </w:r>
+    </w:p>
+    <w:bookmarkEnd w:id="75"/>
+    <w:bookmarkStart w:id="76" w:name="Xe9c1cd3ffe080410a20493fa06524b1edccbcaf"/>
+    <w:p>
+      <w:pPr>
+        <w:pStyle w:val="Heading3"/>
+      </w:pPr>
+      <w:r>
+        <w:t xml:space="preserve">Tier-2 GUI integration (deferred until GUI work)</w:t>
+      </w:r>
+    </w:p>
+    <w:p>
+      <w:pPr>
+        <w:pStyle w:val="FirstParagraph"/>
+      </w:pPr>
+      <w:r>
+        <w:t xml:space="preserve">When the index.html additions land, each demo panel will get a</w:t>
+      </w:r>
+      <w:r>
+        <w:t xml:space="preserve"> </w:t>
+      </w:r>
+      <w:r>
+        <w:t xml:space="preserve">“</w:t>
+      </w:r>
+      <w:r>
+        <w:t xml:space="preserve">Logging</w:t>
+      </w:r>
+      <w:r>
+        <w:t xml:space="preserve">”</w:t>
+      </w:r>
+      <w:r>
+        <w:t xml:space="preserve"> </w:t>
+      </w:r>
+      <w:r>
+        <w:t xml:space="preserve">sub-section with:</w:t>
+      </w:r>
+      <w:r>
+        <w:t xml:space="preserve"> </w:t>
+      </w:r>
+      <w:r>
+        <w:t xml:space="preserve">-</w:t>
+      </w:r>
+      <w:r>
+        <w:t xml:space="preserve"> </w:t>
+      </w:r>
+      <w:r>
+        <w:t xml:space="preserve">“</w:t>
+      </w:r>
+      <w:r>
+        <w:t xml:space="preserve">Record bag</w:t>
+      </w:r>
+      <w:r>
+        <w:t xml:space="preserve">”</w:t>
+      </w:r>
+      <w:r>
+        <w:t xml:space="preserve"> </w:t>
+      </w:r>
+      <w:r>
+        <w:t xml:space="preserve">toggle (default ON) — feeds</w:t>
+      </w:r>
+      <w:r>
+        <w:t xml:space="preserve"> </w:t>
+      </w:r>
+      <w:r>
+        <w:rPr>
+          <w:rStyle w:val="VerbatimChar"/>
+        </w:rPr>
+        <w:t xml:space="preserve">record_images:off|on</w:t>
+      </w:r>
+      <w:r>
+        <w:t xml:space="preserve"> </w:t>
+      </w:r>
+      <w:r>
+        <w:t xml:space="preserve">to /control_cmd before Start.</w:t>
+      </w:r>
+      <w:r>
+        <w:t xml:space="preserve"> </w:t>
+      </w:r>
+      <w:r>
+        <w:t xml:space="preserve">-</w:t>
+      </w:r>
+      <w:r>
+        <w:t xml:space="preserve"> </w:t>
+      </w:r>
+      <w:r>
+        <w:t xml:space="preserve">“</w:t>
+      </w:r>
+      <w:r>
+        <w:t xml:space="preserve">View last bag</w:t>
+      </w:r>
+      <w:r>
+        <w:t xml:space="preserve">”</w:t>
+      </w:r>
+      <w:r>
+        <w:t xml:space="preserve"> </w:t>
+      </w:r>
+      <w:r>
+        <w:t xml:space="preserve">link — shows the most recent bag’s path + offers</w:t>
+      </w:r>
+      <w:r>
+        <w:t xml:space="preserve"> </w:t>
+      </w:r>
+      <w:r>
+        <w:t xml:space="preserve">a</w:t>
+      </w:r>
+      <w:r>
+        <w:t xml:space="preserve"> </w:t>
+      </w:r>
+      <w:r>
+        <w:t xml:space="preserve">“</w:t>
+      </w:r>
+      <w:r>
+        <w:t xml:space="preserve">Generate report</w:t>
+      </w:r>
+      <w:r>
+        <w:t xml:space="preserve">”</w:t>
+      </w:r>
+      <w:r>
+        <w:t xml:space="preserve"> </w:t>
+      </w:r>
+      <w:r>
+        <w:t xml:space="preserve">button that runs the plotter remotely and</w:t>
+      </w:r>
+      <w:r>
+        <w:t xml:space="preserve"> </w:t>
+      </w:r>
+      <w:r>
+        <w:t xml:space="preserve">serves the resulting HTML.</w:t>
+      </w:r>
+    </w:p>
+    <w:bookmarkEnd w:id="76"/>
+    <w:bookmarkStart w:id="77" w:name="plotter-interface"/>
     <w:p>
       <w:pPr>
         <w:pStyle w:val="Heading3"/>
@@ -13322,9 +14283,9 @@
         </w:pict>
       </w:r>
     </w:p>
-    <w:bookmarkEnd w:id="69"/>
-    <w:bookmarkEnd w:id="70"/>
-    <w:bookmarkStart w:id="71" w:name="implementation-milestones"/>
+    <w:bookmarkEnd w:id="77"/>
+    <w:bookmarkEnd w:id="78"/>
+    <w:bookmarkStart w:id="79" w:name="implementation-milestones"/>
     <w:p>
       <w:pPr>
         <w:pStyle w:val="Heading2"/>
@@ -14190,8 +15151,8 @@
         </w:pict>
       </w:r>
     </w:p>
-    <w:bookmarkEnd w:id="71"/>
-    <w:bookmarkStart w:id="77" w:name="open-questions"/>
+    <w:bookmarkEnd w:id="79"/>
+    <w:bookmarkStart w:id="86" w:name="open-questions"/>
     <w:p>
       <w:pPr>
         <w:pStyle w:val="Heading2"/>
@@ -14200,7 +15161,7 @@
         <w:t xml:space="preserve">15. Open questions</w:t>
       </w:r>
     </w:p>
-    <w:bookmarkStart w:id="72" w:name="resolved-2026-04-25"/>
+    <w:bookmarkStart w:id="80" w:name="resolved-2026-04-25"/>
     <w:p>
       <w:pPr>
         <w:pStyle w:val="Heading3"/>
@@ -15041,8 +16002,8 @@
         <w:t xml:space="preserve">Q23 | Strobe-red trigger scope | Off-platform watchdog only. In-bounds disturbance recovery is silent. Strobe is body-background-only — never overlays panels or controls. |</w:t>
       </w:r>
     </w:p>
-    <w:bookmarkEnd w:id="72"/>
-    <w:bookmarkStart w:id="73" w:name="resolved-in-v5-2026-04-26"/>
+    <w:bookmarkEnd w:id="80"/>
+    <w:bookmarkStart w:id="81" w:name="resolved-in-v5-2026-04-26"/>
     <w:p>
       <w:pPr>
         <w:pStyle w:val="Heading3"/>
@@ -15434,8 +16395,8 @@
         </w:tc>
       </w:tr>
     </w:tbl>
-    <w:bookmarkEnd w:id="73"/>
-    <w:bookmarkStart w:id="74" w:name="resolved-in-v6-2026-04-26"/>
+    <w:bookmarkEnd w:id="81"/>
+    <w:bookmarkStart w:id="82" w:name="resolved-in-v6-2026-04-26"/>
     <w:p>
       <w:pPr>
         <w:pStyle w:val="Heading3"/>
@@ -15787,8 +16748,8 @@
         </w:tc>
       </w:tr>
     </w:tbl>
-    <w:bookmarkEnd w:id="74"/>
-    <w:bookmarkStart w:id="75" w:name="resolved-in-v7-2026-04-26"/>
+    <w:bookmarkEnd w:id="82"/>
+    <w:bookmarkStart w:id="83" w:name="resolved-in-v7-2026-04-26"/>
     <w:p>
       <w:pPr>
         <w:pStyle w:val="Heading3"/>
@@ -15967,13 +16928,365 @@
         </w:tc>
       </w:tr>
     </w:tbl>
-    <w:bookmarkEnd w:id="75"/>
-    <w:bookmarkStart w:id="76" w:name="still-open"/>
+    <w:bookmarkEnd w:id="83"/>
+    <w:bookmarkStart w:id="84" w:name="resolved-in-v8-2026-04-26"/>
     <w:p>
       <w:pPr>
         <w:pStyle w:val="Heading3"/>
       </w:pPr>
       <w:r>
+        <w:t xml:space="preserve">Resolved in v8 (2026-04-26)</w:t>
+      </w:r>
+    </w:p>
+    <w:tbl>
+      <w:tblPr>
+        <w:tblStyle w:val="Table"/>
+        <w:tblW w:type="pct" w:w="5000"/>
+        <w:tblLook w:firstRow="1" w:lastRow="0" w:firstColumn="0" w:lastColumn="0" w:noHBand="0" w:noVBand="0" w:val="0020"/>
+        <w:jc w:val="start"/>
+      </w:tblPr>
+      <w:tblGrid>
+        <w:gridCol w:w="2640"/>
+        <w:gridCol w:w="2640"/>
+        <w:gridCol w:w="2640"/>
+      </w:tblGrid>
+      <w:tr>
+        <w:trPr>
+          <w:tblHeader w:val="true"/>
+        </w:trPr>
+        <w:tc>
+          <w:tcPr/>
+          <w:p>
+            <w:pPr>
+              <w:pStyle w:val="Compact"/>
+              <w:jc w:val="left"/>
+            </w:pPr>
+            <w:r>
+              <w:t xml:space="preserve">#</w:t>
+            </w:r>
+          </w:p>
+        </w:tc>
+        <w:tc>
+          <w:tcPr/>
+          <w:p>
+            <w:pPr>
+              <w:pStyle w:val="Compact"/>
+              <w:jc w:val="left"/>
+            </w:pPr>
+            <w:r>
+              <w:t xml:space="preserve">Question</w:t>
+            </w:r>
+          </w:p>
+        </w:tc>
+        <w:tc>
+          <w:tcPr/>
+          <w:p>
+            <w:pPr>
+              <w:pStyle w:val="Compact"/>
+              <w:jc w:val="left"/>
+            </w:pPr>
+            <w:r>
+              <w:t xml:space="preserve">Decision</w:t>
+            </w:r>
+          </w:p>
+        </w:tc>
+      </w:tr>
+      <w:tr>
+        <w:tc>
+          <w:tcPr/>
+          <w:p>
+            <w:pPr>
+              <w:pStyle w:val="Compact"/>
+              <w:jc w:val="left"/>
+            </w:pPr>
+            <w:r>
+              <w:t xml:space="preserve">Q38</w:t>
+            </w:r>
+          </w:p>
+        </w:tc>
+        <w:tc>
+          <w:tcPr/>
+          <w:p>
+            <w:pPr>
+              <w:pStyle w:val="Compact"/>
+              <w:jc w:val="left"/>
+            </w:pPr>
+            <w:r>
+              <w:t xml:space="preserve">Bag recording</w:t>
+            </w:r>
+          </w:p>
+        </w:tc>
+        <w:tc>
+          <w:tcPr/>
+          <w:p>
+            <w:pPr>
+              <w:pStyle w:val="Compact"/>
+              <w:jc w:val="left"/>
+            </w:pPr>
+            <w:r>
+              <w:t xml:space="preserve">Auto-record on every demo Start; fault-tag bags when the off-platform watchdog fires. Default allowlist excludes images. mcap storage in</w:t>
+            </w:r>
+            <w:r>
+              <w:t xml:space="preserve"> </w:t>
+            </w:r>
+            <w:r>
+              <w:rPr>
+                <w:rStyle w:val="VerbatimChar"/>
+              </w:rPr>
+              <w:t xml:space="preserve">~/stable_bot_bags/</w:t>
+            </w:r>
+            <w:r>
+              <w:t xml:space="preserve">.</w:t>
+            </w:r>
+          </w:p>
+        </w:tc>
+      </w:tr>
+      <w:tr>
+        <w:tc>
+          <w:tcPr/>
+          <w:p>
+            <w:pPr>
+              <w:pStyle w:val="Compact"/>
+              <w:jc w:val="left"/>
+            </w:pPr>
+            <w:r>
+              <w:t xml:space="preserve">Q39</w:t>
+            </w:r>
+          </w:p>
+        </w:tc>
+        <w:tc>
+          <w:tcPr/>
+          <w:p>
+            <w:pPr>
+              <w:pStyle w:val="Compact"/>
+              <w:jc w:val="left"/>
+            </w:pPr>
+            <w:r>
+              <w:t xml:space="preserve">Image-topic recording</w:t>
+            </w:r>
+          </w:p>
+        </w:tc>
+        <w:tc>
+          <w:tcPr/>
+          <w:p>
+            <w:pPr>
+              <w:pStyle w:val="Compact"/>
+              <w:jc w:val="left"/>
+            </w:pPr>
+            <w:r>
+              <w:t xml:space="preserve">Opt-in via</w:t>
+            </w:r>
+            <w:r>
+              <w:t xml:space="preserve"> </w:t>
+            </w:r>
+            <w:r>
+              <w:rPr>
+                <w:rStyle w:val="VerbatimChar"/>
+              </w:rPr>
+              <w:t xml:space="preserve">record_images:on</w:t>
+            </w:r>
+            <w:r>
+              <w:t xml:space="preserve"> </w:t>
+            </w:r>
+            <w:r>
+              <w:t xml:space="preserve">on /control_cmd. GUI will expose this as a per-demo checkbox once the index.html work lands.</w:t>
+            </w:r>
+          </w:p>
+        </w:tc>
+      </w:tr>
+      <w:tr>
+        <w:tc>
+          <w:tcPr/>
+          <w:p>
+            <w:pPr>
+              <w:pStyle w:val="Compact"/>
+              <w:jc w:val="left"/>
+            </w:pPr>
+            <w:r>
+              <w:t xml:space="preserve">Q40</w:t>
+            </w:r>
+          </w:p>
+        </w:tc>
+        <w:tc>
+          <w:tcPr/>
+          <w:p>
+            <w:pPr>
+              <w:pStyle w:val="Compact"/>
+              <w:jc w:val="left"/>
+            </w:pPr>
+            <w:r>
+              <w:t xml:space="preserve">Bag retention</w:t>
+            </w:r>
+          </w:p>
+        </w:tc>
+        <w:tc>
+          <w:tcPr/>
+          <w:p>
+            <w:pPr>
+              <w:pStyle w:val="Compact"/>
+              <w:jc w:val="left"/>
+            </w:pPr>
+            <w:r>
+              <w:t xml:space="preserve">No automatic rotation. Operator clears</w:t>
+            </w:r>
+            <w:r>
+              <w:t xml:space="preserve"> </w:t>
+            </w:r>
+            <w:r>
+              <w:rPr>
+                <w:rStyle w:val="VerbatimChar"/>
+              </w:rPr>
+              <w:t xml:space="preserve">~/stable_bot_bags/</w:t>
+            </w:r>
+            <w:r>
+              <w:t xml:space="preserve"> </w:t>
+            </w:r>
+            <w:r>
+              <w:t xml:space="preserve">manually. Avoids the</w:t>
+            </w:r>
+            <w:r>
+              <w:t xml:space="preserve"> </w:t>
+            </w:r>
+            <w:r>
+              <w:t xml:space="preserve">“</w:t>
+            </w:r>
+            <w:r>
+              <w:t xml:space="preserve">we deleted the great run</w:t>
+            </w:r>
+            <w:r>
+              <w:t xml:space="preserve">”</w:t>
+            </w:r>
+            <w:r>
+              <w:t xml:space="preserve"> </w:t>
+            </w:r>
+            <w:r>
+              <w:t xml:space="preserve">footgun.</w:t>
+            </w:r>
+          </w:p>
+        </w:tc>
+      </w:tr>
+      <w:tr>
+        <w:tc>
+          <w:tcPr/>
+          <w:p>
+            <w:pPr>
+              <w:pStyle w:val="Compact"/>
+              <w:jc w:val="left"/>
+            </w:pPr>
+            <w:r>
+              <w:t xml:space="preserve">Q41</w:t>
+            </w:r>
+          </w:p>
+        </w:tc>
+        <w:tc>
+          <w:tcPr/>
+          <w:p>
+            <w:pPr>
+              <w:pStyle w:val="Compact"/>
+              <w:jc w:val="left"/>
+            </w:pPr>
+            <w:r>
+              <w:t xml:space="preserve">Vision Debug placement (GUI)</w:t>
+            </w:r>
+          </w:p>
+        </w:tc>
+        <w:tc>
+          <w:tcPr/>
+          <w:p>
+            <w:pPr>
+              <w:pStyle w:val="Compact"/>
+              <w:jc w:val="left"/>
+            </w:pPr>
+            <w:r>
+              <w:t xml:space="preserve">Top of left column — horizontally adjacent to the new demo panels at the top of the middle column. Visible whenever demos are running.</w:t>
+            </w:r>
+          </w:p>
+        </w:tc>
+      </w:tr>
+      <w:tr>
+        <w:tc>
+          <w:tcPr/>
+          <w:p>
+            <w:pPr>
+              <w:pStyle w:val="Compact"/>
+              <w:jc w:val="left"/>
+            </w:pPr>
+            <w:r>
+              <w:t xml:space="preserve">Q42</w:t>
+            </w:r>
+          </w:p>
+        </w:tc>
+        <w:tc>
+          <w:tcPr/>
+          <w:p>
+            <w:pPr>
+              <w:pStyle w:val="Compact"/>
+              <w:jc w:val="left"/>
+            </w:pPr>
+            <w:r>
+              <w:t xml:space="preserve">Demo SVG canvas</w:t>
+            </w:r>
+          </w:p>
+        </w:tc>
+        <w:tc>
+          <w:tcPr/>
+          <w:p>
+            <w:pPr>
+              <w:pStyle w:val="Compact"/>
+              <w:jc w:val="left"/>
+            </w:pPr>
+            <w:r>
+              <w:t xml:space="preserve">Single shared SVG at the top of the middle column. Active demo’s panel border + SVG border change color (Demo 1 = blue, Demo 2 = green, Demo 3 = purple, LEVEL_HOLD = grey).</w:t>
+            </w:r>
+          </w:p>
+        </w:tc>
+      </w:tr>
+      <w:tr>
+        <w:tc>
+          <w:tcPr/>
+          <w:p>
+            <w:pPr>
+              <w:pStyle w:val="Compact"/>
+              <w:jc w:val="left"/>
+            </w:pPr>
+            <w:r>
+              <w:t xml:space="preserve">Q43</w:t>
+            </w:r>
+          </w:p>
+        </w:tc>
+        <w:tc>
+          <w:tcPr/>
+          <w:p>
+            <w:pPr>
+              <w:pStyle w:val="Compact"/>
+              <w:jc w:val="left"/>
+            </w:pPr>
+            <w:r>
+              <w:t xml:space="preserve">Demo activation interlock</w:t>
+            </w:r>
+          </w:p>
+        </w:tc>
+        <w:tc>
+          <w:tcPr/>
+          <w:p>
+            <w:pPr>
+              <w:pStyle w:val="Compact"/>
+              <w:jc w:val="left"/>
+            </w:pPr>
+            <w:r>
+              <w:t xml:space="preserve">Soft interlock: pressing Start on demo X automatically stops whatever was running and transitions through LEVEL_HOLD. Fewer clicks than a hard interlock or modal prompt.</w:t>
+            </w:r>
+          </w:p>
+        </w:tc>
+      </w:tr>
+    </w:tbl>
+    <w:bookmarkEnd w:id="84"/>
+    <w:bookmarkStart w:id="85" w:name="still-open"/>
+    <w:p>
+      <w:pPr>
+        <w:pStyle w:val="Heading3"/>
+      </w:pPr>
+      <w:r>
         <w:t xml:space="preserve">Still open</w:t>
       </w:r>
     </w:p>
@@ -15982,7 +17295,7 @@
         <w:pStyle w:val="FirstParagraph"/>
       </w:pPr>
       <w:r>
-        <w:t xml:space="preserve">None — spec locked at v7 (2026-04-26).</w:t>
+        <w:t xml:space="preserve">None — spec locked at v8 (2026-04-26).</w:t>
       </w:r>
     </w:p>
     <w:p>
@@ -15992,9 +17305,9 @@
         </w:pict>
       </w:r>
     </w:p>
-    <w:bookmarkEnd w:id="76"/>
-    <w:bookmarkEnd w:id="77"/>
-    <w:bookmarkStart w:id="78" w:name="references"/>
+    <w:bookmarkEnd w:id="85"/>
+    <w:bookmarkEnd w:id="86"/>
+    <w:bookmarkStart w:id="87" w:name="references"/>
     <w:p>
       <w:pPr>
         <w:pStyle w:val="Heading2"/>
@@ -16294,8 +17607,8 @@
         <w:t xml:space="preserve">Luxonis DepthAI documentation (OAK-D-PRO-AF pipeline).</w:t>
       </w:r>
     </w:p>
-    <w:bookmarkEnd w:id="78"/>
-    <w:bookmarkEnd w:id="79"/>
+    <w:bookmarkEnd w:id="87"/>
+    <w:bookmarkEnd w:id="88"/>
     <w:sectPr/>
   </w:body>
 </w:document>

</xml_diff>

<commit_message>
v9.2: Lock four Ball-Hold UX details (Q52-Q55, recommended defaults)
Closing out the four open questions from v9.1 §15 with the
recommended defaults the user explicitly accepted:

  Q52 standalone BALL_HOLD mode (not a Demo-2 toggle)
  Q53 refuse Engage when no ball detected; clear toast
  Q54 SVG clicks while engaged retarget the hold (still feedforward)
  Q55 saturation feedback is text + color only; no audio, no pulse

Spec is now fully locked through v10 — when controller-side base-IMU
feedforward is added, no further design decisions remain.

Co-Authored-By: Claude Opus 4.7 (1M context) <noreply@anthropic.com>
</commit_message>
<xml_diff>
--- a/stewart_bringup/docs/closed_loop_ball_demos.docx
+++ b/stewart_bringup/docs/closed_loop_ball_demos.docx
@@ -2,7 +2,7 @@
 <file path=word/document.xml><?xml version="1.0" encoding="utf-8"?>
 <w:document xmlns:w="http://schemas.openxmlformats.org/wordprocessingml/2006/main" xmlns:m="http://schemas.openxmlformats.org/officeDocument/2006/math" xmlns:r="http://schemas.openxmlformats.org/officeDocument/2006/relationships" xmlns:o="urn:schemas-microsoft-com:office:office" xmlns:v="urn:schemas-microsoft-com:vml" xmlns:w10="urn:schemas-microsoft-com:office:word" xmlns:a="http://schemas.openxmlformats.org/drawingml/2006/main" xmlns:pic="http://schemas.openxmlformats.org/drawingml/2006/picture" xmlns:wp="http://schemas.openxmlformats.org/drawingml/2006/wordprocessingDrawing">
   <w:body>
-    <w:bookmarkStart w:id="102" w:name="Xf2ecee67e627b13c32e3c15bfc4ce569ecb8d6b"/>
+    <w:bookmarkStart w:id="103" w:name="Xf2ecee67e627b13c32e3c15bfc4ce569ecb8d6b"/>
     <w:p>
       <w:pPr>
         <w:pStyle w:val="Heading1"/>
@@ -86,79 +86,37 @@
         <w:t xml:space="preserve"> </w:t>
       </w:r>
       <w:r>
-        <w:t xml:space="preserve">2026-04-26 (v9.1 — Active Stabilization (Ball-Hold)</w:t>
-      </w:r>
-      <w:r>
-        <w:t xml:space="preserve"> </w:t>
-      </w:r>
-      <w:r>
-        <w:t xml:space="preserve">mode scaffolded for v10 (§11.7): GUI panel with disabled controls,</w:t>
-      </w:r>
-      <w:r>
-        <w:t xml:space="preserve"> </w:t>
-      </w:r>
-      <w:r>
-        <w:t xml:space="preserve">mode token</w:t>
-      </w:r>
-      <w:r>
-        <w:t xml:space="preserve"> </w:t>
-      </w:r>
-      <w:r>
-        <w:rPr>
-          <w:rStyle w:val="VerbatimChar"/>
-        </w:rPr>
-        <w:t xml:space="preserve">BALL_HOLD</w:t>
-      </w:r>
-      <w:r>
-        <w:t xml:space="preserve"> </w:t>
-      </w:r>
-      <w:r>
-        <w:t xml:space="preserve">reserved in</w:t>
-      </w:r>
-      <w:r>
-        <w:t xml:space="preserve"> </w:t>
-      </w:r>
-      <w:r>
-        <w:rPr>
-          <w:rStyle w:val="VerbatimChar"/>
-        </w:rPr>
-        <w:t xml:space="preserve">ref_generator_node</w:t>
-      </w:r>
-      <w:r>
-        <w:t xml:space="preserve">, feedforward</w:t>
-      </w:r>
-      <w:r>
-        <w:t xml:space="preserve"> </w:t>
-      </w:r>
-      <w:r>
-        <w:t xml:space="preserve">+ saturation math added to</w:t>
-      </w:r>
-      <w:r>
-        <w:t xml:space="preserve"> </w:t>
-      </w:r>
-      <w:r>
-        <w:rPr>
-          <w:rStyle w:val="VerbatimChar"/>
-        </w:rPr>
-        <w:t xml:space="preserve">_ball_physics.py</w:t>
-      </w:r>
-      <w:r>
-        <w:t xml:space="preserve"> </w:t>
-      </w:r>
-      <w:r>
-        <w:t xml:space="preserve">with unit tests. Full</w:t>
-      </w:r>
-      <w:r>
-        <w:t xml:space="preserve"> </w:t>
-      </w:r>
-      <w:r>
-        <w:t xml:space="preserve">implementation (controller-side base-IMU feedforward) deferred — see</w:t>
-      </w:r>
-      <w:r>
-        <w:t xml:space="preserve"> </w:t>
-      </w:r>
-      <w:r>
-        <w:t xml:space="preserve">§16 step 8.5).</w:t>
+        <w:t xml:space="preserve">2026-04-26 (v9.2 — closed out the four open</w:t>
+      </w:r>
+      <w:r>
+        <w:t xml:space="preserve"> </w:t>
+      </w:r>
+      <w:r>
+        <w:t xml:space="preserve">Ball-Hold UX questions (Q52–Q55) with the recommended defaults:</w:t>
+      </w:r>
+      <w:r>
+        <w:t xml:space="preserve"> </w:t>
+      </w:r>
+      <w:r>
+        <w:t xml:space="preserve">standalone mode, refuse-on-no-ball, click-to-retarget allowed,</w:t>
+      </w:r>
+      <w:r>
+        <w:t xml:space="preserve"> </w:t>
+      </w:r>
+      <w:r>
+        <w:t xml:space="preserve">text+color saturation feedback only. Spec is now fully locked</w:t>
+      </w:r>
+      <w:r>
+        <w:t xml:space="preserve"> </w:t>
+      </w:r>
+      <w:r>
+        <w:t xml:space="preserve">through v10 — when controller-side base-IMU feedforward is added,</w:t>
+      </w:r>
+      <w:r>
+        <w:t xml:space="preserve"> </w:t>
+      </w:r>
+      <w:r>
+        <w:t xml:space="preserve">no further design decisions remain).</w:t>
       </w:r>
     </w:p>
     <w:p>
@@ -17712,7 +17670,7 @@
       </w:r>
     </w:p>
     <w:bookmarkEnd w:id="89"/>
-    <w:bookmarkStart w:id="98" w:name="open-questions"/>
+    <w:bookmarkStart w:id="99" w:name="open-questions"/>
     <w:p>
       <w:pPr>
         <w:pStyle w:val="Heading2"/>
@@ -20426,13 +20384,384 @@
       </w:tr>
     </w:tbl>
     <w:bookmarkEnd w:id="96"/>
-    <w:bookmarkStart w:id="97" w:name="X5a9026e14ddf652008e96352b7957c6412bafdd"/>
+    <w:bookmarkStart w:id="97" w:name="resolved-in-v9.2-2026-04-26"/>
     <w:p>
       <w:pPr>
         <w:pStyle w:val="Heading3"/>
       </w:pPr>
       <w:r>
-        <w:t xml:space="preserve">Still open (Ball-Hold detail decisions, blocking spec §11.7)</w:t>
+        <w:t xml:space="preserve">Resolved in v9.2 (2026-04-26)</w:t>
+      </w:r>
+    </w:p>
+    <w:tbl>
+      <w:tblPr>
+        <w:tblStyle w:val="Table"/>
+        <w:tblW w:type="pct" w:w="5000"/>
+        <w:tblLook w:firstRow="1" w:lastRow="0" w:firstColumn="0" w:lastColumn="0" w:noHBand="0" w:noVBand="0" w:val="0020"/>
+        <w:jc w:val="start"/>
+      </w:tblPr>
+      <w:tblGrid>
+        <w:gridCol w:w="2640"/>
+        <w:gridCol w:w="2640"/>
+        <w:gridCol w:w="2640"/>
+      </w:tblGrid>
+      <w:tr>
+        <w:trPr>
+          <w:tblHeader w:val="true"/>
+        </w:trPr>
+        <w:tc>
+          <w:tcPr/>
+          <w:p>
+            <w:pPr>
+              <w:pStyle w:val="Compact"/>
+              <w:jc w:val="left"/>
+            </w:pPr>
+            <w:r>
+              <w:t xml:space="preserve">#</w:t>
+            </w:r>
+          </w:p>
+        </w:tc>
+        <w:tc>
+          <w:tcPr/>
+          <w:p>
+            <w:pPr>
+              <w:pStyle w:val="Compact"/>
+              <w:jc w:val="left"/>
+            </w:pPr>
+            <w:r>
+              <w:t xml:space="preserve">Question</w:t>
+            </w:r>
+          </w:p>
+        </w:tc>
+        <w:tc>
+          <w:tcPr/>
+          <w:p>
+            <w:pPr>
+              <w:pStyle w:val="Compact"/>
+              <w:jc w:val="left"/>
+            </w:pPr>
+            <w:r>
+              <w:t xml:space="preserve">Decision</w:t>
+            </w:r>
+          </w:p>
+        </w:tc>
+      </w:tr>
+      <w:tr>
+        <w:tc>
+          <w:tcPr/>
+          <w:p>
+            <w:pPr>
+              <w:pStyle w:val="Compact"/>
+              <w:jc w:val="left"/>
+            </w:pPr>
+            <w:r>
+              <w:t xml:space="preserve">Q52</w:t>
+            </w:r>
+          </w:p>
+        </w:tc>
+        <w:tc>
+          <w:tcPr/>
+          <w:p>
+            <w:pPr>
+              <w:pStyle w:val="Compact"/>
+              <w:jc w:val="left"/>
+            </w:pPr>
+            <w:r>
+              <w:t xml:space="preserve">Standalone Ball-Hold or Demo-2 toggle?</w:t>
+            </w:r>
+          </w:p>
+        </w:tc>
+        <w:tc>
+          <w:tcPr/>
+          <w:p>
+            <w:pPr>
+              <w:pStyle w:val="Compact"/>
+              <w:jc w:val="left"/>
+            </w:pPr>
+            <w:r>
+              <w:rPr>
+                <w:bCs/>
+                <w:b/>
+              </w:rPr>
+              <w:t xml:space="preserve">Standalone</w:t>
+            </w:r>
+            <w:r>
+              <w:t xml:space="preserve"> </w:t>
+            </w:r>
+            <w:r>
+              <w:t xml:space="preserve">— separate</w:t>
+            </w:r>
+            <w:r>
+              <w:t xml:space="preserve"> </w:t>
+            </w:r>
+            <w:r>
+              <w:rPr>
+                <w:rStyle w:val="VerbatimChar"/>
+              </w:rPr>
+              <w:t xml:space="preserve">BALL_HOLD</w:t>
+            </w:r>
+            <w:r>
+              <w:t xml:space="preserve"> </w:t>
+            </w:r>
+            <w:r>
+              <w:t xml:space="preserve">mode that captures the current ball position when Engage is pressed. Clean mental model; simplest UX. A</w:t>
+            </w:r>
+            <w:r>
+              <w:t xml:space="preserve"> </w:t>
+            </w:r>
+            <w:r>
+              <w:t xml:space="preserve">“</w:t>
+            </w:r>
+            <w:r>
+              <w:t xml:space="preserve">World-frame hold</w:t>
+            </w:r>
+            <w:r>
+              <w:t xml:space="preserve">”</w:t>
+            </w:r>
+            <w:r>
+              <w:t xml:space="preserve"> </w:t>
+            </w:r>
+            <w:r>
+              <w:t xml:space="preserve">toggle on Demos 1/2/3 can be added later if it proves valuable, but isn’t required for v10.</w:t>
+            </w:r>
+          </w:p>
+        </w:tc>
+      </w:tr>
+      <w:tr>
+        <w:tc>
+          <w:tcPr/>
+          <w:p>
+            <w:pPr>
+              <w:pStyle w:val="Compact"/>
+              <w:jc w:val="left"/>
+            </w:pPr>
+            <w:r>
+              <w:t xml:space="preserve">Q53</w:t>
+            </w:r>
+          </w:p>
+        </w:tc>
+        <w:tc>
+          <w:tcPr/>
+          <w:p>
+            <w:pPr>
+              <w:pStyle w:val="Compact"/>
+              <w:jc w:val="left"/>
+            </w:pPr>
+            <w:r>
+              <w:t xml:space="preserve">Behavior when Engage is pressed but no ball is detected</w:t>
+            </w:r>
+          </w:p>
+        </w:tc>
+        <w:tc>
+          <w:tcPr/>
+          <w:p>
+            <w:pPr>
+              <w:pStyle w:val="Compact"/>
+              <w:jc w:val="left"/>
+            </w:pPr>
+            <w:r>
+              <w:rPr>
+                <w:bCs/>
+                <w:b/>
+              </w:rPr>
+              <w:t xml:space="preserve">Refuse</w:t>
+            </w:r>
+            <w:r>
+              <w:t xml:space="preserve"> </w:t>
+            </w:r>
+            <w:r>
+              <w:t xml:space="preserve">with a clear toast:</w:t>
+            </w:r>
+            <w:r>
+              <w:t xml:space="preserve"> </w:t>
+            </w:r>
+            <w:r>
+              <w:t xml:space="preserve">“</w:t>
+            </w:r>
+            <w:r>
+              <w:t xml:space="preserve">no ball detected — place a ball on the platform first</w:t>
+            </w:r>
+            <w:r>
+              <w:t xml:space="preserve">”</w:t>
+            </w:r>
+            <w:r>
+              <w:t xml:space="preserve">. Avoids silent</w:t>
+            </w:r>
+            <w:r>
+              <w:t xml:space="preserve"> </w:t>
+            </w:r>
+            <w:r>
+              <w:t xml:space="preserve">“</w:t>
+            </w:r>
+            <w:r>
+              <w:t xml:space="preserve">what’s happening</w:t>
+            </w:r>
+            <w:r>
+              <w:t xml:space="preserve">”</w:t>
+            </w:r>
+            <w:r>
+              <w:t xml:space="preserve"> </w:t>
+            </w:r>
+            <w:r>
+              <w:t xml:space="preserve">states. Re-engage requires the operator to add a ball + press Engage again.</w:t>
+            </w:r>
+          </w:p>
+        </w:tc>
+      </w:tr>
+      <w:tr>
+        <w:tc>
+          <w:tcPr/>
+          <w:p>
+            <w:pPr>
+              <w:pStyle w:val="Compact"/>
+              <w:jc w:val="left"/>
+            </w:pPr>
+            <w:r>
+              <w:t xml:space="preserve">Q54</w:t>
+            </w:r>
+          </w:p>
+        </w:tc>
+        <w:tc>
+          <w:tcPr/>
+          <w:p>
+            <w:pPr>
+              <w:pStyle w:val="Compact"/>
+              <w:jc w:val="left"/>
+            </w:pPr>
+            <w:r>
+              <w:t xml:space="preserve">Click-on-SVG to update the hold target while engaged</w:t>
+            </w:r>
+          </w:p>
+        </w:tc>
+        <w:tc>
+          <w:tcPr/>
+          <w:p>
+            <w:pPr>
+              <w:pStyle w:val="Compact"/>
+              <w:jc w:val="left"/>
+            </w:pPr>
+            <w:r>
+              <w:rPr>
+                <w:bCs/>
+                <w:b/>
+              </w:rPr>
+              <w:t xml:space="preserve">Yes</w:t>
+            </w:r>
+            <w:r>
+              <w:t xml:space="preserve"> </w:t>
+            </w:r>
+            <w:r>
+              <w:t xml:space="preserve">— clicks are treated like Demo 2’s retarget but with the base-IMU feedforward layer still on. Lets the operator say</w:t>
+            </w:r>
+            <w:r>
+              <w:t xml:space="preserve"> </w:t>
+            </w:r>
+            <w:r>
+              <w:t xml:space="preserve">“</w:t>
+            </w:r>
+            <w:r>
+              <w:t xml:space="preserve">hold the ball</w:t>
+            </w:r>
+            <w:r>
+              <w:t xml:space="preserve"> </w:t>
+            </w:r>
+            <w:r>
+              <w:rPr>
+                <w:iCs/>
+                <w:i/>
+              </w:rPr>
+              <w:t xml:space="preserve">there</w:t>
+            </w:r>
+            <w:r>
+              <w:t xml:space="preserve"> </w:t>
+            </w:r>
+            <w:r>
+              <w:t xml:space="preserve">now</w:t>
+            </w:r>
+            <w:r>
+              <w:t xml:space="preserve">”</w:t>
+            </w:r>
+            <w:r>
+              <w:t xml:space="preserve"> </w:t>
+            </w:r>
+            <w:r>
+              <w:t xml:space="preserve">without disengaging. The Recapture button shortcut is a redundant convenience for</w:t>
+            </w:r>
+            <w:r>
+              <w:t xml:space="preserve"> </w:t>
+            </w:r>
+            <w:r>
+              <w:t xml:space="preserve">“</w:t>
+            </w:r>
+            <w:r>
+              <w:t xml:space="preserve">use the ball’s current position as the new target</w:t>
+            </w:r>
+            <w:r>
+              <w:t xml:space="preserve">”</w:t>
+            </w:r>
+            <w:r>
+              <w:t xml:space="preserve">.</w:t>
+            </w:r>
+          </w:p>
+        </w:tc>
+      </w:tr>
+      <w:tr>
+        <w:tc>
+          <w:tcPr/>
+          <w:p>
+            <w:pPr>
+              <w:pStyle w:val="Compact"/>
+              <w:jc w:val="left"/>
+            </w:pPr>
+            <w:r>
+              <w:t xml:space="preserve">Q55</w:t>
+            </w:r>
+          </w:p>
+        </w:tc>
+        <w:tc>
+          <w:tcPr/>
+          <w:p>
+            <w:pPr>
+              <w:pStyle w:val="Compact"/>
+              <w:jc w:val="left"/>
+            </w:pPr>
+            <w:r>
+              <w:t xml:space="preserve">Saturation visual feedback granularity</w:t>
+            </w:r>
+          </w:p>
+        </w:tc>
+        <w:tc>
+          <w:tcPr/>
+          <w:p>
+            <w:pPr>
+              <w:pStyle w:val="Compact"/>
+              <w:jc w:val="left"/>
+            </w:pPr>
+            <w:r>
+              <w:rPr>
+                <w:bCs/>
+                <w:b/>
+              </w:rPr>
+              <w:t xml:space="preserve">Text + color only</w:t>
+            </w:r>
+            <w:r>
+              <w:t xml:space="preserve"> </w:t>
+            </w:r>
+            <w:r>
+              <w:t xml:space="preserve">(green / yellow / red on saturation %). No audio chirp; no border pulse. Stays consistent with the no-beep precedent from the off-platform watchdog. The strobing-red animation remains reserved exclusively for off-platform aborts.</w:t>
+            </w:r>
+          </w:p>
+        </w:tc>
+      </w:tr>
+    </w:tbl>
+    <w:bookmarkEnd w:id="97"/>
+    <w:bookmarkStart w:id="98" w:name="still-open"/>
+    <w:p>
+      <w:pPr>
+        <w:pStyle w:val="Heading3"/>
+      </w:pPr>
+      <w:r>
+        <w:t xml:space="preserve">Still open</w:t>
       </w:r>
     </w:p>
     <w:p>
@@ -20440,434 +20769,13 @@
         <w:pStyle w:val="FirstParagraph"/>
       </w:pPr>
       <w:r>
-        <w:t xml:space="preserve">The scaffold reserves the mode and ships the math, but four UX</w:t>
-      </w:r>
-      <w:r>
-        <w:t xml:space="preserve"> </w:t>
-      </w:r>
-      <w:r>
-        <w:t xml:space="preserve">details for the v10 implementation aren’t locked yet. Recommended</w:t>
-      </w:r>
-      <w:r>
-        <w:t xml:space="preserve"> </w:t>
-      </w:r>
-      <w:r>
-        <w:t xml:space="preserve">defaults are below; confirm or override:</w:t>
-      </w:r>
-    </w:p>
-    <w:p>
-      <w:pPr>
-        <w:numPr>
-          <w:ilvl w:val="0"/>
-          <w:numId w:val="1047"/>
-        </w:numPr>
-        <w:pStyle w:val="Compact"/>
-      </w:pPr>
-      <w:r>
-        <w:rPr>
-          <w:bCs/>
-          <w:b/>
-        </w:rPr>
-        <w:t xml:space="preserve">Standalone Ball-Hold OR a toggle on Demo 2?</w:t>
-      </w:r>
-      <w:r>
-        <w:t xml:space="preserve"> </w:t>
-      </w:r>
-      <w:r>
-        <w:t xml:space="preserve">Two ways to expose</w:t>
-      </w:r>
-      <w:r>
-        <w:t xml:space="preserve"> </w:t>
-      </w:r>
-      <w:r>
-        <w:t xml:space="preserve">the base-IMU feedforward layer:</w:t>
-      </w:r>
-    </w:p>
-    <w:p>
-      <w:pPr>
-        <w:numPr>
-          <w:ilvl w:val="1"/>
-          <w:numId w:val="1048"/>
-        </w:numPr>
-        <w:pStyle w:val="Compact"/>
-      </w:pPr>
-    </w:p>
-    <w:p>
-      <w:pPr>
-        <w:numPr>
-          <w:ilvl w:val="2"/>
-          <w:numId w:val="1049"/>
-        </w:numPr>
-        <w:pStyle w:val="Compact"/>
-      </w:pPr>
-      <w:r>
-        <w:t xml:space="preserve">standalone: separate Ball-Hold mode, captures current ball</w:t>
-      </w:r>
-      <w:r>
-        <w:t xml:space="preserve"> </w:t>
-      </w:r>
-      <w:r>
-        <w:t xml:space="preserve">position as target.</w:t>
-      </w:r>
-      <w:r>
-        <w:t xml:space="preserve"> </w:t>
-      </w:r>
-      <w:r>
-        <w:rPr>
-          <w:bCs/>
-          <w:b/>
-        </w:rPr>
-        <w:t xml:space="preserve">(recommended for v10)</w:t>
-      </w:r>
-      <w:r>
-        <w:t xml:space="preserve"> </w:t>
-      </w:r>
-      <w:r>
-        <w:t xml:space="preserve">— clean mental</w:t>
-      </w:r>
-      <w:r>
-        <w:t xml:space="preserve"> </w:t>
-      </w:r>
-      <w:r>
-        <w:t xml:space="preserve">model, simplest UX.</w:t>
-      </w:r>
-    </w:p>
-    <w:p>
-      <w:pPr>
-        <w:numPr>
-          <w:ilvl w:val="1"/>
-          <w:numId w:val="1048"/>
-        </w:numPr>
-        <w:pStyle w:val="Compact"/>
-      </w:pPr>
-    </w:p>
-    <w:p>
-      <w:pPr>
-        <w:numPr>
-          <w:ilvl w:val="2"/>
-          <w:numId w:val="1050"/>
-        </w:numPr>
-        <w:pStyle w:val="Compact"/>
-      </w:pPr>
-      <w:r>
-        <w:t xml:space="preserve">layered: a</w:t>
-      </w:r>
-      <w:r>
-        <w:t xml:space="preserve"> </w:t>
-      </w:r>
-      <w:r>
-        <w:t xml:space="preserve">“</w:t>
-      </w:r>
-      <w:r>
-        <w:t xml:space="preserve">World-frame hold</w:t>
-      </w:r>
-      <w:r>
-        <w:t xml:space="preserve">”</w:t>
-      </w:r>
-      <w:r>
-        <w:t xml:space="preserve"> </w:t>
-      </w:r>
-      <w:r>
-        <w:t xml:space="preserve">checkbox on Demo 2 that adds</w:t>
-      </w:r>
-      <w:r>
-        <w:t xml:space="preserve"> </w:t>
-      </w:r>
-      <w:r>
-        <w:t xml:space="preserve">the same feedforward to a clicked goto target. Could also</w:t>
-      </w:r>
-      <w:r>
-        <w:t xml:space="preserve"> </w:t>
-      </w:r>
-      <w:r>
-        <w:t xml:space="preserve">extend to Demos 1 and 3 for orbit/path tracking that rejects</w:t>
-      </w:r>
-      <w:r>
-        <w:t xml:space="preserve"> </w:t>
-      </w:r>
-      <w:r>
-        <w:t xml:space="preserve">base motion.</w:t>
-      </w:r>
-    </w:p>
-    <w:p>
-      <w:pPr>
-        <w:numPr>
-          <w:ilvl w:val="0"/>
-          <w:numId w:val="1047"/>
-        </w:numPr>
-        <w:pStyle w:val="Compact"/>
-      </w:pPr>
-      <w:r>
-        <w:rPr>
-          <w:bCs/>
-          <w:b/>
-        </w:rPr>
-        <w:t xml:space="preserve">What if no ball is detected when Engage is clicked?</w:t>
-      </w:r>
-    </w:p>
-    <w:p>
-      <w:pPr>
-        <w:numPr>
-          <w:ilvl w:val="1"/>
-          <w:numId w:val="1051"/>
-        </w:numPr>
-        <w:pStyle w:val="Compact"/>
-      </w:pPr>
-    </w:p>
-    <w:p>
-      <w:pPr>
-        <w:numPr>
-          <w:ilvl w:val="2"/>
-          <w:numId w:val="1052"/>
-        </w:numPr>
-        <w:pStyle w:val="Compact"/>
-      </w:pPr>
-      <w:r>
-        <w:t xml:space="preserve">refuse; toast</w:t>
-      </w:r>
-      <w:r>
-        <w:t xml:space="preserve"> </w:t>
-      </w:r>
-      <w:r>
-        <w:t xml:space="preserve">“</w:t>
-      </w:r>
-      <w:r>
-        <w:t xml:space="preserve">no ball detected — place a ball on the</w:t>
-      </w:r>
-      <w:r>
-        <w:t xml:space="preserve"> </w:t>
-      </w:r>
-      <w:r>
-        <w:t xml:space="preserve">platform first</w:t>
-      </w:r>
-      <w:r>
-        <w:t xml:space="preserve">”</w:t>
-      </w:r>
-      <w:r>
-        <w:t xml:space="preserve"> </w:t>
-      </w:r>
-      <w:r>
-        <w:rPr>
-          <w:bCs/>
-          <w:b/>
-        </w:rPr>
-        <w:t xml:space="preserve">(recommended)</w:t>
-      </w:r>
-      <w:r>
-        <w:t xml:space="preserve">.</w:t>
-      </w:r>
-    </w:p>
-    <w:p>
-      <w:pPr>
-        <w:numPr>
-          <w:ilvl w:val="1"/>
-          <w:numId w:val="1051"/>
-        </w:numPr>
-        <w:pStyle w:val="Compact"/>
-      </w:pPr>
-    </w:p>
-    <w:p>
-      <w:pPr>
-        <w:numPr>
-          <w:ilvl w:val="2"/>
-          <w:numId w:val="1053"/>
-        </w:numPr>
-        <w:pStyle w:val="Compact"/>
-      </w:pPr>
-      <w:r>
-        <w:t xml:space="preserve">wait; engage hold once ball appears.</w:t>
-      </w:r>
-    </w:p>
-    <w:p>
-      <w:pPr>
-        <w:numPr>
-          <w:ilvl w:val="0"/>
-          <w:numId w:val="1047"/>
-        </w:numPr>
-        <w:pStyle w:val="Compact"/>
-      </w:pPr>
-      <w:r>
-        <w:rPr>
-          <w:bCs/>
-          <w:b/>
-        </w:rPr>
-        <w:t xml:space="preserve">While in Ball-Hold, can the operator click on the SVG to update</w:t>
-      </w:r>
-      <w:r>
-        <w:rPr>
-          <w:bCs/>
-          <w:b/>
-        </w:rPr>
-        <w:t xml:space="preserve"> </w:t>
-      </w:r>
-      <w:r>
-        <w:rPr>
-          <w:bCs/>
-          <w:b/>
-        </w:rPr>
-        <w:t xml:space="preserve">the hold target without disengaging?</w:t>
-      </w:r>
-    </w:p>
-    <w:p>
-      <w:pPr>
-        <w:numPr>
-          <w:ilvl w:val="1"/>
-          <w:numId w:val="1054"/>
-        </w:numPr>
-        <w:pStyle w:val="Compact"/>
-      </w:pPr>
-    </w:p>
-    <w:p>
-      <w:pPr>
-        <w:numPr>
-          <w:ilvl w:val="2"/>
-          <w:numId w:val="1055"/>
-        </w:numPr>
-        <w:pStyle w:val="Compact"/>
-      </w:pPr>
-      <w:r>
-        <w:t xml:space="preserve">yes: clicking is treated like Demo 2’s retarget, just with</w:t>
-      </w:r>
-      <w:r>
-        <w:t xml:space="preserve"> </w:t>
-      </w:r>
-      <w:r>
-        <w:t xml:space="preserve">base-IMU feedforward layered on.</w:t>
-      </w:r>
-      <w:r>
-        <w:t xml:space="preserve"> </w:t>
-      </w:r>
-      <w:r>
-        <w:rPr>
-          <w:bCs/>
-          <w:b/>
-        </w:rPr>
-        <w:t xml:space="preserve">(recommended)</w:t>
-      </w:r>
-    </w:p>
-    <w:p>
-      <w:pPr>
-        <w:numPr>
-          <w:ilvl w:val="1"/>
-          <w:numId w:val="1054"/>
-        </w:numPr>
-        <w:pStyle w:val="Compact"/>
-      </w:pPr>
-    </w:p>
-    <w:p>
-      <w:pPr>
-        <w:numPr>
-          <w:ilvl w:val="2"/>
-          <w:numId w:val="1056"/>
-        </w:numPr>
-        <w:pStyle w:val="Compact"/>
-      </w:pPr>
-      <w:r>
-        <w:t xml:space="preserve">no: target is locked at engage time; must Recapture or</w:t>
-      </w:r>
-      <w:r>
-        <w:t xml:space="preserve"> </w:t>
-      </w:r>
-      <w:r>
-        <w:t xml:space="preserve">Disengage to change.</w:t>
-      </w:r>
-    </w:p>
-    <w:p>
-      <w:pPr>
-        <w:numPr>
-          <w:ilvl w:val="0"/>
-          <w:numId w:val="1047"/>
-        </w:numPr>
-        <w:pStyle w:val="Compact"/>
-      </w:pPr>
-      <w:r>
-        <w:rPr>
-          <w:bCs/>
-          <w:b/>
-        </w:rPr>
-        <w:t xml:space="preserve">Saturation visual feedback granularity.</w:t>
-      </w:r>
-    </w:p>
-    <w:p>
-      <w:pPr>
-        <w:numPr>
-          <w:ilvl w:val="1"/>
-          <w:numId w:val="1057"/>
-        </w:numPr>
-        <w:pStyle w:val="Compact"/>
-      </w:pPr>
-    </w:p>
-    <w:p>
-      <w:pPr>
-        <w:numPr>
-          <w:ilvl w:val="2"/>
-          <w:numId w:val="1058"/>
-        </w:numPr>
-        <w:pStyle w:val="Compact"/>
-      </w:pPr>
-      <w:r>
-        <w:t xml:space="preserve">status text + color (green/yellow/red) on saturation %</w:t>
-      </w:r>
-      <w:r>
-        <w:t xml:space="preserve"> </w:t>
-      </w:r>
-      <w:r>
-        <w:rPr>
-          <w:bCs/>
-          <w:b/>
-        </w:rPr>
-        <w:t xml:space="preserve">(recommended; consistent with no-beep policy)</w:t>
-      </w:r>
-      <w:r>
-        <w:t xml:space="preserve">.</w:t>
-      </w:r>
-    </w:p>
-    <w:p>
-      <w:pPr>
-        <w:numPr>
-          <w:ilvl w:val="1"/>
-          <w:numId w:val="1057"/>
-        </w:numPr>
-        <w:pStyle w:val="Compact"/>
-      </w:pPr>
-    </w:p>
-    <w:p>
-      <w:pPr>
-        <w:numPr>
-          <w:ilvl w:val="2"/>
-          <w:numId w:val="1059"/>
-        </w:numPr>
-        <w:pStyle w:val="Compact"/>
-      </w:pPr>
-      <w:r>
-        <w:t xml:space="preserve">also a non-strobing border pulse on the GUI’s Ball-Hold</w:t>
-      </w:r>
-      <w:r>
-        <w:t xml:space="preserve"> </w:t>
-      </w:r>
-      <w:r>
-        <w:t xml:space="preserve">panel when YELLOW.</w:t>
-      </w:r>
-    </w:p>
-    <w:p>
-      <w:pPr>
-        <w:numPr>
-          <w:ilvl w:val="1"/>
-          <w:numId w:val="1057"/>
-        </w:numPr>
-        <w:pStyle w:val="Compact"/>
-      </w:pPr>
-    </w:p>
-    <w:p>
-      <w:pPr>
-        <w:numPr>
-          <w:ilvl w:val="2"/>
-          <w:numId w:val="1060"/>
-        </w:numPr>
-        <w:pStyle w:val="Compact"/>
-      </w:pPr>
-      <w:r>
-        <w:t xml:space="preserve">audio chirp on YELLOW. (would break the no-beep precedent)</w:t>
+        <w:t xml:space="preserve">None — spec locked at v9.2 (2026-04-26). All design decisions</w:t>
+      </w:r>
+      <w:r>
+        <w:t xml:space="preserve"> </w:t>
+      </w:r>
+      <w:r>
+        <w:t xml:space="preserve">through v10 (Active Stabilization implementation) are nailed.</w:t>
       </w:r>
     </w:p>
     <w:p>
@@ -20877,9 +20785,9 @@
         </w:pict>
       </w:r>
     </w:p>
-    <w:bookmarkEnd w:id="97"/>
     <w:bookmarkEnd w:id="98"/>
-    <w:bookmarkStart w:id="100" w:name="post-deployment-iteration-plan"/>
+    <w:bookmarkEnd w:id="99"/>
+    <w:bookmarkStart w:id="101" w:name="post-deployment-iteration-plan"/>
     <w:p>
       <w:pPr>
         <w:pStyle w:val="Heading2"/>
@@ -22165,7 +22073,7 @@
         </w:tc>
       </w:tr>
     </w:tbl>
-    <w:bookmarkStart w:id="99" w:name="X52a3f6595a40f1261443a72f50a11a7e436ee84"/>
+    <w:bookmarkStart w:id="100" w:name="X52a3f6595a40f1261443a72f50a11a7e436ee84"/>
     <w:p>
       <w:pPr>
         <w:pStyle w:val="Heading3"/>
@@ -22178,7 +22086,7 @@
       <w:pPr>
         <w:numPr>
           <w:ilvl w:val="0"/>
-          <w:numId w:val="1061"/>
+          <w:numId w:val="1047"/>
         </w:numPr>
         <w:pStyle w:val="Compact"/>
       </w:pPr>
@@ -22205,7 +22113,7 @@
       <w:pPr>
         <w:numPr>
           <w:ilvl w:val="0"/>
-          <w:numId w:val="1061"/>
+          <w:numId w:val="1047"/>
         </w:numPr>
         <w:pStyle w:val="Compact"/>
       </w:pPr>
@@ -22238,7 +22146,7 @@
       <w:pPr>
         <w:numPr>
           <w:ilvl w:val="0"/>
-          <w:numId w:val="1061"/>
+          <w:numId w:val="1047"/>
         </w:numPr>
         <w:pStyle w:val="Compact"/>
       </w:pPr>
@@ -22271,7 +22179,7 @@
       <w:pPr>
         <w:numPr>
           <w:ilvl w:val="0"/>
-          <w:numId w:val="1061"/>
+          <w:numId w:val="1047"/>
         </w:numPr>
         <w:pStyle w:val="Compact"/>
       </w:pPr>
@@ -22310,7 +22218,7 @@
       <w:pPr>
         <w:numPr>
           <w:ilvl w:val="0"/>
-          <w:numId w:val="1061"/>
+          <w:numId w:val="1047"/>
         </w:numPr>
         <w:pStyle w:val="Compact"/>
       </w:pPr>
@@ -22358,7 +22266,7 @@
       <w:pPr>
         <w:numPr>
           <w:ilvl w:val="0"/>
-          <w:numId w:val="1061"/>
+          <w:numId w:val="1047"/>
         </w:numPr>
         <w:pStyle w:val="Compact"/>
       </w:pPr>
@@ -22395,9 +22303,9 @@
         <w:t xml:space="preserve">ladder above.</w:t>
       </w:r>
     </w:p>
-    <w:bookmarkEnd w:id="99"/>
     <w:bookmarkEnd w:id="100"/>
-    <w:bookmarkStart w:id="101" w:name="references"/>
+    <w:bookmarkEnd w:id="101"/>
+    <w:bookmarkStart w:id="102" w:name="references"/>
     <w:p>
       <w:pPr>
         <w:pStyle w:val="Heading2"/>
@@ -22410,7 +22318,7 @@
       <w:pPr>
         <w:numPr>
           <w:ilvl w:val="0"/>
-          <w:numId w:val="1062"/>
+          <w:numId w:val="1048"/>
         </w:numPr>
         <w:pStyle w:val="Compact"/>
       </w:pPr>
@@ -22437,7 +22345,7 @@
       <w:pPr>
         <w:numPr>
           <w:ilvl w:val="0"/>
-          <w:numId w:val="1062"/>
+          <w:numId w:val="1048"/>
         </w:numPr>
         <w:pStyle w:val="Compact"/>
       </w:pPr>
@@ -22458,7 +22366,7 @@
       <w:pPr>
         <w:numPr>
           <w:ilvl w:val="0"/>
-          <w:numId w:val="1062"/>
+          <w:numId w:val="1048"/>
         </w:numPr>
         <w:pStyle w:val="Compact"/>
       </w:pPr>
@@ -22497,7 +22405,7 @@
       <w:pPr>
         <w:numPr>
           <w:ilvl w:val="0"/>
-          <w:numId w:val="1062"/>
+          <w:numId w:val="1048"/>
         </w:numPr>
         <w:pStyle w:val="Compact"/>
       </w:pPr>
@@ -22524,7 +22432,7 @@
       <w:pPr>
         <w:numPr>
           <w:ilvl w:val="0"/>
-          <w:numId w:val="1062"/>
+          <w:numId w:val="1048"/>
         </w:numPr>
         <w:pStyle w:val="Compact"/>
       </w:pPr>
@@ -22551,7 +22459,7 @@
       <w:pPr>
         <w:numPr>
           <w:ilvl w:val="0"/>
-          <w:numId w:val="1062"/>
+          <w:numId w:val="1048"/>
         </w:numPr>
         <w:pStyle w:val="Compact"/>
       </w:pPr>
@@ -22575,7 +22483,7 @@
       <w:pPr>
         <w:numPr>
           <w:ilvl w:val="0"/>
-          <w:numId w:val="1062"/>
+          <w:numId w:val="1048"/>
         </w:numPr>
         <w:pStyle w:val="Compact"/>
       </w:pPr>
@@ -22593,7 +22501,7 @@
       <w:pPr>
         <w:numPr>
           <w:ilvl w:val="0"/>
-          <w:numId w:val="1062"/>
+          <w:numId w:val="1048"/>
         </w:numPr>
         <w:pStyle w:val="Compact"/>
       </w:pPr>
@@ -22605,7 +22513,7 @@
       <w:pPr>
         <w:numPr>
           <w:ilvl w:val="0"/>
-          <w:numId w:val="1062"/>
+          <w:numId w:val="1048"/>
         </w:numPr>
         <w:pStyle w:val="Compact"/>
       </w:pPr>
@@ -22689,7 +22597,7 @@
       <w:pPr>
         <w:numPr>
           <w:ilvl w:val="0"/>
-          <w:numId w:val="1062"/>
+          <w:numId w:val="1048"/>
         </w:numPr>
         <w:pStyle w:val="Compact"/>
       </w:pPr>
@@ -22697,8 +22605,8 @@
         <w:t xml:space="preserve">Luxonis DepthAI documentation (OAK-D-PRO-AF pipeline).</w:t>
       </w:r>
     </w:p>
-    <w:bookmarkEnd w:id="101"/>
     <w:bookmarkEnd w:id="102"/>
+    <w:bookmarkEnd w:id="103"/>
     <w:sectPr/>
   </w:body>
 </w:document>
@@ -22960,261 +22868,6 @@
       <w:start w:val="1"/>
       <w:numFmt w:val="decimal"/>
       <w:lvlText w:val="%9."/>
-      <w:lvlJc w:val="left"/>
-      <w:pPr>
-        <w:ind w:left="6480" w:hanging="480"/>
-      </w:pPr>
-    </w:lvl>
-  </w:abstractNum>
-  <w:abstractNum w:abstractNumId="99731">
-    <w:nsid w:val="A99731"/>
-    <w:multiLevelType w:val="multilevel"/>
-    <w:lvl w:ilvl="0">
-      <w:start w:val="1"/>
-      <w:numFmt w:val="lowerLetter"/>
-      <w:lvlText w:val="(%1)"/>
-      <w:lvlJc w:val="left"/>
-      <w:pPr>
-        <w:ind w:left="720" w:hanging="480"/>
-      </w:pPr>
-    </w:lvl>
-    <w:lvl w:ilvl="1">
-      <w:start w:val="1"/>
-      <w:numFmt w:val="lowerLetter"/>
-      <w:lvlText w:val="(%2)"/>
-      <w:lvlJc w:val="left"/>
-      <w:pPr>
-        <w:ind w:left="1440" w:hanging="480"/>
-      </w:pPr>
-    </w:lvl>
-    <w:lvl w:ilvl="2">
-      <w:start w:val="1"/>
-      <w:numFmt w:val="lowerLetter"/>
-      <w:lvlText w:val="(%3)"/>
-      <w:lvlJc w:val="left"/>
-      <w:pPr>
-        <w:ind w:left="2160" w:hanging="480"/>
-      </w:pPr>
-    </w:lvl>
-    <w:lvl w:ilvl="3">
-      <w:start w:val="1"/>
-      <w:numFmt w:val="lowerLetter"/>
-      <w:lvlText w:val="(%4)"/>
-      <w:lvlJc w:val="left"/>
-      <w:pPr>
-        <w:ind w:left="2880" w:hanging="480"/>
-      </w:pPr>
-    </w:lvl>
-    <w:lvl w:ilvl="4">
-      <w:start w:val="1"/>
-      <w:numFmt w:val="lowerLetter"/>
-      <w:lvlText w:val="(%5)"/>
-      <w:lvlJc w:val="left"/>
-      <w:pPr>
-        <w:ind w:left="3600" w:hanging="480"/>
-      </w:pPr>
-    </w:lvl>
-    <w:lvl w:ilvl="5">
-      <w:start w:val="1"/>
-      <w:numFmt w:val="lowerLetter"/>
-      <w:lvlText w:val="(%6)"/>
-      <w:lvlJc w:val="left"/>
-      <w:pPr>
-        <w:ind w:left="4320" w:hanging="480"/>
-      </w:pPr>
-    </w:lvl>
-    <w:lvl w:ilvl="6">
-      <w:start w:val="1"/>
-      <w:numFmt w:val="lowerLetter"/>
-      <w:lvlText w:val="(%7)"/>
-      <w:lvlJc w:val="left"/>
-      <w:pPr>
-        <w:ind w:left="5040" w:hanging="480"/>
-      </w:pPr>
-    </w:lvl>
-    <w:lvl w:ilvl="7">
-      <w:start w:val="1"/>
-      <w:numFmt w:val="lowerLetter"/>
-      <w:lvlText w:val="(%8)"/>
-      <w:lvlJc w:val="left"/>
-      <w:pPr>
-        <w:ind w:left="5760" w:hanging="480"/>
-      </w:pPr>
-    </w:lvl>
-    <w:lvl w:ilvl="8">
-      <w:start w:val="1"/>
-      <w:numFmt w:val="lowerLetter"/>
-      <w:lvlText w:val="(%9)"/>
-      <w:lvlJc w:val="left"/>
-      <w:pPr>
-        <w:ind w:left="6480" w:hanging="480"/>
-      </w:pPr>
-    </w:lvl>
-  </w:abstractNum>
-  <w:abstractNum w:abstractNumId="99732">
-    <w:nsid w:val="A99732"/>
-    <w:multiLevelType w:val="multilevel"/>
-    <w:lvl w:ilvl="0">
-      <w:start w:val="2"/>
-      <w:numFmt w:val="lowerLetter"/>
-      <w:lvlText w:val="(%1)"/>
-      <w:lvlJc w:val="left"/>
-      <w:pPr>
-        <w:ind w:left="720" w:hanging="480"/>
-      </w:pPr>
-    </w:lvl>
-    <w:lvl w:ilvl="1">
-      <w:start w:val="2"/>
-      <w:numFmt w:val="lowerLetter"/>
-      <w:lvlText w:val="(%2)"/>
-      <w:lvlJc w:val="left"/>
-      <w:pPr>
-        <w:ind w:left="1440" w:hanging="480"/>
-      </w:pPr>
-    </w:lvl>
-    <w:lvl w:ilvl="2">
-      <w:start w:val="2"/>
-      <w:numFmt w:val="lowerLetter"/>
-      <w:lvlText w:val="(%3)"/>
-      <w:lvlJc w:val="left"/>
-      <w:pPr>
-        <w:ind w:left="2160" w:hanging="480"/>
-      </w:pPr>
-    </w:lvl>
-    <w:lvl w:ilvl="3">
-      <w:start w:val="2"/>
-      <w:numFmt w:val="lowerLetter"/>
-      <w:lvlText w:val="(%4)"/>
-      <w:lvlJc w:val="left"/>
-      <w:pPr>
-        <w:ind w:left="2880" w:hanging="480"/>
-      </w:pPr>
-    </w:lvl>
-    <w:lvl w:ilvl="4">
-      <w:start w:val="2"/>
-      <w:numFmt w:val="lowerLetter"/>
-      <w:lvlText w:val="(%5)"/>
-      <w:lvlJc w:val="left"/>
-      <w:pPr>
-        <w:ind w:left="3600" w:hanging="480"/>
-      </w:pPr>
-    </w:lvl>
-    <w:lvl w:ilvl="5">
-      <w:start w:val="2"/>
-      <w:numFmt w:val="lowerLetter"/>
-      <w:lvlText w:val="(%6)"/>
-      <w:lvlJc w:val="left"/>
-      <w:pPr>
-        <w:ind w:left="4320" w:hanging="480"/>
-      </w:pPr>
-    </w:lvl>
-    <w:lvl w:ilvl="6">
-      <w:start w:val="2"/>
-      <w:numFmt w:val="lowerLetter"/>
-      <w:lvlText w:val="(%7)"/>
-      <w:lvlJc w:val="left"/>
-      <w:pPr>
-        <w:ind w:left="5040" w:hanging="480"/>
-      </w:pPr>
-    </w:lvl>
-    <w:lvl w:ilvl="7">
-      <w:start w:val="2"/>
-      <w:numFmt w:val="lowerLetter"/>
-      <w:lvlText w:val="(%8)"/>
-      <w:lvlJc w:val="left"/>
-      <w:pPr>
-        <w:ind w:left="5760" w:hanging="480"/>
-      </w:pPr>
-    </w:lvl>
-    <w:lvl w:ilvl="8">
-      <w:start w:val="2"/>
-      <w:numFmt w:val="lowerLetter"/>
-      <w:lvlText w:val="(%9)"/>
-      <w:lvlJc w:val="left"/>
-      <w:pPr>
-        <w:ind w:left="6480" w:hanging="480"/>
-      </w:pPr>
-    </w:lvl>
-  </w:abstractNum>
-  <w:abstractNum w:abstractNumId="99733">
-    <w:nsid w:val="A99733"/>
-    <w:multiLevelType w:val="multilevel"/>
-    <w:lvl w:ilvl="0">
-      <w:start w:val="3"/>
-      <w:numFmt w:val="lowerLetter"/>
-      <w:lvlText w:val="(%1)"/>
-      <w:lvlJc w:val="left"/>
-      <w:pPr>
-        <w:ind w:left="720" w:hanging="480"/>
-      </w:pPr>
-    </w:lvl>
-    <w:lvl w:ilvl="1">
-      <w:start w:val="3"/>
-      <w:numFmt w:val="lowerLetter"/>
-      <w:lvlText w:val="(%2)"/>
-      <w:lvlJc w:val="left"/>
-      <w:pPr>
-        <w:ind w:left="1440" w:hanging="480"/>
-      </w:pPr>
-    </w:lvl>
-    <w:lvl w:ilvl="2">
-      <w:start w:val="3"/>
-      <w:numFmt w:val="lowerLetter"/>
-      <w:lvlText w:val="(%3)"/>
-      <w:lvlJc w:val="left"/>
-      <w:pPr>
-        <w:ind w:left="2160" w:hanging="480"/>
-      </w:pPr>
-    </w:lvl>
-    <w:lvl w:ilvl="3">
-      <w:start w:val="3"/>
-      <w:numFmt w:val="lowerLetter"/>
-      <w:lvlText w:val="(%4)"/>
-      <w:lvlJc w:val="left"/>
-      <w:pPr>
-        <w:ind w:left="2880" w:hanging="480"/>
-      </w:pPr>
-    </w:lvl>
-    <w:lvl w:ilvl="4">
-      <w:start w:val="3"/>
-      <w:numFmt w:val="lowerLetter"/>
-      <w:lvlText w:val="(%5)"/>
-      <w:lvlJc w:val="left"/>
-      <w:pPr>
-        <w:ind w:left="3600" w:hanging="480"/>
-      </w:pPr>
-    </w:lvl>
-    <w:lvl w:ilvl="5">
-      <w:start w:val="3"/>
-      <w:numFmt w:val="lowerLetter"/>
-      <w:lvlText w:val="(%6)"/>
-      <w:lvlJc w:val="left"/>
-      <w:pPr>
-        <w:ind w:left="4320" w:hanging="480"/>
-      </w:pPr>
-    </w:lvl>
-    <w:lvl w:ilvl="6">
-      <w:start w:val="3"/>
-      <w:numFmt w:val="lowerLetter"/>
-      <w:lvlText w:val="(%7)"/>
-      <w:lvlJc w:val="left"/>
-      <w:pPr>
-        <w:ind w:left="5040" w:hanging="480"/>
-      </w:pPr>
-    </w:lvl>
-    <w:lvl w:ilvl="7">
-      <w:start w:val="3"/>
-      <w:numFmt w:val="lowerLetter"/>
-      <w:lvlText w:val="(%8)"/>
-      <w:lvlJc w:val="left"/>
-      <w:pPr>
-        <w:ind w:left="5760" w:hanging="480"/>
-      </w:pPr>
-    </w:lvl>
-    <w:lvl w:ilvl="8">
-      <w:start w:val="3"/>
-      <w:numFmt w:val="lowerLetter"/>
-      <w:lvlText w:val="(%9)"/>
       <w:lvlJc w:val="left"/>
       <w:pPr>
         <w:ind w:left="6480" w:hanging="480"/>
@@ -23633,321 +23286,9 @@
     </w:lvlOverride>
   </w:num>
   <w:num w:numId="1047">
-    <w:abstractNumId w:val="99411"/>
-    <w:lvlOverride w:ilvl="0">
-      <w:startOverride w:val="1"/>
-    </w:lvlOverride>
-    <w:lvlOverride w:ilvl="1">
-      <w:startOverride w:val="1"/>
-    </w:lvlOverride>
-    <w:lvlOverride w:ilvl="2">
-      <w:startOverride w:val="1"/>
-    </w:lvlOverride>
-    <w:lvlOverride w:ilvl="3">
-      <w:startOverride w:val="1"/>
-    </w:lvlOverride>
-    <w:lvlOverride w:ilvl="4">
-      <w:startOverride w:val="1"/>
-    </w:lvlOverride>
-    <w:lvlOverride w:ilvl="5">
-      <w:startOverride w:val="1"/>
-    </w:lvlOverride>
-    <w:lvlOverride w:ilvl="6">
-      <w:startOverride w:val="1"/>
-    </w:lvlOverride>
-    <w:lvlOverride w:ilvl="7">
-      <w:startOverride w:val="1"/>
-    </w:lvlOverride>
-    <w:lvlOverride w:ilvl="8">
-      <w:startOverride w:val="1"/>
-    </w:lvlOverride>
+    <w:abstractNumId w:val="991"/>
   </w:num>
   <w:num w:numId="1048">
-    <w:abstractNumId w:val="991"/>
-  </w:num>
-  <w:num w:numId="1049">
-    <w:abstractNumId w:val="99731"/>
-    <w:lvlOverride w:ilvl="0">
-      <w:startOverride w:val="1"/>
-    </w:lvlOverride>
-    <w:lvlOverride w:ilvl="1">
-      <w:startOverride w:val="1"/>
-    </w:lvlOverride>
-    <w:lvlOverride w:ilvl="2">
-      <w:startOverride w:val="1"/>
-    </w:lvlOverride>
-    <w:lvlOverride w:ilvl="3">
-      <w:startOverride w:val="1"/>
-    </w:lvlOverride>
-    <w:lvlOverride w:ilvl="4">
-      <w:startOverride w:val="1"/>
-    </w:lvlOverride>
-    <w:lvlOverride w:ilvl="5">
-      <w:startOverride w:val="1"/>
-    </w:lvlOverride>
-    <w:lvlOverride w:ilvl="6">
-      <w:startOverride w:val="1"/>
-    </w:lvlOverride>
-    <w:lvlOverride w:ilvl="7">
-      <w:startOverride w:val="1"/>
-    </w:lvlOverride>
-    <w:lvlOverride w:ilvl="8">
-      <w:startOverride w:val="1"/>
-    </w:lvlOverride>
-  </w:num>
-  <w:num w:numId="1050">
-    <w:abstractNumId w:val="99732"/>
-    <w:lvlOverride w:ilvl="0">
-      <w:startOverride w:val="2"/>
-    </w:lvlOverride>
-    <w:lvlOverride w:ilvl="1">
-      <w:startOverride w:val="2"/>
-    </w:lvlOverride>
-    <w:lvlOverride w:ilvl="2">
-      <w:startOverride w:val="2"/>
-    </w:lvlOverride>
-    <w:lvlOverride w:ilvl="3">
-      <w:startOverride w:val="2"/>
-    </w:lvlOverride>
-    <w:lvlOverride w:ilvl="4">
-      <w:startOverride w:val="2"/>
-    </w:lvlOverride>
-    <w:lvlOverride w:ilvl="5">
-      <w:startOverride w:val="2"/>
-    </w:lvlOverride>
-    <w:lvlOverride w:ilvl="6">
-      <w:startOverride w:val="2"/>
-    </w:lvlOverride>
-    <w:lvlOverride w:ilvl="7">
-      <w:startOverride w:val="2"/>
-    </w:lvlOverride>
-    <w:lvlOverride w:ilvl="8">
-      <w:startOverride w:val="2"/>
-    </w:lvlOverride>
-  </w:num>
-  <w:num w:numId="1051">
-    <w:abstractNumId w:val="991"/>
-  </w:num>
-  <w:num w:numId="1052">
-    <w:abstractNumId w:val="99731"/>
-    <w:lvlOverride w:ilvl="0">
-      <w:startOverride w:val="1"/>
-    </w:lvlOverride>
-    <w:lvlOverride w:ilvl="1">
-      <w:startOverride w:val="1"/>
-    </w:lvlOverride>
-    <w:lvlOverride w:ilvl="2">
-      <w:startOverride w:val="1"/>
-    </w:lvlOverride>
-    <w:lvlOverride w:ilvl="3">
-      <w:startOverride w:val="1"/>
-    </w:lvlOverride>
-    <w:lvlOverride w:ilvl="4">
-      <w:startOverride w:val="1"/>
-    </w:lvlOverride>
-    <w:lvlOverride w:ilvl="5">
-      <w:startOverride w:val="1"/>
-    </w:lvlOverride>
-    <w:lvlOverride w:ilvl="6">
-      <w:startOverride w:val="1"/>
-    </w:lvlOverride>
-    <w:lvlOverride w:ilvl="7">
-      <w:startOverride w:val="1"/>
-    </w:lvlOverride>
-    <w:lvlOverride w:ilvl="8">
-      <w:startOverride w:val="1"/>
-    </w:lvlOverride>
-  </w:num>
-  <w:num w:numId="1053">
-    <w:abstractNumId w:val="99732"/>
-    <w:lvlOverride w:ilvl="0">
-      <w:startOverride w:val="2"/>
-    </w:lvlOverride>
-    <w:lvlOverride w:ilvl="1">
-      <w:startOverride w:val="2"/>
-    </w:lvlOverride>
-    <w:lvlOverride w:ilvl="2">
-      <w:startOverride w:val="2"/>
-    </w:lvlOverride>
-    <w:lvlOverride w:ilvl="3">
-      <w:startOverride w:val="2"/>
-    </w:lvlOverride>
-    <w:lvlOverride w:ilvl="4">
-      <w:startOverride w:val="2"/>
-    </w:lvlOverride>
-    <w:lvlOverride w:ilvl="5">
-      <w:startOverride w:val="2"/>
-    </w:lvlOverride>
-    <w:lvlOverride w:ilvl="6">
-      <w:startOverride w:val="2"/>
-    </w:lvlOverride>
-    <w:lvlOverride w:ilvl="7">
-      <w:startOverride w:val="2"/>
-    </w:lvlOverride>
-    <w:lvlOverride w:ilvl="8">
-      <w:startOverride w:val="2"/>
-    </w:lvlOverride>
-  </w:num>
-  <w:num w:numId="1054">
-    <w:abstractNumId w:val="991"/>
-  </w:num>
-  <w:num w:numId="1055">
-    <w:abstractNumId w:val="99731"/>
-    <w:lvlOverride w:ilvl="0">
-      <w:startOverride w:val="1"/>
-    </w:lvlOverride>
-    <w:lvlOverride w:ilvl="1">
-      <w:startOverride w:val="1"/>
-    </w:lvlOverride>
-    <w:lvlOverride w:ilvl="2">
-      <w:startOverride w:val="1"/>
-    </w:lvlOverride>
-    <w:lvlOverride w:ilvl="3">
-      <w:startOverride w:val="1"/>
-    </w:lvlOverride>
-    <w:lvlOverride w:ilvl="4">
-      <w:startOverride w:val="1"/>
-    </w:lvlOverride>
-    <w:lvlOverride w:ilvl="5">
-      <w:startOverride w:val="1"/>
-    </w:lvlOverride>
-    <w:lvlOverride w:ilvl="6">
-      <w:startOverride w:val="1"/>
-    </w:lvlOverride>
-    <w:lvlOverride w:ilvl="7">
-      <w:startOverride w:val="1"/>
-    </w:lvlOverride>
-    <w:lvlOverride w:ilvl="8">
-      <w:startOverride w:val="1"/>
-    </w:lvlOverride>
-  </w:num>
-  <w:num w:numId="1056">
-    <w:abstractNumId w:val="99732"/>
-    <w:lvlOverride w:ilvl="0">
-      <w:startOverride w:val="2"/>
-    </w:lvlOverride>
-    <w:lvlOverride w:ilvl="1">
-      <w:startOverride w:val="2"/>
-    </w:lvlOverride>
-    <w:lvlOverride w:ilvl="2">
-      <w:startOverride w:val="2"/>
-    </w:lvlOverride>
-    <w:lvlOverride w:ilvl="3">
-      <w:startOverride w:val="2"/>
-    </w:lvlOverride>
-    <w:lvlOverride w:ilvl="4">
-      <w:startOverride w:val="2"/>
-    </w:lvlOverride>
-    <w:lvlOverride w:ilvl="5">
-      <w:startOverride w:val="2"/>
-    </w:lvlOverride>
-    <w:lvlOverride w:ilvl="6">
-      <w:startOverride w:val="2"/>
-    </w:lvlOverride>
-    <w:lvlOverride w:ilvl="7">
-      <w:startOverride w:val="2"/>
-    </w:lvlOverride>
-    <w:lvlOverride w:ilvl="8">
-      <w:startOverride w:val="2"/>
-    </w:lvlOverride>
-  </w:num>
-  <w:num w:numId="1057">
-    <w:abstractNumId w:val="991"/>
-  </w:num>
-  <w:num w:numId="1058">
-    <w:abstractNumId w:val="99731"/>
-    <w:lvlOverride w:ilvl="0">
-      <w:startOverride w:val="1"/>
-    </w:lvlOverride>
-    <w:lvlOverride w:ilvl="1">
-      <w:startOverride w:val="1"/>
-    </w:lvlOverride>
-    <w:lvlOverride w:ilvl="2">
-      <w:startOverride w:val="1"/>
-    </w:lvlOverride>
-    <w:lvlOverride w:ilvl="3">
-      <w:startOverride w:val="1"/>
-    </w:lvlOverride>
-    <w:lvlOverride w:ilvl="4">
-      <w:startOverride w:val="1"/>
-    </w:lvlOverride>
-    <w:lvlOverride w:ilvl="5">
-      <w:startOverride w:val="1"/>
-    </w:lvlOverride>
-    <w:lvlOverride w:ilvl="6">
-      <w:startOverride w:val="1"/>
-    </w:lvlOverride>
-    <w:lvlOverride w:ilvl="7">
-      <w:startOverride w:val="1"/>
-    </w:lvlOverride>
-    <w:lvlOverride w:ilvl="8">
-      <w:startOverride w:val="1"/>
-    </w:lvlOverride>
-  </w:num>
-  <w:num w:numId="1059">
-    <w:abstractNumId w:val="99732"/>
-    <w:lvlOverride w:ilvl="0">
-      <w:startOverride w:val="2"/>
-    </w:lvlOverride>
-    <w:lvlOverride w:ilvl="1">
-      <w:startOverride w:val="2"/>
-    </w:lvlOverride>
-    <w:lvlOverride w:ilvl="2">
-      <w:startOverride w:val="2"/>
-    </w:lvlOverride>
-    <w:lvlOverride w:ilvl="3">
-      <w:startOverride w:val="2"/>
-    </w:lvlOverride>
-    <w:lvlOverride w:ilvl="4">
-      <w:startOverride w:val="2"/>
-    </w:lvlOverride>
-    <w:lvlOverride w:ilvl="5">
-      <w:startOverride w:val="2"/>
-    </w:lvlOverride>
-    <w:lvlOverride w:ilvl="6">
-      <w:startOverride w:val="2"/>
-    </w:lvlOverride>
-    <w:lvlOverride w:ilvl="7">
-      <w:startOverride w:val="2"/>
-    </w:lvlOverride>
-    <w:lvlOverride w:ilvl="8">
-      <w:startOverride w:val="2"/>
-    </w:lvlOverride>
-  </w:num>
-  <w:num w:numId="1060">
-    <w:abstractNumId w:val="99733"/>
-    <w:lvlOverride w:ilvl="0">
-      <w:startOverride w:val="3"/>
-    </w:lvlOverride>
-    <w:lvlOverride w:ilvl="1">
-      <w:startOverride w:val="3"/>
-    </w:lvlOverride>
-    <w:lvlOverride w:ilvl="2">
-      <w:startOverride w:val="3"/>
-    </w:lvlOverride>
-    <w:lvlOverride w:ilvl="3">
-      <w:startOverride w:val="3"/>
-    </w:lvlOverride>
-    <w:lvlOverride w:ilvl="4">
-      <w:startOverride w:val="3"/>
-    </w:lvlOverride>
-    <w:lvlOverride w:ilvl="5">
-      <w:startOverride w:val="3"/>
-    </w:lvlOverride>
-    <w:lvlOverride w:ilvl="6">
-      <w:startOverride w:val="3"/>
-    </w:lvlOverride>
-    <w:lvlOverride w:ilvl="7">
-      <w:startOverride w:val="3"/>
-    </w:lvlOverride>
-    <w:lvlOverride w:ilvl="8">
-      <w:startOverride w:val="3"/>
-    </w:lvlOverride>
-  </w:num>
-  <w:num w:numId="1061">
-    <w:abstractNumId w:val="991"/>
-  </w:num>
-  <w:num w:numId="1062">
     <w:abstractNumId w:val="991"/>
   </w:num>
 </w:numbering>

</xml_diff>